<commit_message>
Add risk-adjusted performance, benchmarks and fees; prepare full double coding
- src/performance.py: Sharpe, Calmar, 60/40, target-risk fund and rating-
  compliant model portfolio benchmarks, purchase and exit fees
  (T26-T30, T33, F09-F10), from data already in the repository
- src/manual_coding.py: blinded sheets for two coders over all 1,199
  main-sample replies, Cohen's kappa, reconciliation and consensus (T31)
- Report (on top of the final build): Section 9.7 adds Table 12 and
  Figure 10 on performance; limitations and Appendix E state that full
  double coding is prepared but not done; word count kept under 10,000

Co-Authored-By: Claude Opus 5.5 <noreply@anthropic.com>
Claude-Session: https://claude.ai/code/session_01PCmAkTtoQHaefAhZET8xvj
</commit_message>
<xml_diff>
--- a/report/final_report.docx
+++ b/report/final_report.docx
@@ -82,7 +82,7 @@
         <w:rPr>
           <w:rFonts w:ascii="Times New Roman" w:cs="Times New Roman" w:eastAsia="SimSun" w:hAnsi="Times New Roman"/>
         </w:rPr>
-        <w:t xml:space="preserve">Experiment run on 23 October 2026. Manual double coding of the conflict measure (Appendix E) is to be completed by the group.</w:t>
+        <w:t xml:space="preserve">Experiment run on 23 October 2026. Double coding of the conflict measure for all main-sample replies (Appendix E) is to be completed by the group.</w:t>
       </w:r>
     </w:p>
     <w:p>
@@ -118,7 +118,7 @@
         <w:rPr>
           <w:rFonts w:ascii="Times New Roman" w:cs="Times New Roman" w:eastAsia="SimSun" w:hAnsi="Times New Roman"/>
         </w:rPr>
-        <w:t xml:space="preserve">Retail investors increasingly ask general-purpose chatbots for fund advice, but a chatbot carries none of the suitability duties of a licensed distributor. We audited three Chinese large language models (Doubao, DeepSeek and Kimi) on 200 synthetic investors forming a balanced 5 x 5 x 8 factorial of investment horizon, risk tolerance and age, so that the three attributes are uncorrelated. Every investor was advised by every model under a baseline adviser prompt and under the same prompt with a suitability protocol added, choosing from a menu of 23 verified Chinese funds whose risk ratings were shown. Recommendations were scored against the C1-C5/R1-R5 matching rule, a horizon-based equity cap, a lock-up constraint and the investor's stated loss limit over a 59-month back-test. Risk tolerance dominated the portfolios (partial eta squared 0.66-0.83), horizon came second (0.41-0.53) and age barely mattered (0.02-0.08). Under the baseline prompt, 83-86% of recommendations to C1-C3 investors contained a fund rated above the permitted level. The protocol cut rating breaches by 9.5-24.5 percentage points in every model, yet 42-70% of C1-C3 recommendations still breached the rule, often after the model had classified the investor correctly. Equity levels were highly repeatable (ICC 0.95-0.98) but fund choices were not (Jaccard similarity 0.59-0.70). Suitability rules should therefore be enforced outside the model, not only stated in its prompt.</w:t>
+        <w:t xml:space="preserve">Retail investors increasingly ask general-purpose chatbots for fund advice, but a chatbot carries none of the suitability duties of a licensed distributor. We audited three Chinese large language models (Doubao, DeepSeek and Kimi) on 200 synthetic investors forming a balanced 5 x 5 x 8 factorial of investment horizon, risk tolerance and age, so that the three attributes are uncorrelated. Every investor was advised by every model under a baseline adviser prompt and under the same prompt with a suitability protocol added, choosing from a menu of 23 verified Chinese funds whose risk ratings were shown. Recommendations were scored against the C1-C5/R1-R5 matching rule, a horizon-based equity cap, a lock-up constraint and the investor's stated loss limit over a 59-month back-test. Risk tolerance dominated the portfolios (partial eta squared 0.66-0.83), horizon came second (0.41-0.53) and age barely mattered (0.02-0.08). Under the baseline prompt, 83-86% of recommendations to C1-C3 investors contained a fund rated above the permitted level. The protocol cut rating breaches by 9.5-24.5 percentage points in every model, yet 42-70% of C1-C3 recommendations still breached the rule, often after the model had classified the investor correctly. Equity levels were highly repeatable (ICC 0.95-0.98) but fund choices were not (Jaccard similarity 0.59-0.70). In the back-test most portfolios beat a 60/40 mix on the Sharpe ratio and fees were negligible, but cautious investors' extra return came from non-permitted funds. Suitability rules should therefore be enforced outside the model, not only stated in its prompt.</w:t>
       </w:r>
     </w:p>
     <w:p>
@@ -6460,7 +6460,7 @@
         <w:rPr>
           <w:rFonts w:ascii="Times New Roman" w:cs="Times New Roman" w:eastAsia="SimSun" w:hAnsi="Times New Roman"/>
         </w:rPr>
-        <w:t xml:space="preserve">A deterministic script codes each reply, recording whether the JSON parsed directly or only after light repair; off-menu codes are dropped from the risk measures and the remaining weights rescaled, and nothing is imputed (Appendix E). Each portfolio is then back-tested with monthly rebalancing on adjusted net asset values over the longest window of complete months, up to 60, that ends in September 2026 and is covered for every fund. Its worst rolling 12-month return is compared with the maximum one-year loss the investor accepts: none, 5%, 15%, 25% and 40% for C1 to C5. These are historical, descriptive measures, not forecasts.</w:t>
+        <w:t xml:space="preserve">A deterministic script codes each reply, recording whether the JSON parsed directly or only after light repair; off-menu codes are dropped from the risk measures and the remaining weights rescaled, and nothing is imputed (Appendix E). Each portfolio is then back-tested with monthly rebalancing on adjusted net asset values over the longest window of complete months, up to 60, that ends in September 2026 and is covered for every fund. Its worst rolling 12-month return is compared with the maximum one-year loss the investor accepts: none, 5%, 15%, 25% and 40% for C1 to C5. These are historical, descriptive measures, not forecasts. A script added after the main analysis (src/performance.py) computes Sharpe and Calmar ratios, net-of-fee returns and three benchmarks: a 60/40 mix, the target-risk fund 006580 and a robo-style, rating-compliant model portfolio per class.</w:t>
       </w:r>
     </w:p>
     <w:p>
@@ -7327,7 +7327,7 @@
             <w:tcBorders>
               <w:top w:val="none" w:color="FFFFFF" w:sz="0"/>
               <w:left w:val="none" w:color="FFFFFF" w:sz="0"/>
-              <w:bottom w:val="single" w:color="000000" w:sz="6"/>
+              <w:bottom w:val="none" w:color="FFFFFF" w:sz="0"/>
               <w:right w:val="none" w:color="FFFFFF" w:sz="0"/>
             </w:tcBorders>
             <w:tcMar>
@@ -7359,7 +7359,7 @@
             <w:tcBorders>
               <w:top w:val="none" w:color="FFFFFF" w:sz="0"/>
               <w:left w:val="none" w:color="FFFFFF" w:sz="0"/>
-              <w:bottom w:val="single" w:color="000000" w:sz="6"/>
+              <w:bottom w:val="none" w:color="FFFFFF" w:sz="0"/>
               <w:right w:val="none" w:color="FFFFFF" w:sz="0"/>
             </w:tcBorders>
             <w:tcMar>
@@ -7382,6 +7382,75 @@
                 <w:szCs w:val="20"/>
               </w:rPr>
               <w:t xml:space="preserve">Change in equity per one-level step of one attribute</w:t>
+            </w:r>
+          </w:p>
+        </w:tc>
+      </w:tr>
+      <w:tr>
+        <w:trPr>
+          <w:tblHeader w:val="false"/>
+        </w:trPr>
+        <w:tc>
+          <w:tcPr>
+            <w:tcW w:type="dxa" w:w="3711"/>
+            <w:tcBorders>
+              <w:top w:val="none" w:color="FFFFFF" w:sz="0"/>
+              <w:left w:val="none" w:color="FFFFFF" w:sz="0"/>
+              <w:bottom w:val="single" w:color="000000" w:sz="6"/>
+              <w:right w:val="none" w:color="FFFFFF" w:sz="0"/>
+            </w:tcBorders>
+            <w:tcMar>
+              <w:top w:type="dxa" w:w="40"/>
+              <w:left w:type="dxa" w:w="80"/>
+              <w:bottom w:type="dxa" w:w="40"/>
+              <w:right w:type="dxa" w:w="80"/>
+            </w:tcMar>
+          </w:tcPr>
+          <w:p>
+            <w:pPr>
+              <w:spacing w:line="276" w:lineRule="auto"/>
+            </w:pPr>
+            <w:r>
+              <w:rPr>
+                <w:rFonts w:ascii="Times New Roman" w:cs="Times New Roman" w:eastAsia="SimSun" w:hAnsi="Times New Roman"/>
+                <w:b w:val="false"/>
+                <w:bCs w:val="false"/>
+                <w:sz w:val="20"/>
+                <w:szCs w:val="20"/>
+              </w:rPr>
+              <w:t xml:space="preserve">Performance (added later)</w:t>
+            </w:r>
+          </w:p>
+        </w:tc>
+        <w:tc>
+          <w:tcPr>
+            <w:tcW w:type="dxa" w:w="5315"/>
+            <w:tcBorders>
+              <w:top w:val="none" w:color="FFFFFF" w:sz="0"/>
+              <w:left w:val="none" w:color="FFFFFF" w:sz="0"/>
+              <w:bottom w:val="single" w:color="000000" w:sz="6"/>
+              <w:right w:val="none" w:color="FFFFFF" w:sz="0"/>
+            </w:tcBorders>
+            <w:tcMar>
+              <w:top w:type="dxa" w:w="40"/>
+              <w:left w:type="dxa" w:w="80"/>
+              <w:bottom w:type="dxa" w:w="40"/>
+              <w:right w:type="dxa" w:w="80"/>
+            </w:tcMar>
+          </w:tcPr>
+          <w:p>
+            <w:pPr>
+              <w:spacing w:line="276" w:lineRule="auto"/>
+            </w:pPr>
+            <w:r>
+              <w:rPr>
+                <w:rFonts w:ascii="Times New Roman" w:cs="Times New Roman" w:eastAsia="SimSun" w:hAnsi="Times New Roman"/>
+                <w:b w:val="false"/>
+                <w:bCs w:val="false"/>
+                <w:sz w:val="20"/>
+                <w:szCs w:val="20"/>
+              </w:rPr>
+              <w:t xml:space="preserve">Return, volatility, Sharpe, drawdown, Calmar; benchmarks; fees</w:t>
             </w:r>
           </w:p>
         </w:tc>
@@ -16045,7 +16114,7 @@
         <w:rPr>
           <w:rFonts w:ascii="Times New Roman" w:cs="Times New Roman" w:eastAsia="SimSun" w:hAnsi="Times New Roman"/>
         </w:rPr>
-        <w:t xml:space="preserve">Under BASE the models behaved much alike: their breach rates did not differ (Cochran's Q = 2.46, p = 0.29), and their equity levels differed only slightly (Friedman test, Kendall's W = 0.045), with Kimi recommending 3.3-4.1 points less equity than the others. Under SUIT they diverged: Kimi's breach rate of 25.0% compares with 40.7-42.0% for the others (Q = 45.2, p &lt; 0.001), and equity differences grew (W = 0.084; T14). Kimi cost about 7 to 11 times as much per call (USD 2.56 for 876 logged calls, against USD 0.33 for Doubao and USD 0.23 for DeepSeek for 856 calls each).</w:t>
+        <w:t xml:space="preserve">Under BASE the models behaved much alike: their breach rates did not differ (Cochran's Q = 2.46, p = 0.29), and their equity levels differed only slightly (Friedman test, Kendall's W = 0.045), with Kimi recommending 3.3-4.1 points less equity than the others. Under SUIT they diverged: Kimi's breach rate of 25.0% compares with 40.7-42.0% for the others (Q = 45.2, p &lt; 0.001), and equity differences grew (W = 0.084; T14).</w:t>
       </w:r>
     </w:p>
     <w:p>
@@ -16062,7 +16131,7 @@
           <w:sz w:val="24"/>
           <w:szCs w:val="24"/>
         </w:rPr>
-        <w:t xml:space="preserve">9.7 Historical check</w:t>
+        <w:t xml:space="preserve">9.7 Historical check and performance</w:t>
       </w:r>
     </w:p>
     <w:p>
@@ -16075,1265 +16144,7 @@
         <w:rPr>
           <w:rFonts w:ascii="Times New Roman" w:cs="Times New Roman" w:eastAsia="SimSun" w:hAnsi="Times New Roman"/>
         </w:rPr>
-        <w:t xml:space="preserve">Over the common 59-month window, November 2021 to September 2026, the median worst 12-month return was positive for C1 and C2 recommendations, slightly negative for C3, and -10.5% to -18.7% for C4 and C5 (Table 12, Figure 9). Only four main-sample portfolios lost more in a year than the investor accepted: two DeepSeek C3 recommendations per condition, with worst years down to -18.8% against a 15% limit. The period explains this. The menu's money market and bond funds never had a negative 12-month return and the enhanced-return bond fund lost at most 1.1%, so the rating breaches of C1-C2 investors, which consisted mostly of such funds, caused no such losses. The R4 funds lost 9.3-36.9% in their worst year (the gold fund aside), but the models diluted them enough to keep aggressive investors within their limits.</w:t>
-      </w:r>
-    </w:p>
-    <w:p>
-      <w:pPr>
-        <w:keepNext/>
-        <w:spacing w:after="0" w:before="200" w:line="276" w:lineRule="auto"/>
-        <w:jc w:val="left"/>
-      </w:pPr>
-      <w:r>
-        <w:rPr>
-          <w:rFonts w:ascii="Times New Roman" w:cs="Times New Roman" w:eastAsia="SimSun" w:hAnsi="Times New Roman"/>
-          <w:b/>
-          <w:bCs/>
-        </w:rPr>
-        <w:t xml:space="preserve">Table 12</w:t>
-      </w:r>
-    </w:p>
-    <w:p>
-      <w:pPr>
-        <w:keepNext/>
-        <w:spacing w:after="80" w:before="0" w:line="276" w:lineRule="auto"/>
-        <w:jc w:val="left"/>
-      </w:pPr>
-      <w:r>
-        <w:rPr>
-          <w:rFonts w:ascii="Times New Roman" w:cs="Times New Roman" w:eastAsia="SimSun" w:hAnsi="Times New Roman"/>
-          <w:i/>
-          <w:iCs/>
-        </w:rPr>
-        <w:t xml:space="preserve">Worst rolling 12-month return of recommended portfolios, by risk class</w:t>
-      </w:r>
-    </w:p>
-    <w:tbl>
-      <w:tblPr>
-        <w:tblW w:type="dxa" w:w="9026"/>
-        <w:tblBorders>
-          <w:top w:val="single" w:color="auto" w:sz="4"/>
-          <w:left w:val="single" w:color="auto" w:sz="4"/>
-          <w:bottom w:val="single" w:color="auto" w:sz="4"/>
-          <w:right w:val="single" w:color="auto" w:sz="4"/>
-          <w:insideH w:val="single" w:color="auto" w:sz="4"/>
-          <w:insideV w:val="single" w:color="auto" w:sz="4"/>
-        </w:tblBorders>
-        <w:tblLayout w:type="fixed"/>
-      </w:tblPr>
-      <w:tblGrid>
-        <w:gridCol w:w="1024"/>
-        <w:gridCol w:w="1490"/>
-        <w:gridCol w:w="1650"/>
-        <w:gridCol w:w="1650"/>
-        <w:gridCol w:w="1490"/>
-        <w:gridCol w:w="1722"/>
-      </w:tblGrid>
-      <w:tr>
-        <w:trPr>
-          <w:tblHeader/>
-        </w:trPr>
-        <w:tc>
-          <w:tcPr>
-            <w:tcW w:type="dxa" w:w="1024"/>
-            <w:tcBorders>
-              <w:top w:val="single" w:color="000000" w:sz="6"/>
-              <w:left w:val="none" w:color="FFFFFF" w:sz="0"/>
-              <w:bottom w:val="single" w:color="000000" w:sz="6"/>
-              <w:right w:val="none" w:color="FFFFFF" w:sz="0"/>
-            </w:tcBorders>
-            <w:tcMar>
-              <w:top w:type="dxa" w:w="40"/>
-              <w:left w:type="dxa" w:w="80"/>
-              <w:bottom w:type="dxa" w:w="40"/>
-              <w:right w:type="dxa" w:w="80"/>
-            </w:tcMar>
-          </w:tcPr>
-          <w:p>
-            <w:pPr>
-              <w:spacing w:line="276" w:lineRule="auto"/>
-            </w:pPr>
-            <w:r>
-              <w:rPr>
-                <w:rFonts w:ascii="Times New Roman" w:cs="Times New Roman" w:eastAsia="SimSun" w:hAnsi="Times New Roman"/>
-                <w:b/>
-                <w:bCs/>
-                <w:sz w:val="18"/>
-                <w:szCs w:val="18"/>
-              </w:rPr>
-              <w:t xml:space="preserve">Risk class</w:t>
-            </w:r>
-          </w:p>
-        </w:tc>
-        <w:tc>
-          <w:tcPr>
-            <w:tcW w:type="dxa" w:w="1490"/>
-            <w:tcBorders>
-              <w:top w:val="single" w:color="000000" w:sz="6"/>
-              <w:left w:val="none" w:color="FFFFFF" w:sz="0"/>
-              <w:bottom w:val="single" w:color="000000" w:sz="6"/>
-              <w:right w:val="none" w:color="FFFFFF" w:sz="0"/>
-            </w:tcBorders>
-            <w:tcMar>
-              <w:top w:type="dxa" w:w="40"/>
-              <w:left w:type="dxa" w:w="80"/>
-              <w:bottom w:type="dxa" w:w="40"/>
-              <w:right w:type="dxa" w:w="80"/>
-            </w:tcMar>
-          </w:tcPr>
-          <w:p>
-            <w:pPr>
-              <w:spacing w:line="276" w:lineRule="auto"/>
-            </w:pPr>
-            <w:r>
-              <w:rPr>
-                <w:rFonts w:ascii="Times New Roman" w:cs="Times New Roman" w:eastAsia="SimSun" w:hAnsi="Times New Roman"/>
-                <w:b/>
-                <w:bCs/>
-                <w:sz w:val="18"/>
-                <w:szCs w:val="18"/>
-              </w:rPr>
-              <w:t xml:space="preserve">Stated maximum loss (%)</w:t>
-            </w:r>
-          </w:p>
-        </w:tc>
-        <w:tc>
-          <w:tcPr>
-            <w:tcW w:type="dxa" w:w="1650"/>
-            <w:tcBorders>
-              <w:top w:val="single" w:color="000000" w:sz="6"/>
-              <w:left w:val="none" w:color="FFFFFF" w:sz="0"/>
-              <w:bottom w:val="single" w:color="000000" w:sz="6"/>
-              <w:right w:val="none" w:color="FFFFFF" w:sz="0"/>
-            </w:tcBorders>
-            <w:tcMar>
-              <w:top w:type="dxa" w:w="40"/>
-              <w:left w:type="dxa" w:w="80"/>
-              <w:bottom w:type="dxa" w:w="40"/>
-              <w:right w:type="dxa" w:w="80"/>
-            </w:tcMar>
-          </w:tcPr>
-          <w:p>
-            <w:pPr>
-              <w:spacing w:line="276" w:lineRule="auto"/>
-            </w:pPr>
-            <w:r>
-              <w:rPr>
-                <w:rFonts w:ascii="Times New Roman" w:cs="Times New Roman" w:eastAsia="SimSun" w:hAnsi="Times New Roman"/>
-                <w:b/>
-                <w:bCs/>
-                <w:sz w:val="18"/>
-                <w:szCs w:val="18"/>
-              </w:rPr>
-              <w:t xml:space="preserve">Median worst 12 months, BASE (%)</w:t>
-            </w:r>
-          </w:p>
-        </w:tc>
-        <w:tc>
-          <w:tcPr>
-            <w:tcW w:type="dxa" w:w="1650"/>
-            <w:tcBorders>
-              <w:top w:val="single" w:color="000000" w:sz="6"/>
-              <w:left w:val="none" w:color="FFFFFF" w:sz="0"/>
-              <w:bottom w:val="single" w:color="000000" w:sz="6"/>
-              <w:right w:val="none" w:color="FFFFFF" w:sz="0"/>
-            </w:tcBorders>
-            <w:tcMar>
-              <w:top w:type="dxa" w:w="40"/>
-              <w:left w:type="dxa" w:w="80"/>
-              <w:bottom w:type="dxa" w:w="40"/>
-              <w:right w:type="dxa" w:w="80"/>
-            </w:tcMar>
-          </w:tcPr>
-          <w:p>
-            <w:pPr>
-              <w:spacing w:line="276" w:lineRule="auto"/>
-            </w:pPr>
-            <w:r>
-              <w:rPr>
-                <w:rFonts w:ascii="Times New Roman" w:cs="Times New Roman" w:eastAsia="SimSun" w:hAnsi="Times New Roman"/>
-                <w:b/>
-                <w:bCs/>
-                <w:sz w:val="18"/>
-                <w:szCs w:val="18"/>
-              </w:rPr>
-              <w:t xml:space="preserve">Median worst 12 months, SUIT (%)</w:t>
-            </w:r>
-          </w:p>
-        </w:tc>
-        <w:tc>
-          <w:tcPr>
-            <w:tcW w:type="dxa" w:w="1490"/>
-            <w:tcBorders>
-              <w:top w:val="single" w:color="000000" w:sz="6"/>
-              <w:left w:val="none" w:color="FFFFFF" w:sz="0"/>
-              <w:bottom w:val="single" w:color="000000" w:sz="6"/>
-              <w:right w:val="none" w:color="FFFFFF" w:sz="0"/>
-            </w:tcBorders>
-            <w:tcMar>
-              <w:top w:type="dxa" w:w="40"/>
-              <w:left w:type="dxa" w:w="80"/>
-              <w:bottom w:type="dxa" w:w="40"/>
-              <w:right w:type="dxa" w:w="80"/>
-            </w:tcMar>
-          </w:tcPr>
-          <w:p>
-            <w:pPr>
-              <w:spacing w:line="276" w:lineRule="auto"/>
-            </w:pPr>
-            <w:r>
-              <w:rPr>
-                <w:rFonts w:ascii="Times New Roman" w:cs="Times New Roman" w:eastAsia="SimSun" w:hAnsi="Times New Roman"/>
-                <w:b/>
-                <w:bCs/>
-                <w:sz w:val="18"/>
-                <w:szCs w:val="18"/>
-              </w:rPr>
-              <w:t xml:space="preserve">Lowest, BASE / SUIT (%)</w:t>
-            </w:r>
-          </w:p>
-        </w:tc>
-        <w:tc>
-          <w:tcPr>
-            <w:tcW w:type="dxa" w:w="1722"/>
-            <w:tcBorders>
-              <w:top w:val="single" w:color="000000" w:sz="6"/>
-              <w:left w:val="none" w:color="FFFFFF" w:sz="0"/>
-              <w:bottom w:val="single" w:color="000000" w:sz="6"/>
-              <w:right w:val="none" w:color="FFFFFF" w:sz="0"/>
-            </w:tcBorders>
-            <w:tcMar>
-              <w:top w:type="dxa" w:w="40"/>
-              <w:left w:type="dxa" w:w="80"/>
-              <w:bottom w:type="dxa" w:w="40"/>
-              <w:right w:type="dxa" w:w="80"/>
-            </w:tcMar>
-          </w:tcPr>
-          <w:p>
-            <w:pPr>
-              <w:spacing w:line="276" w:lineRule="auto"/>
-            </w:pPr>
-            <w:r>
-              <w:rPr>
-                <w:rFonts w:ascii="Times New Roman" w:cs="Times New Roman" w:eastAsia="SimSun" w:hAnsi="Times New Roman"/>
-                <w:b/>
-                <w:bCs/>
-                <w:sz w:val="18"/>
-                <w:szCs w:val="18"/>
-              </w:rPr>
-              <w:t xml:space="preserve">Exceeds stated loss, BASE / SUIT (%)</w:t>
-            </w:r>
-          </w:p>
-        </w:tc>
-      </w:tr>
-      <w:tr>
-        <w:trPr>
-          <w:tblHeader w:val="false"/>
-        </w:trPr>
-        <w:tc>
-          <w:tcPr>
-            <w:tcW w:type="dxa" w:w="1024"/>
-            <w:tcBorders>
-              <w:top w:val="none" w:color="FFFFFF" w:sz="0"/>
-              <w:left w:val="none" w:color="FFFFFF" w:sz="0"/>
-              <w:bottom w:val="none" w:color="FFFFFF" w:sz="0"/>
-              <w:right w:val="none" w:color="FFFFFF" w:sz="0"/>
-            </w:tcBorders>
-            <w:tcMar>
-              <w:top w:type="dxa" w:w="40"/>
-              <w:left w:type="dxa" w:w="80"/>
-              <w:bottom w:type="dxa" w:w="40"/>
-              <w:right w:type="dxa" w:w="80"/>
-            </w:tcMar>
-          </w:tcPr>
-          <w:p>
-            <w:pPr>
-              <w:spacing w:line="276" w:lineRule="auto"/>
-            </w:pPr>
-            <w:r>
-              <w:rPr>
-                <w:rFonts w:ascii="Times New Roman" w:cs="Times New Roman" w:eastAsia="SimSun" w:hAnsi="Times New Roman"/>
-                <w:b w:val="false"/>
-                <w:bCs w:val="false"/>
-                <w:sz w:val="18"/>
-                <w:szCs w:val="18"/>
-              </w:rPr>
-              <w:t xml:space="preserve">C1</w:t>
-            </w:r>
-          </w:p>
-        </w:tc>
-        <w:tc>
-          <w:tcPr>
-            <w:tcW w:type="dxa" w:w="1490"/>
-            <w:tcBorders>
-              <w:top w:val="none" w:color="FFFFFF" w:sz="0"/>
-              <w:left w:val="none" w:color="FFFFFF" w:sz="0"/>
-              <w:bottom w:val="none" w:color="FFFFFF" w:sz="0"/>
-              <w:right w:val="none" w:color="FFFFFF" w:sz="0"/>
-            </w:tcBorders>
-            <w:tcMar>
-              <w:top w:type="dxa" w:w="40"/>
-              <w:left w:type="dxa" w:w="80"/>
-              <w:bottom w:type="dxa" w:w="40"/>
-              <w:right w:type="dxa" w:w="80"/>
-            </w:tcMar>
-          </w:tcPr>
-          <w:p>
-            <w:pPr>
-              <w:spacing w:line="276" w:lineRule="auto"/>
-            </w:pPr>
-            <w:r>
-              <w:rPr>
-                <w:rFonts w:ascii="Times New Roman" w:cs="Times New Roman" w:eastAsia="SimSun" w:hAnsi="Times New Roman"/>
-                <w:b w:val="false"/>
-                <w:bCs w:val="false"/>
-                <w:sz w:val="18"/>
-                <w:szCs w:val="18"/>
-              </w:rPr>
-              <w:t xml:space="preserve">0</w:t>
-            </w:r>
-          </w:p>
-        </w:tc>
-        <w:tc>
-          <w:tcPr>
-            <w:tcW w:type="dxa" w:w="1650"/>
-            <w:tcBorders>
-              <w:top w:val="none" w:color="FFFFFF" w:sz="0"/>
-              <w:left w:val="none" w:color="FFFFFF" w:sz="0"/>
-              <w:bottom w:val="none" w:color="FFFFFF" w:sz="0"/>
-              <w:right w:val="none" w:color="FFFFFF" w:sz="0"/>
-            </w:tcBorders>
-            <w:tcMar>
-              <w:top w:type="dxa" w:w="40"/>
-              <w:left w:type="dxa" w:w="80"/>
-              <w:bottom w:type="dxa" w:w="40"/>
-              <w:right w:type="dxa" w:w="80"/>
-            </w:tcMar>
-          </w:tcPr>
-          <w:p>
-            <w:pPr>
-              <w:spacing w:line="276" w:lineRule="auto"/>
-            </w:pPr>
-            <w:r>
-              <w:rPr>
-                <w:rFonts w:ascii="Times New Roman" w:cs="Times New Roman" w:eastAsia="SimSun" w:hAnsi="Times New Roman"/>
-                <w:b w:val="false"/>
-                <w:bCs w:val="false"/>
-                <w:sz w:val="18"/>
-                <w:szCs w:val="18"/>
-              </w:rPr>
-              <w:t xml:space="preserve">1.3</w:t>
-            </w:r>
-          </w:p>
-        </w:tc>
-        <w:tc>
-          <w:tcPr>
-            <w:tcW w:type="dxa" w:w="1650"/>
-            <w:tcBorders>
-              <w:top w:val="none" w:color="FFFFFF" w:sz="0"/>
-              <w:left w:val="none" w:color="FFFFFF" w:sz="0"/>
-              <w:bottom w:val="none" w:color="FFFFFF" w:sz="0"/>
-              <w:right w:val="none" w:color="FFFFFF" w:sz="0"/>
-            </w:tcBorders>
-            <w:tcMar>
-              <w:top w:type="dxa" w:w="40"/>
-              <w:left w:type="dxa" w:w="80"/>
-              <w:bottom w:type="dxa" w:w="40"/>
-              <w:right w:type="dxa" w:w="80"/>
-            </w:tcMar>
-          </w:tcPr>
-          <w:p>
-            <w:pPr>
-              <w:spacing w:line="276" w:lineRule="auto"/>
-            </w:pPr>
-            <w:r>
-              <w:rPr>
-                <w:rFonts w:ascii="Times New Roman" w:cs="Times New Roman" w:eastAsia="SimSun" w:hAnsi="Times New Roman"/>
-                <w:b w:val="false"/>
-                <w:bCs w:val="false"/>
-                <w:sz w:val="18"/>
-                <w:szCs w:val="18"/>
-              </w:rPr>
-              <w:t xml:space="preserve">1.3</w:t>
-            </w:r>
-          </w:p>
-        </w:tc>
-        <w:tc>
-          <w:tcPr>
-            <w:tcW w:type="dxa" w:w="1490"/>
-            <w:tcBorders>
-              <w:top w:val="none" w:color="FFFFFF" w:sz="0"/>
-              <w:left w:val="none" w:color="FFFFFF" w:sz="0"/>
-              <w:bottom w:val="none" w:color="FFFFFF" w:sz="0"/>
-              <w:right w:val="none" w:color="FFFFFF" w:sz="0"/>
-            </w:tcBorders>
-            <w:tcMar>
-              <w:top w:type="dxa" w:w="40"/>
-              <w:left w:type="dxa" w:w="80"/>
-              <w:bottom w:type="dxa" w:w="40"/>
-              <w:right w:type="dxa" w:w="80"/>
-            </w:tcMar>
-          </w:tcPr>
-          <w:p>
-            <w:pPr>
-              <w:spacing w:line="276" w:lineRule="auto"/>
-            </w:pPr>
-            <w:r>
-              <w:rPr>
-                <w:rFonts w:ascii="Times New Roman" w:cs="Times New Roman" w:eastAsia="SimSun" w:hAnsi="Times New Roman"/>
-                <w:b w:val="false"/>
-                <w:bCs w:val="false"/>
-                <w:sz w:val="18"/>
-                <w:szCs w:val="18"/>
-              </w:rPr>
-              <w:t xml:space="preserve">0.6 / 0.9</w:t>
-            </w:r>
-          </w:p>
-        </w:tc>
-        <w:tc>
-          <w:tcPr>
-            <w:tcW w:type="dxa" w:w="1722"/>
-            <w:tcBorders>
-              <w:top w:val="none" w:color="FFFFFF" w:sz="0"/>
-              <w:left w:val="none" w:color="FFFFFF" w:sz="0"/>
-              <w:bottom w:val="none" w:color="FFFFFF" w:sz="0"/>
-              <w:right w:val="none" w:color="FFFFFF" w:sz="0"/>
-            </w:tcBorders>
-            <w:tcMar>
-              <w:top w:type="dxa" w:w="40"/>
-              <w:left w:type="dxa" w:w="80"/>
-              <w:bottom w:type="dxa" w:w="40"/>
-              <w:right w:type="dxa" w:w="80"/>
-            </w:tcMar>
-          </w:tcPr>
-          <w:p>
-            <w:pPr>
-              <w:spacing w:line="276" w:lineRule="auto"/>
-            </w:pPr>
-            <w:r>
-              <w:rPr>
-                <w:rFonts w:ascii="Times New Roman" w:cs="Times New Roman" w:eastAsia="SimSun" w:hAnsi="Times New Roman"/>
-                <w:b w:val="false"/>
-                <w:bCs w:val="false"/>
-                <w:sz w:val="18"/>
-                <w:szCs w:val="18"/>
-              </w:rPr>
-              <w:t xml:space="preserve">0.0 / 0.0</w:t>
-            </w:r>
-          </w:p>
-        </w:tc>
-      </w:tr>
-      <w:tr>
-        <w:trPr>
-          <w:tblHeader w:val="false"/>
-        </w:trPr>
-        <w:tc>
-          <w:tcPr>
-            <w:tcW w:type="dxa" w:w="1024"/>
-            <w:tcBorders>
-              <w:top w:val="none" w:color="FFFFFF" w:sz="0"/>
-              <w:left w:val="none" w:color="FFFFFF" w:sz="0"/>
-              <w:bottom w:val="none" w:color="FFFFFF" w:sz="0"/>
-              <w:right w:val="none" w:color="FFFFFF" w:sz="0"/>
-            </w:tcBorders>
-            <w:tcMar>
-              <w:top w:type="dxa" w:w="40"/>
-              <w:left w:type="dxa" w:w="80"/>
-              <w:bottom w:type="dxa" w:w="40"/>
-              <w:right w:type="dxa" w:w="80"/>
-            </w:tcMar>
-          </w:tcPr>
-          <w:p>
-            <w:pPr>
-              <w:spacing w:line="276" w:lineRule="auto"/>
-            </w:pPr>
-            <w:r>
-              <w:rPr>
-                <w:rFonts w:ascii="Times New Roman" w:cs="Times New Roman" w:eastAsia="SimSun" w:hAnsi="Times New Roman"/>
-                <w:b w:val="false"/>
-                <w:bCs w:val="false"/>
-                <w:sz w:val="18"/>
-                <w:szCs w:val="18"/>
-              </w:rPr>
-              <w:t xml:space="preserve">C2</w:t>
-            </w:r>
-          </w:p>
-        </w:tc>
-        <w:tc>
-          <w:tcPr>
-            <w:tcW w:type="dxa" w:w="1490"/>
-            <w:tcBorders>
-              <w:top w:val="none" w:color="FFFFFF" w:sz="0"/>
-              <w:left w:val="none" w:color="FFFFFF" w:sz="0"/>
-              <w:bottom w:val="none" w:color="FFFFFF" w:sz="0"/>
-              <w:right w:val="none" w:color="FFFFFF" w:sz="0"/>
-            </w:tcBorders>
-            <w:tcMar>
-              <w:top w:type="dxa" w:w="40"/>
-              <w:left w:type="dxa" w:w="80"/>
-              <w:bottom w:type="dxa" w:w="40"/>
-              <w:right w:type="dxa" w:w="80"/>
-            </w:tcMar>
-          </w:tcPr>
-          <w:p>
-            <w:pPr>
-              <w:spacing w:line="276" w:lineRule="auto"/>
-            </w:pPr>
-            <w:r>
-              <w:rPr>
-                <w:rFonts w:ascii="Times New Roman" w:cs="Times New Roman" w:eastAsia="SimSun" w:hAnsi="Times New Roman"/>
-                <w:b w:val="false"/>
-                <w:bCs w:val="false"/>
-                <w:sz w:val="18"/>
-                <w:szCs w:val="18"/>
-              </w:rPr>
-              <w:t xml:space="preserve">5</w:t>
-            </w:r>
-          </w:p>
-        </w:tc>
-        <w:tc>
-          <w:tcPr>
-            <w:tcW w:type="dxa" w:w="1650"/>
-            <w:tcBorders>
-              <w:top w:val="none" w:color="FFFFFF" w:sz="0"/>
-              <w:left w:val="none" w:color="FFFFFF" w:sz="0"/>
-              <w:bottom w:val="none" w:color="FFFFFF" w:sz="0"/>
-              <w:right w:val="none" w:color="FFFFFF" w:sz="0"/>
-            </w:tcBorders>
-            <w:tcMar>
-              <w:top w:type="dxa" w:w="40"/>
-              <w:left w:type="dxa" w:w="80"/>
-              <w:bottom w:type="dxa" w:w="40"/>
-              <w:right w:type="dxa" w:w="80"/>
-            </w:tcMar>
-          </w:tcPr>
-          <w:p>
-            <w:pPr>
-              <w:spacing w:line="276" w:lineRule="auto"/>
-            </w:pPr>
-            <w:r>
-              <w:rPr>
-                <w:rFonts w:ascii="Times New Roman" w:cs="Times New Roman" w:eastAsia="SimSun" w:hAnsi="Times New Roman"/>
-                <w:b w:val="false"/>
-                <w:bCs w:val="false"/>
-                <w:sz w:val="18"/>
-                <w:szCs w:val="18"/>
-              </w:rPr>
-              <w:t xml:space="preserve">1.3</w:t>
-            </w:r>
-          </w:p>
-        </w:tc>
-        <w:tc>
-          <w:tcPr>
-            <w:tcW w:type="dxa" w:w="1650"/>
-            <w:tcBorders>
-              <w:top w:val="none" w:color="FFFFFF" w:sz="0"/>
-              <w:left w:val="none" w:color="FFFFFF" w:sz="0"/>
-              <w:bottom w:val="none" w:color="FFFFFF" w:sz="0"/>
-              <w:right w:val="none" w:color="FFFFFF" w:sz="0"/>
-            </w:tcBorders>
-            <w:tcMar>
-              <w:top w:type="dxa" w:w="40"/>
-              <w:left w:type="dxa" w:w="80"/>
-              <w:bottom w:type="dxa" w:w="40"/>
-              <w:right w:type="dxa" w:w="80"/>
-            </w:tcMar>
-          </w:tcPr>
-          <w:p>
-            <w:pPr>
-              <w:spacing w:line="276" w:lineRule="auto"/>
-            </w:pPr>
-            <w:r>
-              <w:rPr>
-                <w:rFonts w:ascii="Times New Roman" w:cs="Times New Roman" w:eastAsia="SimSun" w:hAnsi="Times New Roman"/>
-                <w:b w:val="false"/>
-                <w:bCs w:val="false"/>
-                <w:sz w:val="18"/>
-                <w:szCs w:val="18"/>
-              </w:rPr>
-              <w:t xml:space="preserve">1.4</w:t>
-            </w:r>
-          </w:p>
-        </w:tc>
-        <w:tc>
-          <w:tcPr>
-            <w:tcW w:type="dxa" w:w="1490"/>
-            <w:tcBorders>
-              <w:top w:val="none" w:color="FFFFFF" w:sz="0"/>
-              <w:left w:val="none" w:color="FFFFFF" w:sz="0"/>
-              <w:bottom w:val="none" w:color="FFFFFF" w:sz="0"/>
-              <w:right w:val="none" w:color="FFFFFF" w:sz="0"/>
-            </w:tcBorders>
-            <w:tcMar>
-              <w:top w:type="dxa" w:w="40"/>
-              <w:left w:type="dxa" w:w="80"/>
-              <w:bottom w:type="dxa" w:w="40"/>
-              <w:right w:type="dxa" w:w="80"/>
-            </w:tcMar>
-          </w:tcPr>
-          <w:p>
-            <w:pPr>
-              <w:spacing w:line="276" w:lineRule="auto"/>
-            </w:pPr>
-            <w:r>
-              <w:rPr>
-                <w:rFonts w:ascii="Times New Roman" w:cs="Times New Roman" w:eastAsia="SimSun" w:hAnsi="Times New Roman"/>
-                <w:b w:val="false"/>
-                <w:bCs w:val="false"/>
-                <w:sz w:val="18"/>
-                <w:szCs w:val="18"/>
-              </w:rPr>
-              <w:t xml:space="preserve">-3.3 / -3.6</w:t>
-            </w:r>
-          </w:p>
-        </w:tc>
-        <w:tc>
-          <w:tcPr>
-            <w:tcW w:type="dxa" w:w="1722"/>
-            <w:tcBorders>
-              <w:top w:val="none" w:color="FFFFFF" w:sz="0"/>
-              <w:left w:val="none" w:color="FFFFFF" w:sz="0"/>
-              <w:bottom w:val="none" w:color="FFFFFF" w:sz="0"/>
-              <w:right w:val="none" w:color="FFFFFF" w:sz="0"/>
-            </w:tcBorders>
-            <w:tcMar>
-              <w:top w:type="dxa" w:w="40"/>
-              <w:left w:type="dxa" w:w="80"/>
-              <w:bottom w:type="dxa" w:w="40"/>
-              <w:right w:type="dxa" w:w="80"/>
-            </w:tcMar>
-          </w:tcPr>
-          <w:p>
-            <w:pPr>
-              <w:spacing w:line="276" w:lineRule="auto"/>
-            </w:pPr>
-            <w:r>
-              <w:rPr>
-                <w:rFonts w:ascii="Times New Roman" w:cs="Times New Roman" w:eastAsia="SimSun" w:hAnsi="Times New Roman"/>
-                <w:b w:val="false"/>
-                <w:bCs w:val="false"/>
-                <w:sz w:val="18"/>
-                <w:szCs w:val="18"/>
-              </w:rPr>
-              <w:t xml:space="preserve">0.0 / 0.0</w:t>
-            </w:r>
-          </w:p>
-        </w:tc>
-      </w:tr>
-      <w:tr>
-        <w:trPr>
-          <w:tblHeader w:val="false"/>
-        </w:trPr>
-        <w:tc>
-          <w:tcPr>
-            <w:tcW w:type="dxa" w:w="1024"/>
-            <w:tcBorders>
-              <w:top w:val="none" w:color="FFFFFF" w:sz="0"/>
-              <w:left w:val="none" w:color="FFFFFF" w:sz="0"/>
-              <w:bottom w:val="none" w:color="FFFFFF" w:sz="0"/>
-              <w:right w:val="none" w:color="FFFFFF" w:sz="0"/>
-            </w:tcBorders>
-            <w:tcMar>
-              <w:top w:type="dxa" w:w="40"/>
-              <w:left w:type="dxa" w:w="80"/>
-              <w:bottom w:type="dxa" w:w="40"/>
-              <w:right w:type="dxa" w:w="80"/>
-            </w:tcMar>
-          </w:tcPr>
-          <w:p>
-            <w:pPr>
-              <w:spacing w:line="276" w:lineRule="auto"/>
-            </w:pPr>
-            <w:r>
-              <w:rPr>
-                <w:rFonts w:ascii="Times New Roman" w:cs="Times New Roman" w:eastAsia="SimSun" w:hAnsi="Times New Roman"/>
-                <w:b w:val="false"/>
-                <w:bCs w:val="false"/>
-                <w:sz w:val="18"/>
-                <w:szCs w:val="18"/>
-              </w:rPr>
-              <w:t xml:space="preserve">C3</w:t>
-            </w:r>
-          </w:p>
-        </w:tc>
-        <w:tc>
-          <w:tcPr>
-            <w:tcW w:type="dxa" w:w="1490"/>
-            <w:tcBorders>
-              <w:top w:val="none" w:color="FFFFFF" w:sz="0"/>
-              <w:left w:val="none" w:color="FFFFFF" w:sz="0"/>
-              <w:bottom w:val="none" w:color="FFFFFF" w:sz="0"/>
-              <w:right w:val="none" w:color="FFFFFF" w:sz="0"/>
-            </w:tcBorders>
-            <w:tcMar>
-              <w:top w:type="dxa" w:w="40"/>
-              <w:left w:type="dxa" w:w="80"/>
-              <w:bottom w:type="dxa" w:w="40"/>
-              <w:right w:type="dxa" w:w="80"/>
-            </w:tcMar>
-          </w:tcPr>
-          <w:p>
-            <w:pPr>
-              <w:spacing w:line="276" w:lineRule="auto"/>
-            </w:pPr>
-            <w:r>
-              <w:rPr>
-                <w:rFonts w:ascii="Times New Roman" w:cs="Times New Roman" w:eastAsia="SimSun" w:hAnsi="Times New Roman"/>
-                <w:b w:val="false"/>
-                <w:bCs w:val="false"/>
-                <w:sz w:val="18"/>
-                <w:szCs w:val="18"/>
-              </w:rPr>
-              <w:t xml:space="preserve">15</w:t>
-            </w:r>
-          </w:p>
-        </w:tc>
-        <w:tc>
-          <w:tcPr>
-            <w:tcW w:type="dxa" w:w="1650"/>
-            <w:tcBorders>
-              <w:top w:val="none" w:color="FFFFFF" w:sz="0"/>
-              <w:left w:val="none" w:color="FFFFFF" w:sz="0"/>
-              <w:bottom w:val="none" w:color="FFFFFF" w:sz="0"/>
-              <w:right w:val="none" w:color="FFFFFF" w:sz="0"/>
-            </w:tcBorders>
-            <w:tcMar>
-              <w:top w:type="dxa" w:w="40"/>
-              <w:left w:type="dxa" w:w="80"/>
-              <w:bottom w:type="dxa" w:w="40"/>
-              <w:right w:type="dxa" w:w="80"/>
-            </w:tcMar>
-          </w:tcPr>
-          <w:p>
-            <w:pPr>
-              <w:spacing w:line="276" w:lineRule="auto"/>
-            </w:pPr>
-            <w:r>
-              <w:rPr>
-                <w:rFonts w:ascii="Times New Roman" w:cs="Times New Roman" w:eastAsia="SimSun" w:hAnsi="Times New Roman"/>
-                <w:b w:val="false"/>
-                <w:bCs w:val="false"/>
-                <w:sz w:val="18"/>
-                <w:szCs w:val="18"/>
-              </w:rPr>
-              <w:t xml:space="preserve">-2.6</w:t>
-            </w:r>
-          </w:p>
-        </w:tc>
-        <w:tc>
-          <w:tcPr>
-            <w:tcW w:type="dxa" w:w="1650"/>
-            <w:tcBorders>
-              <w:top w:val="none" w:color="FFFFFF" w:sz="0"/>
-              <w:left w:val="none" w:color="FFFFFF" w:sz="0"/>
-              <w:bottom w:val="none" w:color="FFFFFF" w:sz="0"/>
-              <w:right w:val="none" w:color="FFFFFF" w:sz="0"/>
-            </w:tcBorders>
-            <w:tcMar>
-              <w:top w:type="dxa" w:w="40"/>
-              <w:left w:type="dxa" w:w="80"/>
-              <w:bottom w:type="dxa" w:w="40"/>
-              <w:right w:type="dxa" w:w="80"/>
-            </w:tcMar>
-          </w:tcPr>
-          <w:p>
-            <w:pPr>
-              <w:spacing w:line="276" w:lineRule="auto"/>
-            </w:pPr>
-            <w:r>
-              <w:rPr>
-                <w:rFonts w:ascii="Times New Roman" w:cs="Times New Roman" w:eastAsia="SimSun" w:hAnsi="Times New Roman"/>
-                <w:b w:val="false"/>
-                <w:bCs w:val="false"/>
-                <w:sz w:val="18"/>
-                <w:szCs w:val="18"/>
-              </w:rPr>
-              <w:t xml:space="preserve">-0.5</w:t>
-            </w:r>
-          </w:p>
-        </w:tc>
-        <w:tc>
-          <w:tcPr>
-            <w:tcW w:type="dxa" w:w="1490"/>
-            <w:tcBorders>
-              <w:top w:val="none" w:color="FFFFFF" w:sz="0"/>
-              <w:left w:val="none" w:color="FFFFFF" w:sz="0"/>
-              <w:bottom w:val="none" w:color="FFFFFF" w:sz="0"/>
-              <w:right w:val="none" w:color="FFFFFF" w:sz="0"/>
-            </w:tcBorders>
-            <w:tcMar>
-              <w:top w:type="dxa" w:w="40"/>
-              <w:left w:type="dxa" w:w="80"/>
-              <w:bottom w:type="dxa" w:w="40"/>
-              <w:right w:type="dxa" w:w="80"/>
-            </w:tcMar>
-          </w:tcPr>
-          <w:p>
-            <w:pPr>
-              <w:spacing w:line="276" w:lineRule="auto"/>
-            </w:pPr>
-            <w:r>
-              <w:rPr>
-                <w:rFonts w:ascii="Times New Roman" w:cs="Times New Roman" w:eastAsia="SimSun" w:hAnsi="Times New Roman"/>
-                <w:b w:val="false"/>
-                <w:bCs w:val="false"/>
-                <w:sz w:val="18"/>
-                <w:szCs w:val="18"/>
-              </w:rPr>
-              <w:t xml:space="preserve">-18.4 / -18.8</w:t>
-            </w:r>
-          </w:p>
-        </w:tc>
-        <w:tc>
-          <w:tcPr>
-            <w:tcW w:type="dxa" w:w="1722"/>
-            <w:tcBorders>
-              <w:top w:val="none" w:color="FFFFFF" w:sz="0"/>
-              <w:left w:val="none" w:color="FFFFFF" w:sz="0"/>
-              <w:bottom w:val="none" w:color="FFFFFF" w:sz="0"/>
-              <w:right w:val="none" w:color="FFFFFF" w:sz="0"/>
-            </w:tcBorders>
-            <w:tcMar>
-              <w:top w:type="dxa" w:w="40"/>
-              <w:left w:type="dxa" w:w="80"/>
-              <w:bottom w:type="dxa" w:w="40"/>
-              <w:right w:type="dxa" w:w="80"/>
-            </w:tcMar>
-          </w:tcPr>
-          <w:p>
-            <w:pPr>
-              <w:spacing w:line="276" w:lineRule="auto"/>
-            </w:pPr>
-            <w:r>
-              <w:rPr>
-                <w:rFonts w:ascii="Times New Roman" w:cs="Times New Roman" w:eastAsia="SimSun" w:hAnsi="Times New Roman"/>
-                <w:b w:val="false"/>
-                <w:bCs w:val="false"/>
-                <w:sz w:val="18"/>
-                <w:szCs w:val="18"/>
-              </w:rPr>
-              <w:t xml:space="preserve">1.7 / 1.7</w:t>
-            </w:r>
-          </w:p>
-        </w:tc>
-      </w:tr>
-      <w:tr>
-        <w:trPr>
-          <w:tblHeader w:val="false"/>
-        </w:trPr>
-        <w:tc>
-          <w:tcPr>
-            <w:tcW w:type="dxa" w:w="1024"/>
-            <w:tcBorders>
-              <w:top w:val="none" w:color="FFFFFF" w:sz="0"/>
-              <w:left w:val="none" w:color="FFFFFF" w:sz="0"/>
-              <w:bottom w:val="none" w:color="FFFFFF" w:sz="0"/>
-              <w:right w:val="none" w:color="FFFFFF" w:sz="0"/>
-            </w:tcBorders>
-            <w:tcMar>
-              <w:top w:type="dxa" w:w="40"/>
-              <w:left w:type="dxa" w:w="80"/>
-              <w:bottom w:type="dxa" w:w="40"/>
-              <w:right w:type="dxa" w:w="80"/>
-            </w:tcMar>
-          </w:tcPr>
-          <w:p>
-            <w:pPr>
-              <w:spacing w:line="276" w:lineRule="auto"/>
-            </w:pPr>
-            <w:r>
-              <w:rPr>
-                <w:rFonts w:ascii="Times New Roman" w:cs="Times New Roman" w:eastAsia="SimSun" w:hAnsi="Times New Roman"/>
-                <w:b w:val="false"/>
-                <w:bCs w:val="false"/>
-                <w:sz w:val="18"/>
-                <w:szCs w:val="18"/>
-              </w:rPr>
-              <w:t xml:space="preserve">C4</w:t>
-            </w:r>
-          </w:p>
-        </w:tc>
-        <w:tc>
-          <w:tcPr>
-            <w:tcW w:type="dxa" w:w="1490"/>
-            <w:tcBorders>
-              <w:top w:val="none" w:color="FFFFFF" w:sz="0"/>
-              <w:left w:val="none" w:color="FFFFFF" w:sz="0"/>
-              <w:bottom w:val="none" w:color="FFFFFF" w:sz="0"/>
-              <w:right w:val="none" w:color="FFFFFF" w:sz="0"/>
-            </w:tcBorders>
-            <w:tcMar>
-              <w:top w:type="dxa" w:w="40"/>
-              <w:left w:type="dxa" w:w="80"/>
-              <w:bottom w:type="dxa" w:w="40"/>
-              <w:right w:type="dxa" w:w="80"/>
-            </w:tcMar>
-          </w:tcPr>
-          <w:p>
-            <w:pPr>
-              <w:spacing w:line="276" w:lineRule="auto"/>
-            </w:pPr>
-            <w:r>
-              <w:rPr>
-                <w:rFonts w:ascii="Times New Roman" w:cs="Times New Roman" w:eastAsia="SimSun" w:hAnsi="Times New Roman"/>
-                <w:b w:val="false"/>
-                <w:bCs w:val="false"/>
-                <w:sz w:val="18"/>
-                <w:szCs w:val="18"/>
-              </w:rPr>
-              <w:t xml:space="preserve">25</w:t>
-            </w:r>
-          </w:p>
-        </w:tc>
-        <w:tc>
-          <w:tcPr>
-            <w:tcW w:type="dxa" w:w="1650"/>
-            <w:tcBorders>
-              <w:top w:val="none" w:color="FFFFFF" w:sz="0"/>
-              <w:left w:val="none" w:color="FFFFFF" w:sz="0"/>
-              <w:bottom w:val="none" w:color="FFFFFF" w:sz="0"/>
-              <w:right w:val="none" w:color="FFFFFF" w:sz="0"/>
-            </w:tcBorders>
-            <w:tcMar>
-              <w:top w:type="dxa" w:w="40"/>
-              <w:left w:type="dxa" w:w="80"/>
-              <w:bottom w:type="dxa" w:w="40"/>
-              <w:right w:type="dxa" w:w="80"/>
-            </w:tcMar>
-          </w:tcPr>
-          <w:p>
-            <w:pPr>
-              <w:spacing w:line="276" w:lineRule="auto"/>
-            </w:pPr>
-            <w:r>
-              <w:rPr>
-                <w:rFonts w:ascii="Times New Roman" w:cs="Times New Roman" w:eastAsia="SimSun" w:hAnsi="Times New Roman"/>
-                <w:b w:val="false"/>
-                <w:bCs w:val="false"/>
-                <w:sz w:val="18"/>
-                <w:szCs w:val="18"/>
-              </w:rPr>
-              <w:t xml:space="preserve">-13.2</w:t>
-            </w:r>
-          </w:p>
-        </w:tc>
-        <w:tc>
-          <w:tcPr>
-            <w:tcW w:type="dxa" w:w="1650"/>
-            <w:tcBorders>
-              <w:top w:val="none" w:color="FFFFFF" w:sz="0"/>
-              <w:left w:val="none" w:color="FFFFFF" w:sz="0"/>
-              <w:bottom w:val="none" w:color="FFFFFF" w:sz="0"/>
-              <w:right w:val="none" w:color="FFFFFF" w:sz="0"/>
-            </w:tcBorders>
-            <w:tcMar>
-              <w:top w:type="dxa" w:w="40"/>
-              <w:left w:type="dxa" w:w="80"/>
-              <w:bottom w:type="dxa" w:w="40"/>
-              <w:right w:type="dxa" w:w="80"/>
-            </w:tcMar>
-          </w:tcPr>
-          <w:p>
-            <w:pPr>
-              <w:spacing w:line="276" w:lineRule="auto"/>
-            </w:pPr>
-            <w:r>
-              <w:rPr>
-                <w:rFonts w:ascii="Times New Roman" w:cs="Times New Roman" w:eastAsia="SimSun" w:hAnsi="Times New Roman"/>
-                <w:b w:val="false"/>
-                <w:bCs w:val="false"/>
-                <w:sz w:val="18"/>
-                <w:szCs w:val="18"/>
-              </w:rPr>
-              <w:t xml:space="preserve">-10.5</w:t>
-            </w:r>
-          </w:p>
-        </w:tc>
-        <w:tc>
-          <w:tcPr>
-            <w:tcW w:type="dxa" w:w="1490"/>
-            <w:tcBorders>
-              <w:top w:val="none" w:color="FFFFFF" w:sz="0"/>
-              <w:left w:val="none" w:color="FFFFFF" w:sz="0"/>
-              <w:bottom w:val="none" w:color="FFFFFF" w:sz="0"/>
-              <w:right w:val="none" w:color="FFFFFF" w:sz="0"/>
-            </w:tcBorders>
-            <w:tcMar>
-              <w:top w:type="dxa" w:w="40"/>
-              <w:left w:type="dxa" w:w="80"/>
-              <w:bottom w:type="dxa" w:w="40"/>
-              <w:right w:type="dxa" w:w="80"/>
-            </w:tcMar>
-          </w:tcPr>
-          <w:p>
-            <w:pPr>
-              <w:spacing w:line="276" w:lineRule="auto"/>
-            </w:pPr>
-            <w:r>
-              <w:rPr>
-                <w:rFonts w:ascii="Times New Roman" w:cs="Times New Roman" w:eastAsia="SimSun" w:hAnsi="Times New Roman"/>
-                <w:b w:val="false"/>
-                <w:bCs w:val="false"/>
-                <w:sz w:val="18"/>
-                <w:szCs w:val="18"/>
-              </w:rPr>
-              <w:t xml:space="preserve">-24.7 / -24.0</w:t>
-            </w:r>
-          </w:p>
-        </w:tc>
-        <w:tc>
-          <w:tcPr>
-            <w:tcW w:type="dxa" w:w="1722"/>
-            <w:tcBorders>
-              <w:top w:val="none" w:color="FFFFFF" w:sz="0"/>
-              <w:left w:val="none" w:color="FFFFFF" w:sz="0"/>
-              <w:bottom w:val="none" w:color="FFFFFF" w:sz="0"/>
-              <w:right w:val="none" w:color="FFFFFF" w:sz="0"/>
-            </w:tcBorders>
-            <w:tcMar>
-              <w:top w:type="dxa" w:w="40"/>
-              <w:left w:type="dxa" w:w="80"/>
-              <w:bottom w:type="dxa" w:w="40"/>
-              <w:right w:type="dxa" w:w="80"/>
-            </w:tcMar>
-          </w:tcPr>
-          <w:p>
-            <w:pPr>
-              <w:spacing w:line="276" w:lineRule="auto"/>
-            </w:pPr>
-            <w:r>
-              <w:rPr>
-                <w:rFonts w:ascii="Times New Roman" w:cs="Times New Roman" w:eastAsia="SimSun" w:hAnsi="Times New Roman"/>
-                <w:b w:val="false"/>
-                <w:bCs w:val="false"/>
-                <w:sz w:val="18"/>
-                <w:szCs w:val="18"/>
-              </w:rPr>
-              <w:t xml:space="preserve">0.0 / 0.0</w:t>
-            </w:r>
-          </w:p>
-        </w:tc>
-      </w:tr>
-      <w:tr>
-        <w:trPr>
-          <w:tblHeader w:val="false"/>
-        </w:trPr>
-        <w:tc>
-          <w:tcPr>
-            <w:tcW w:type="dxa" w:w="1024"/>
-            <w:tcBorders>
-              <w:top w:val="none" w:color="FFFFFF" w:sz="0"/>
-              <w:left w:val="none" w:color="FFFFFF" w:sz="0"/>
-              <w:bottom w:val="single" w:color="000000" w:sz="6"/>
-              <w:right w:val="none" w:color="FFFFFF" w:sz="0"/>
-            </w:tcBorders>
-            <w:tcMar>
-              <w:top w:type="dxa" w:w="40"/>
-              <w:left w:type="dxa" w:w="80"/>
-              <w:bottom w:type="dxa" w:w="40"/>
-              <w:right w:type="dxa" w:w="80"/>
-            </w:tcMar>
-          </w:tcPr>
-          <w:p>
-            <w:pPr>
-              <w:spacing w:line="276" w:lineRule="auto"/>
-            </w:pPr>
-            <w:r>
-              <w:rPr>
-                <w:rFonts w:ascii="Times New Roman" w:cs="Times New Roman" w:eastAsia="SimSun" w:hAnsi="Times New Roman"/>
-                <w:b w:val="false"/>
-                <w:bCs w:val="false"/>
-                <w:sz w:val="18"/>
-                <w:szCs w:val="18"/>
-              </w:rPr>
-              <w:t xml:space="preserve">C5</w:t>
-            </w:r>
-          </w:p>
-        </w:tc>
-        <w:tc>
-          <w:tcPr>
-            <w:tcW w:type="dxa" w:w="1490"/>
-            <w:tcBorders>
-              <w:top w:val="none" w:color="FFFFFF" w:sz="0"/>
-              <w:left w:val="none" w:color="FFFFFF" w:sz="0"/>
-              <w:bottom w:val="single" w:color="000000" w:sz="6"/>
-              <w:right w:val="none" w:color="FFFFFF" w:sz="0"/>
-            </w:tcBorders>
-            <w:tcMar>
-              <w:top w:type="dxa" w:w="40"/>
-              <w:left w:type="dxa" w:w="80"/>
-              <w:bottom w:type="dxa" w:w="40"/>
-              <w:right w:type="dxa" w:w="80"/>
-            </w:tcMar>
-          </w:tcPr>
-          <w:p>
-            <w:pPr>
-              <w:spacing w:line="276" w:lineRule="auto"/>
-            </w:pPr>
-            <w:r>
-              <w:rPr>
-                <w:rFonts w:ascii="Times New Roman" w:cs="Times New Roman" w:eastAsia="SimSun" w:hAnsi="Times New Roman"/>
-                <w:b w:val="false"/>
-                <w:bCs w:val="false"/>
-                <w:sz w:val="18"/>
-                <w:szCs w:val="18"/>
-              </w:rPr>
-              <w:t xml:space="preserve">40</w:t>
-            </w:r>
-          </w:p>
-        </w:tc>
-        <w:tc>
-          <w:tcPr>
-            <w:tcW w:type="dxa" w:w="1650"/>
-            <w:tcBorders>
-              <w:top w:val="none" w:color="FFFFFF" w:sz="0"/>
-              <w:left w:val="none" w:color="FFFFFF" w:sz="0"/>
-              <w:bottom w:val="single" w:color="000000" w:sz="6"/>
-              <w:right w:val="none" w:color="FFFFFF" w:sz="0"/>
-            </w:tcBorders>
-            <w:tcMar>
-              <w:top w:type="dxa" w:w="40"/>
-              <w:left w:type="dxa" w:w="80"/>
-              <w:bottom w:type="dxa" w:w="40"/>
-              <w:right w:type="dxa" w:w="80"/>
-            </w:tcMar>
-          </w:tcPr>
-          <w:p>
-            <w:pPr>
-              <w:spacing w:line="276" w:lineRule="auto"/>
-            </w:pPr>
-            <w:r>
-              <w:rPr>
-                <w:rFonts w:ascii="Times New Roman" w:cs="Times New Roman" w:eastAsia="SimSun" w:hAnsi="Times New Roman"/>
-                <w:b w:val="false"/>
-                <w:bCs w:val="false"/>
-                <w:sz w:val="18"/>
-                <w:szCs w:val="18"/>
-              </w:rPr>
-              <w:t xml:space="preserve">-18.7</w:t>
-            </w:r>
-          </w:p>
-        </w:tc>
-        <w:tc>
-          <w:tcPr>
-            <w:tcW w:type="dxa" w:w="1650"/>
-            <w:tcBorders>
-              <w:top w:val="none" w:color="FFFFFF" w:sz="0"/>
-              <w:left w:val="none" w:color="FFFFFF" w:sz="0"/>
-              <w:bottom w:val="single" w:color="000000" w:sz="6"/>
-              <w:right w:val="none" w:color="FFFFFF" w:sz="0"/>
-            </w:tcBorders>
-            <w:tcMar>
-              <w:top w:type="dxa" w:w="40"/>
-              <w:left w:type="dxa" w:w="80"/>
-              <w:bottom w:type="dxa" w:w="40"/>
-              <w:right w:type="dxa" w:w="80"/>
-            </w:tcMar>
-          </w:tcPr>
-          <w:p>
-            <w:pPr>
-              <w:spacing w:line="276" w:lineRule="auto"/>
-            </w:pPr>
-            <w:r>
-              <w:rPr>
-                <w:rFonts w:ascii="Times New Roman" w:cs="Times New Roman" w:eastAsia="SimSun" w:hAnsi="Times New Roman"/>
-                <w:b w:val="false"/>
-                <w:bCs w:val="false"/>
-                <w:sz w:val="18"/>
-                <w:szCs w:val="18"/>
-              </w:rPr>
-              <w:t xml:space="preserve">-16.5</w:t>
-            </w:r>
-          </w:p>
-        </w:tc>
-        <w:tc>
-          <w:tcPr>
-            <w:tcW w:type="dxa" w:w="1490"/>
-            <w:tcBorders>
-              <w:top w:val="none" w:color="FFFFFF" w:sz="0"/>
-              <w:left w:val="none" w:color="FFFFFF" w:sz="0"/>
-              <w:bottom w:val="single" w:color="000000" w:sz="6"/>
-              <w:right w:val="none" w:color="FFFFFF" w:sz="0"/>
-            </w:tcBorders>
-            <w:tcMar>
-              <w:top w:type="dxa" w:w="40"/>
-              <w:left w:type="dxa" w:w="80"/>
-              <w:bottom w:type="dxa" w:w="40"/>
-              <w:right w:type="dxa" w:w="80"/>
-            </w:tcMar>
-          </w:tcPr>
-          <w:p>
-            <w:pPr>
-              <w:spacing w:line="276" w:lineRule="auto"/>
-            </w:pPr>
-            <w:r>
-              <w:rPr>
-                <w:rFonts w:ascii="Times New Roman" w:cs="Times New Roman" w:eastAsia="SimSun" w:hAnsi="Times New Roman"/>
-                <w:b w:val="false"/>
-                <w:bCs w:val="false"/>
-                <w:sz w:val="18"/>
-                <w:szCs w:val="18"/>
-              </w:rPr>
-              <w:t xml:space="preserve">-28.3 / -28.0</w:t>
-            </w:r>
-          </w:p>
-        </w:tc>
-        <w:tc>
-          <w:tcPr>
-            <w:tcW w:type="dxa" w:w="1722"/>
-            <w:tcBorders>
-              <w:top w:val="none" w:color="FFFFFF" w:sz="0"/>
-              <w:left w:val="none" w:color="FFFFFF" w:sz="0"/>
-              <w:bottom w:val="single" w:color="000000" w:sz="6"/>
-              <w:right w:val="none" w:color="FFFFFF" w:sz="0"/>
-            </w:tcBorders>
-            <w:tcMar>
-              <w:top w:type="dxa" w:w="40"/>
-              <w:left w:type="dxa" w:w="80"/>
-              <w:bottom w:type="dxa" w:w="40"/>
-              <w:right w:type="dxa" w:w="80"/>
-            </w:tcMar>
-          </w:tcPr>
-          <w:p>
-            <w:pPr>
-              <w:spacing w:line="276" w:lineRule="auto"/>
-            </w:pPr>
-            <w:r>
-              <w:rPr>
-                <w:rFonts w:ascii="Times New Roman" w:cs="Times New Roman" w:eastAsia="SimSun" w:hAnsi="Times New Roman"/>
-                <w:b w:val="false"/>
-                <w:bCs w:val="false"/>
-                <w:sz w:val="18"/>
-                <w:szCs w:val="18"/>
-              </w:rPr>
-              <w:t xml:space="preserve">0.0 / 0.0</w:t>
-            </w:r>
-          </w:p>
-        </w:tc>
-      </w:tr>
-    </w:tbl>
-    <w:p>
-      <w:pPr>
-        <w:spacing w:after="240" w:before="60" w:line="276" w:lineRule="auto"/>
-        <w:jc w:val="both"/>
-      </w:pPr>
-      <w:r>
-        <w:rPr>
-          <w:rFonts w:ascii="Times New Roman" w:cs="Times New Roman" w:eastAsia="SimSun" w:hAnsi="Times New Roman"/>
-          <w:i/>
-          <w:iCs/>
-          <w:sz w:val="20"/>
-          <w:szCs w:val="20"/>
-        </w:rPr>
-        <w:t xml:space="preserve">Note. </w:t>
-      </w:r>
-      <w:r>
-        <w:rPr>
-          <w:rFonts w:ascii="Times New Roman" w:cs="Times New Roman" w:eastAsia="SimSun" w:hAnsi="Times New Roman"/>
-          <w:sz w:val="20"/>
-          <w:szCs w:val="20"/>
-        </w:rPr>
-        <w:t xml:space="preserve">From T24. Pooled over models, n = 120 per cell (119 for SUIT C5); monthly rebalancing on adjusted NAVs. Historical and descriptive, not a forecast.</w:t>
+        <w:t xml:space="preserve">Over the common 59-month window, November 2021 to September 2026, the median worst 12-month return was positive for C1 and C2 recommendations, slightly negative for C3, and -10.5% to -18.7% for C4 and C5 (T24, Figure 9). Only four main-sample portfolios lost more in a year than the investor accepted: two DeepSeek C3 recommendations per condition, with worst years down to -18.8% against a 15% limit. The period explains this. The menu's money market and bond funds never had a negative 12-month return and the enhanced-return bond fund lost at most 1.1%, so the rating breaches of C1-C2 investors, which consisted mostly of such funds, caused no such losses.</w:t>
       </w:r>
     </w:p>
     <w:p>
@@ -17439,6 +16250,3306 @@
     </w:p>
     <w:p>
       <w:pPr>
+        <w:spacing w:after="120" w:line="276" w:lineRule="auto"/>
+        <w:ind w:firstLine="567"/>
+        <w:jc w:val="both"/>
+      </w:pPr>
+      <w:r>
+        <w:rPr>
+          <w:rFonts w:ascii="Times New Roman" w:cs="Times New Roman" w:eastAsia="SimSun" w:hAnsi="Times New Roman"/>
+        </w:rPr>
+        <w:t xml:space="preserve">Table 12 adds risk-adjusted measures. Equities were weak in the window (the CSI 300 feeder returned 0.06% a year), so the 60/40 mix earned 1.67%. Most AI portfolios for C2-C5 beat it on the Sharpe ratio; for C4-C5 about three in four also beat the domestic-only model portfolio, helped by QDII funds (Figure 10). For C2-C3 the compliant model portfolio usually did better, and C1 portfolios with a non-permitted fund returned 2.09% a year against 1.48% for R1-only ones (T32). Fees cost at most 0.29 points a year (T30).</w:t>
+      </w:r>
+    </w:p>
+    <w:p>
+      <w:pPr>
+        <w:keepNext/>
+        <w:spacing w:after="0" w:before="200" w:line="276" w:lineRule="auto"/>
+        <w:jc w:val="left"/>
+      </w:pPr>
+      <w:r>
+        <w:rPr>
+          <w:rFonts w:ascii="Times New Roman" w:cs="Times New Roman" w:eastAsia="SimSun" w:hAnsi="Times New Roman"/>
+          <w:b/>
+          <w:bCs/>
+        </w:rPr>
+        <w:t xml:space="preserve">Table 12</w:t>
+      </w:r>
+    </w:p>
+    <w:p>
+      <w:pPr>
+        <w:keepNext/>
+        <w:spacing w:after="80" w:before="0" w:line="276" w:lineRule="auto"/>
+        <w:jc w:val="left"/>
+      </w:pPr>
+      <w:r>
+        <w:rPr>
+          <w:rFonts w:ascii="Times New Roman" w:cs="Times New Roman" w:eastAsia="SimSun" w:hAnsi="Times New Roman"/>
+          <w:i/>
+          <w:iCs/>
+        </w:rPr>
+        <w:t xml:space="preserve">Historical performance against benchmarks</w:t>
+      </w:r>
+    </w:p>
+    <w:tbl>
+      <w:tblPr>
+        <w:tblW w:type="dxa" w:w="9026"/>
+        <w:tblBorders>
+          <w:top w:val="single" w:color="auto" w:sz="4"/>
+          <w:left w:val="single" w:color="auto" w:sz="4"/>
+          <w:bottom w:val="single" w:color="auto" w:sz="4"/>
+          <w:right w:val="single" w:color="auto" w:sz="4"/>
+          <w:insideH w:val="single" w:color="auto" w:sz="4"/>
+          <w:insideV w:val="single" w:color="auto" w:sz="4"/>
+        </w:tblBorders>
+        <w:tblLayout w:type="fixed"/>
+      </w:tblPr>
+      <w:tblGrid>
+        <w:gridCol w:w="1339"/>
+        <w:gridCol w:w="843"/>
+        <w:gridCol w:w="1240"/>
+        <w:gridCol w:w="843"/>
+        <w:gridCol w:w="1041"/>
+        <w:gridCol w:w="843"/>
+        <w:gridCol w:w="843"/>
+        <w:gridCol w:w="2034"/>
+      </w:tblGrid>
+      <w:tr>
+        <w:trPr>
+          <w:tblHeader/>
+        </w:trPr>
+        <w:tc>
+          <w:tcPr>
+            <w:tcW w:type="dxa" w:w="1339"/>
+            <w:tcBorders>
+              <w:top w:val="single" w:color="000000" w:sz="6"/>
+              <w:left w:val="none" w:color="FFFFFF" w:sz="0"/>
+              <w:bottom w:val="single" w:color="000000" w:sz="6"/>
+              <w:right w:val="none" w:color="FFFFFF" w:sz="0"/>
+            </w:tcBorders>
+            <w:tcMar>
+              <w:top w:type="dxa" w:w="40"/>
+              <w:left w:type="dxa" w:w="80"/>
+              <w:bottom w:type="dxa" w:w="40"/>
+              <w:right w:type="dxa" w:w="80"/>
+            </w:tcMar>
+          </w:tcPr>
+          <w:p>
+            <w:pPr>
+              <w:spacing w:line="276" w:lineRule="auto"/>
+            </w:pPr>
+            <w:r>
+              <w:rPr>
+                <w:rFonts w:ascii="Times New Roman" w:cs="Times New Roman" w:eastAsia="SimSun" w:hAnsi="Times New Roman"/>
+                <w:b/>
+                <w:bCs/>
+                <w:sz w:val="16"/>
+                <w:szCs w:val="16"/>
+              </w:rPr>
+              <w:t xml:space="preserve">Portfolio</w:t>
+            </w:r>
+          </w:p>
+        </w:tc>
+        <w:tc>
+          <w:tcPr>
+            <w:tcW w:type="dxa" w:w="843"/>
+            <w:tcBorders>
+              <w:top w:val="single" w:color="000000" w:sz="6"/>
+              <w:left w:val="none" w:color="FFFFFF" w:sz="0"/>
+              <w:bottom w:val="single" w:color="000000" w:sz="6"/>
+              <w:right w:val="none" w:color="FFFFFF" w:sz="0"/>
+            </w:tcBorders>
+            <w:tcMar>
+              <w:top w:type="dxa" w:w="40"/>
+              <w:left w:type="dxa" w:w="80"/>
+              <w:bottom w:type="dxa" w:w="40"/>
+              <w:right w:type="dxa" w:w="80"/>
+            </w:tcMar>
+          </w:tcPr>
+          <w:p>
+            <w:pPr>
+              <w:spacing w:line="276" w:lineRule="auto"/>
+            </w:pPr>
+            <w:r>
+              <w:rPr>
+                <w:rFonts w:ascii="Times New Roman" w:cs="Times New Roman" w:eastAsia="SimSun" w:hAnsi="Times New Roman"/>
+                <w:b/>
+                <w:bCs/>
+                <w:sz w:val="16"/>
+                <w:szCs w:val="16"/>
+              </w:rPr>
+              <w:t xml:space="preserve">Return (% p.a.)</w:t>
+            </w:r>
+          </w:p>
+        </w:tc>
+        <w:tc>
+          <w:tcPr>
+            <w:tcW w:type="dxa" w:w="1240"/>
+            <w:tcBorders>
+              <w:top w:val="single" w:color="000000" w:sz="6"/>
+              <w:left w:val="none" w:color="FFFFFF" w:sz="0"/>
+              <w:bottom w:val="single" w:color="000000" w:sz="6"/>
+              <w:right w:val="none" w:color="FFFFFF" w:sz="0"/>
+            </w:tcBorders>
+            <w:tcMar>
+              <w:top w:type="dxa" w:w="40"/>
+              <w:left w:type="dxa" w:w="80"/>
+              <w:bottom w:type="dxa" w:w="40"/>
+              <w:right w:type="dxa" w:w="80"/>
+            </w:tcMar>
+          </w:tcPr>
+          <w:p>
+            <w:pPr>
+              <w:spacing w:line="276" w:lineRule="auto"/>
+            </w:pPr>
+            <w:r>
+              <w:rPr>
+                <w:rFonts w:ascii="Times New Roman" w:cs="Times New Roman" w:eastAsia="SimSun" w:hAnsi="Times New Roman"/>
+                <w:b/>
+                <w:bCs/>
+                <w:sz w:val="16"/>
+                <w:szCs w:val="16"/>
+              </w:rPr>
+              <w:t xml:space="preserve">Volatility (% p.a.)</w:t>
+            </w:r>
+          </w:p>
+        </w:tc>
+        <w:tc>
+          <w:tcPr>
+            <w:tcW w:type="dxa" w:w="843"/>
+            <w:tcBorders>
+              <w:top w:val="single" w:color="000000" w:sz="6"/>
+              <w:left w:val="none" w:color="FFFFFF" w:sz="0"/>
+              <w:bottom w:val="single" w:color="000000" w:sz="6"/>
+              <w:right w:val="none" w:color="FFFFFF" w:sz="0"/>
+            </w:tcBorders>
+            <w:tcMar>
+              <w:top w:type="dxa" w:w="40"/>
+              <w:left w:type="dxa" w:w="80"/>
+              <w:bottom w:type="dxa" w:w="40"/>
+              <w:right w:type="dxa" w:w="80"/>
+            </w:tcMar>
+          </w:tcPr>
+          <w:p>
+            <w:pPr>
+              <w:spacing w:line="276" w:lineRule="auto"/>
+            </w:pPr>
+            <w:r>
+              <w:rPr>
+                <w:rFonts w:ascii="Times New Roman" w:cs="Times New Roman" w:eastAsia="SimSun" w:hAnsi="Times New Roman"/>
+                <w:b/>
+                <w:bCs/>
+                <w:sz w:val="16"/>
+                <w:szCs w:val="16"/>
+              </w:rPr>
+              <w:t xml:space="preserve">Sharpe</w:t>
+            </w:r>
+          </w:p>
+        </w:tc>
+        <w:tc>
+          <w:tcPr>
+            <w:tcW w:type="dxa" w:w="1041"/>
+            <w:tcBorders>
+              <w:top w:val="single" w:color="000000" w:sz="6"/>
+              <w:left w:val="none" w:color="FFFFFF" w:sz="0"/>
+              <w:bottom w:val="single" w:color="000000" w:sz="6"/>
+              <w:right w:val="none" w:color="FFFFFF" w:sz="0"/>
+            </w:tcBorders>
+            <w:tcMar>
+              <w:top w:type="dxa" w:w="40"/>
+              <w:left w:type="dxa" w:w="80"/>
+              <w:bottom w:type="dxa" w:w="40"/>
+              <w:right w:type="dxa" w:w="80"/>
+            </w:tcMar>
+          </w:tcPr>
+          <w:p>
+            <w:pPr>
+              <w:spacing w:line="276" w:lineRule="auto"/>
+            </w:pPr>
+            <w:r>
+              <w:rPr>
+                <w:rFonts w:ascii="Times New Roman" w:cs="Times New Roman" w:eastAsia="SimSun" w:hAnsi="Times New Roman"/>
+                <w:b/>
+                <w:bCs/>
+                <w:sz w:val="16"/>
+                <w:szCs w:val="16"/>
+              </w:rPr>
+              <w:t xml:space="preserve">Max drawdown (%)</w:t>
+            </w:r>
+          </w:p>
+        </w:tc>
+        <w:tc>
+          <w:tcPr>
+            <w:tcW w:type="dxa" w:w="843"/>
+            <w:tcBorders>
+              <w:top w:val="single" w:color="000000" w:sz="6"/>
+              <w:left w:val="none" w:color="FFFFFF" w:sz="0"/>
+              <w:bottom w:val="single" w:color="000000" w:sz="6"/>
+              <w:right w:val="none" w:color="FFFFFF" w:sz="0"/>
+            </w:tcBorders>
+            <w:tcMar>
+              <w:top w:type="dxa" w:w="40"/>
+              <w:left w:type="dxa" w:w="80"/>
+              <w:bottom w:type="dxa" w:w="40"/>
+              <w:right w:type="dxa" w:w="80"/>
+            </w:tcMar>
+          </w:tcPr>
+          <w:p>
+            <w:pPr>
+              <w:spacing w:line="276" w:lineRule="auto"/>
+            </w:pPr>
+            <w:r>
+              <w:rPr>
+                <w:rFonts w:ascii="Times New Roman" w:cs="Times New Roman" w:eastAsia="SimSun" w:hAnsi="Times New Roman"/>
+                <w:b/>
+                <w:bCs/>
+                <w:sz w:val="16"/>
+                <w:szCs w:val="16"/>
+              </w:rPr>
+              <w:t xml:space="preserve">Calmar</w:t>
+            </w:r>
+          </w:p>
+        </w:tc>
+        <w:tc>
+          <w:tcPr>
+            <w:tcW w:type="dxa" w:w="843"/>
+            <w:tcBorders>
+              <w:top w:val="single" w:color="000000" w:sz="6"/>
+              <w:left w:val="none" w:color="FFFFFF" w:sz="0"/>
+              <w:bottom w:val="single" w:color="000000" w:sz="6"/>
+              <w:right w:val="none" w:color="FFFFFF" w:sz="0"/>
+            </w:tcBorders>
+            <w:tcMar>
+              <w:top w:type="dxa" w:w="40"/>
+              <w:left w:type="dxa" w:w="80"/>
+              <w:bottom w:type="dxa" w:w="40"/>
+              <w:right w:type="dxa" w:w="80"/>
+            </w:tcMar>
+          </w:tcPr>
+          <w:p>
+            <w:pPr>
+              <w:spacing w:line="276" w:lineRule="auto"/>
+            </w:pPr>
+            <w:r>
+              <w:rPr>
+                <w:rFonts w:ascii="Times New Roman" w:cs="Times New Roman" w:eastAsia="SimSun" w:hAnsi="Times New Roman"/>
+                <w:b/>
+                <w:bCs/>
+                <w:sz w:val="16"/>
+                <w:szCs w:val="16"/>
+              </w:rPr>
+              <w:t xml:space="preserve">Worst 12 months (%)</w:t>
+            </w:r>
+          </w:p>
+        </w:tc>
+        <w:tc>
+          <w:tcPr>
+            <w:tcW w:type="dxa" w:w="2034"/>
+            <w:tcBorders>
+              <w:top w:val="single" w:color="000000" w:sz="6"/>
+              <w:left w:val="none" w:color="FFFFFF" w:sz="0"/>
+              <w:bottom w:val="single" w:color="000000" w:sz="6"/>
+              <w:right w:val="none" w:color="FFFFFF" w:sz="0"/>
+            </w:tcBorders>
+            <w:tcMar>
+              <w:top w:type="dxa" w:w="40"/>
+              <w:left w:type="dxa" w:w="80"/>
+              <w:bottom w:type="dxa" w:w="40"/>
+              <w:right w:type="dxa" w:w="80"/>
+            </w:tcMar>
+          </w:tcPr>
+          <w:p>
+            <w:pPr>
+              <w:spacing w:line="276" w:lineRule="auto"/>
+            </w:pPr>
+            <w:r>
+              <w:rPr>
+                <w:rFonts w:ascii="Times New Roman" w:cs="Times New Roman" w:eastAsia="SimSun" w:hAnsi="Times New Roman"/>
+                <w:b/>
+                <w:bCs/>
+                <w:sz w:val="16"/>
+                <w:szCs w:val="16"/>
+              </w:rPr>
+              <w:t xml:space="preserve">Sharpe beats 60/40/target/model (%)</w:t>
+            </w:r>
+          </w:p>
+        </w:tc>
+      </w:tr>
+      <w:tr>
+        <w:trPr>
+          <w:tblHeader w:val="false"/>
+        </w:trPr>
+        <w:tc>
+          <w:tcPr>
+            <w:tcW w:type="dxa" w:w="1339"/>
+            <w:tcBorders>
+              <w:top w:val="none" w:color="FFFFFF" w:sz="0"/>
+              <w:left w:val="none" w:color="FFFFFF" w:sz="0"/>
+              <w:bottom w:val="none" w:color="FFFFFF" w:sz="0"/>
+              <w:right w:val="none" w:color="FFFFFF" w:sz="0"/>
+            </w:tcBorders>
+            <w:tcMar>
+              <w:top w:type="dxa" w:w="40"/>
+              <w:left w:type="dxa" w:w="80"/>
+              <w:bottom w:type="dxa" w:w="40"/>
+              <w:right w:type="dxa" w:w="80"/>
+            </w:tcMar>
+          </w:tcPr>
+          <w:p>
+            <w:pPr>
+              <w:spacing w:line="276" w:lineRule="auto"/>
+            </w:pPr>
+            <w:r>
+              <w:rPr>
+                <w:rFonts w:ascii="Times New Roman" w:cs="Times New Roman" w:eastAsia="SimSun" w:hAnsi="Times New Roman"/>
+                <w:b w:val="false"/>
+                <w:bCs w:val="false"/>
+                <w:sz w:val="16"/>
+                <w:szCs w:val="16"/>
+              </w:rPr>
+              <w:t xml:space="preserve">AI C1</w:t>
+            </w:r>
+          </w:p>
+        </w:tc>
+        <w:tc>
+          <w:tcPr>
+            <w:tcW w:type="dxa" w:w="843"/>
+            <w:tcBorders>
+              <w:top w:val="none" w:color="FFFFFF" w:sz="0"/>
+              <w:left w:val="none" w:color="FFFFFF" w:sz="0"/>
+              <w:bottom w:val="none" w:color="FFFFFF" w:sz="0"/>
+              <w:right w:val="none" w:color="FFFFFF" w:sz="0"/>
+            </w:tcBorders>
+            <w:tcMar>
+              <w:top w:type="dxa" w:w="40"/>
+              <w:left w:type="dxa" w:w="80"/>
+              <w:bottom w:type="dxa" w:w="40"/>
+              <w:right w:type="dxa" w:w="80"/>
+            </w:tcMar>
+          </w:tcPr>
+          <w:p>
+            <w:pPr>
+              <w:spacing w:line="276" w:lineRule="auto"/>
+            </w:pPr>
+            <w:r>
+              <w:rPr>
+                <w:rFonts w:ascii="Times New Roman" w:cs="Times New Roman" w:eastAsia="SimSun" w:hAnsi="Times New Roman"/>
+                <w:b w:val="false"/>
+                <w:bCs w:val="false"/>
+                <w:sz w:val="16"/>
+                <w:szCs w:val="16"/>
+              </w:rPr>
+              <w:t xml:space="preserve">2.03</w:t>
+            </w:r>
+          </w:p>
+        </w:tc>
+        <w:tc>
+          <w:tcPr>
+            <w:tcW w:type="dxa" w:w="1240"/>
+            <w:tcBorders>
+              <w:top w:val="none" w:color="FFFFFF" w:sz="0"/>
+              <w:left w:val="none" w:color="FFFFFF" w:sz="0"/>
+              <w:bottom w:val="none" w:color="FFFFFF" w:sz="0"/>
+              <w:right w:val="none" w:color="FFFFFF" w:sz="0"/>
+            </w:tcBorders>
+            <w:tcMar>
+              <w:top w:type="dxa" w:w="40"/>
+              <w:left w:type="dxa" w:w="80"/>
+              <w:bottom w:type="dxa" w:w="40"/>
+              <w:right w:type="dxa" w:w="80"/>
+            </w:tcMar>
+          </w:tcPr>
+          <w:p>
+            <w:pPr>
+              <w:spacing w:line="276" w:lineRule="auto"/>
+            </w:pPr>
+            <w:r>
+              <w:rPr>
+                <w:rFonts w:ascii="Times New Roman" w:cs="Times New Roman" w:eastAsia="SimSun" w:hAnsi="Times New Roman"/>
+                <w:b w:val="false"/>
+                <w:bCs w:val="false"/>
+                <w:sz w:val="16"/>
+                <w:szCs w:val="16"/>
+              </w:rPr>
+              <w:t xml:space="preserve">0.30</w:t>
+            </w:r>
+          </w:p>
+        </w:tc>
+        <w:tc>
+          <w:tcPr>
+            <w:tcW w:type="dxa" w:w="843"/>
+            <w:tcBorders>
+              <w:top w:val="none" w:color="FFFFFF" w:sz="0"/>
+              <w:left w:val="none" w:color="FFFFFF" w:sz="0"/>
+              <w:bottom w:val="none" w:color="FFFFFF" w:sz="0"/>
+              <w:right w:val="none" w:color="FFFFFF" w:sz="0"/>
+            </w:tcBorders>
+            <w:tcMar>
+              <w:top w:type="dxa" w:w="40"/>
+              <w:left w:type="dxa" w:w="80"/>
+              <w:bottom w:type="dxa" w:w="40"/>
+              <w:right w:type="dxa" w:w="80"/>
+            </w:tcMar>
+          </w:tcPr>
+          <w:p>
+            <w:pPr>
+              <w:spacing w:line="276" w:lineRule="auto"/>
+            </w:pPr>
+            <w:r>
+              <w:rPr>
+                <w:rFonts w:ascii="Times New Roman" w:cs="Times New Roman" w:eastAsia="SimSun" w:hAnsi="Times New Roman"/>
+                <w:b w:val="false"/>
+                <w:bCs w:val="false"/>
+                <w:sz w:val="16"/>
+                <w:szCs w:val="16"/>
+              </w:rPr>
+              <w:t xml:space="preserve">n.m.</w:t>
+            </w:r>
+          </w:p>
+        </w:tc>
+        <w:tc>
+          <w:tcPr>
+            <w:tcW w:type="dxa" w:w="1041"/>
+            <w:tcBorders>
+              <w:top w:val="none" w:color="FFFFFF" w:sz="0"/>
+              <w:left w:val="none" w:color="FFFFFF" w:sz="0"/>
+              <w:bottom w:val="none" w:color="FFFFFF" w:sz="0"/>
+              <w:right w:val="none" w:color="FFFFFF" w:sz="0"/>
+            </w:tcBorders>
+            <w:tcMar>
+              <w:top w:type="dxa" w:w="40"/>
+              <w:left w:type="dxa" w:w="80"/>
+              <w:bottom w:type="dxa" w:w="40"/>
+              <w:right w:type="dxa" w:w="80"/>
+            </w:tcMar>
+          </w:tcPr>
+          <w:p>
+            <w:pPr>
+              <w:spacing w:line="276" w:lineRule="auto"/>
+            </w:pPr>
+            <w:r>
+              <w:rPr>
+                <w:rFonts w:ascii="Times New Roman" w:cs="Times New Roman" w:eastAsia="SimSun" w:hAnsi="Times New Roman"/>
+                <w:b w:val="false"/>
+                <w:bCs w:val="false"/>
+                <w:sz w:val="16"/>
+                <w:szCs w:val="16"/>
+              </w:rPr>
+              <w:t xml:space="preserve">-0.06</w:t>
+            </w:r>
+          </w:p>
+        </w:tc>
+        <w:tc>
+          <w:tcPr>
+            <w:tcW w:type="dxa" w:w="843"/>
+            <w:tcBorders>
+              <w:top w:val="none" w:color="FFFFFF" w:sz="0"/>
+              <w:left w:val="none" w:color="FFFFFF" w:sz="0"/>
+              <w:bottom w:val="none" w:color="FFFFFF" w:sz="0"/>
+              <w:right w:val="none" w:color="FFFFFF" w:sz="0"/>
+            </w:tcBorders>
+            <w:tcMar>
+              <w:top w:type="dxa" w:w="40"/>
+              <w:left w:type="dxa" w:w="80"/>
+              <w:bottom w:type="dxa" w:w="40"/>
+              <w:right w:type="dxa" w:w="80"/>
+            </w:tcMar>
+          </w:tcPr>
+          <w:p>
+            <w:pPr>
+              <w:spacing w:line="276" w:lineRule="auto"/>
+            </w:pPr>
+            <w:r>
+              <w:rPr>
+                <w:rFonts w:ascii="Times New Roman" w:cs="Times New Roman" w:eastAsia="SimSun" w:hAnsi="Times New Roman"/>
+                <w:b w:val="false"/>
+                <w:bCs w:val="false"/>
+                <w:sz w:val="16"/>
+                <w:szCs w:val="16"/>
+              </w:rPr>
+              <w:t xml:space="preserve">n.m.</w:t>
+            </w:r>
+          </w:p>
+        </w:tc>
+        <w:tc>
+          <w:tcPr>
+            <w:tcW w:type="dxa" w:w="843"/>
+            <w:tcBorders>
+              <w:top w:val="none" w:color="FFFFFF" w:sz="0"/>
+              <w:left w:val="none" w:color="FFFFFF" w:sz="0"/>
+              <w:bottom w:val="none" w:color="FFFFFF" w:sz="0"/>
+              <w:right w:val="none" w:color="FFFFFF" w:sz="0"/>
+            </w:tcBorders>
+            <w:tcMar>
+              <w:top w:type="dxa" w:w="40"/>
+              <w:left w:type="dxa" w:w="80"/>
+              <w:bottom w:type="dxa" w:w="40"/>
+              <w:right w:type="dxa" w:w="80"/>
+            </w:tcMar>
+          </w:tcPr>
+          <w:p>
+            <w:pPr>
+              <w:spacing w:line="276" w:lineRule="auto"/>
+            </w:pPr>
+            <w:r>
+              <w:rPr>
+                <w:rFonts w:ascii="Times New Roman" w:cs="Times New Roman" w:eastAsia="SimSun" w:hAnsi="Times New Roman"/>
+                <w:b w:val="false"/>
+                <w:bCs w:val="false"/>
+                <w:sz w:val="16"/>
+                <w:szCs w:val="16"/>
+              </w:rPr>
+              <w:t xml:space="preserve">1.30</w:t>
+            </w:r>
+          </w:p>
+        </w:tc>
+        <w:tc>
+          <w:tcPr>
+            <w:tcW w:type="dxa" w:w="2034"/>
+            <w:tcBorders>
+              <w:top w:val="none" w:color="FFFFFF" w:sz="0"/>
+              <w:left w:val="none" w:color="FFFFFF" w:sz="0"/>
+              <w:bottom w:val="none" w:color="FFFFFF" w:sz="0"/>
+              <w:right w:val="none" w:color="FFFFFF" w:sz="0"/>
+            </w:tcBorders>
+            <w:tcMar>
+              <w:top w:type="dxa" w:w="40"/>
+              <w:left w:type="dxa" w:w="80"/>
+              <w:bottom w:type="dxa" w:w="40"/>
+              <w:right w:type="dxa" w:w="80"/>
+            </w:tcMar>
+          </w:tcPr>
+          <w:p>
+            <w:pPr>
+              <w:spacing w:line="276" w:lineRule="auto"/>
+            </w:pPr>
+            <w:r>
+              <w:rPr>
+                <w:rFonts w:ascii="Times New Roman" w:cs="Times New Roman" w:eastAsia="SimSun" w:hAnsi="Times New Roman"/>
+                <w:b w:val="false"/>
+                <w:bCs w:val="false"/>
+                <w:sz w:val="16"/>
+                <w:szCs w:val="16"/>
+              </w:rPr>
+              <w:t xml:space="preserve">n.m.</w:t>
+            </w:r>
+          </w:p>
+        </w:tc>
+      </w:tr>
+      <w:tr>
+        <w:trPr>
+          <w:tblHeader w:val="false"/>
+        </w:trPr>
+        <w:tc>
+          <w:tcPr>
+            <w:tcW w:type="dxa" w:w="1339"/>
+            <w:tcBorders>
+              <w:top w:val="none" w:color="FFFFFF" w:sz="0"/>
+              <w:left w:val="none" w:color="FFFFFF" w:sz="0"/>
+              <w:bottom w:val="none" w:color="FFFFFF" w:sz="0"/>
+              <w:right w:val="none" w:color="FFFFFF" w:sz="0"/>
+            </w:tcBorders>
+            <w:tcMar>
+              <w:top w:type="dxa" w:w="40"/>
+              <w:left w:type="dxa" w:w="80"/>
+              <w:bottom w:type="dxa" w:w="40"/>
+              <w:right w:type="dxa" w:w="80"/>
+            </w:tcMar>
+          </w:tcPr>
+          <w:p>
+            <w:pPr>
+              <w:spacing w:line="276" w:lineRule="auto"/>
+            </w:pPr>
+            <w:r>
+              <w:rPr>
+                <w:rFonts w:ascii="Times New Roman" w:cs="Times New Roman" w:eastAsia="SimSun" w:hAnsi="Times New Roman"/>
+                <w:b w:val="false"/>
+                <w:bCs w:val="false"/>
+                <w:sz w:val="16"/>
+                <w:szCs w:val="16"/>
+              </w:rPr>
+              <w:t xml:space="preserve">AI C2</w:t>
+            </w:r>
+          </w:p>
+        </w:tc>
+        <w:tc>
+          <w:tcPr>
+            <w:tcW w:type="dxa" w:w="843"/>
+            <w:tcBorders>
+              <w:top w:val="none" w:color="FFFFFF" w:sz="0"/>
+              <w:left w:val="none" w:color="FFFFFF" w:sz="0"/>
+              <w:bottom w:val="none" w:color="FFFFFF" w:sz="0"/>
+              <w:right w:val="none" w:color="FFFFFF" w:sz="0"/>
+            </w:tcBorders>
+            <w:tcMar>
+              <w:top w:type="dxa" w:w="40"/>
+              <w:left w:type="dxa" w:w="80"/>
+              <w:bottom w:type="dxa" w:w="40"/>
+              <w:right w:type="dxa" w:w="80"/>
+            </w:tcMar>
+          </w:tcPr>
+          <w:p>
+            <w:pPr>
+              <w:spacing w:line="276" w:lineRule="auto"/>
+            </w:pPr>
+            <w:r>
+              <w:rPr>
+                <w:rFonts w:ascii="Times New Roman" w:cs="Times New Roman" w:eastAsia="SimSun" w:hAnsi="Times New Roman"/>
+                <w:b w:val="false"/>
+                <w:bCs w:val="false"/>
+                <w:sz w:val="16"/>
+                <w:szCs w:val="16"/>
+              </w:rPr>
+              <w:t xml:space="preserve">2.81</w:t>
+            </w:r>
+          </w:p>
+        </w:tc>
+        <w:tc>
+          <w:tcPr>
+            <w:tcW w:type="dxa" w:w="1240"/>
+            <w:tcBorders>
+              <w:top w:val="none" w:color="FFFFFF" w:sz="0"/>
+              <w:left w:val="none" w:color="FFFFFF" w:sz="0"/>
+              <w:bottom w:val="none" w:color="FFFFFF" w:sz="0"/>
+              <w:right w:val="none" w:color="FFFFFF" w:sz="0"/>
+            </w:tcBorders>
+            <w:tcMar>
+              <w:top w:type="dxa" w:w="40"/>
+              <w:left w:type="dxa" w:w="80"/>
+              <w:bottom w:type="dxa" w:w="40"/>
+              <w:right w:type="dxa" w:w="80"/>
+            </w:tcMar>
+          </w:tcPr>
+          <w:p>
+            <w:pPr>
+              <w:spacing w:line="276" w:lineRule="auto"/>
+            </w:pPr>
+            <w:r>
+              <w:rPr>
+                <w:rFonts w:ascii="Times New Roman" w:cs="Times New Roman" w:eastAsia="SimSun" w:hAnsi="Times New Roman"/>
+                <w:b w:val="false"/>
+                <w:bCs w:val="false"/>
+                <w:sz w:val="16"/>
+                <w:szCs w:val="16"/>
+              </w:rPr>
+              <w:t xml:space="preserve">0.80</w:t>
+            </w:r>
+          </w:p>
+        </w:tc>
+        <w:tc>
+          <w:tcPr>
+            <w:tcW w:type="dxa" w:w="843"/>
+            <w:tcBorders>
+              <w:top w:val="none" w:color="FFFFFF" w:sz="0"/>
+              <w:left w:val="none" w:color="FFFFFF" w:sz="0"/>
+              <w:bottom w:val="none" w:color="FFFFFF" w:sz="0"/>
+              <w:right w:val="none" w:color="FFFFFF" w:sz="0"/>
+            </w:tcBorders>
+            <w:tcMar>
+              <w:top w:type="dxa" w:w="40"/>
+              <w:left w:type="dxa" w:w="80"/>
+              <w:bottom w:type="dxa" w:w="40"/>
+              <w:right w:type="dxa" w:w="80"/>
+            </w:tcMar>
+          </w:tcPr>
+          <w:p>
+            <w:pPr>
+              <w:spacing w:line="276" w:lineRule="auto"/>
+            </w:pPr>
+            <w:r>
+              <w:rPr>
+                <w:rFonts w:ascii="Times New Roman" w:cs="Times New Roman" w:eastAsia="SimSun" w:hAnsi="Times New Roman"/>
+                <w:b w:val="false"/>
+                <w:bCs w:val="false"/>
+                <w:sz w:val="16"/>
+                <w:szCs w:val="16"/>
+              </w:rPr>
+              <w:t xml:space="preserve">1.69</w:t>
+            </w:r>
+          </w:p>
+        </w:tc>
+        <w:tc>
+          <w:tcPr>
+            <w:tcW w:type="dxa" w:w="1041"/>
+            <w:tcBorders>
+              <w:top w:val="none" w:color="FFFFFF" w:sz="0"/>
+              <w:left w:val="none" w:color="FFFFFF" w:sz="0"/>
+              <w:bottom w:val="none" w:color="FFFFFF" w:sz="0"/>
+              <w:right w:val="none" w:color="FFFFFF" w:sz="0"/>
+            </w:tcBorders>
+            <w:tcMar>
+              <w:top w:type="dxa" w:w="40"/>
+              <w:left w:type="dxa" w:w="80"/>
+              <w:bottom w:type="dxa" w:w="40"/>
+              <w:right w:type="dxa" w:w="80"/>
+            </w:tcMar>
+          </w:tcPr>
+          <w:p>
+            <w:pPr>
+              <w:spacing w:line="276" w:lineRule="auto"/>
+            </w:pPr>
+            <w:r>
+              <w:rPr>
+                <w:rFonts w:ascii="Times New Roman" w:cs="Times New Roman" w:eastAsia="SimSun" w:hAnsi="Times New Roman"/>
+                <w:b w:val="false"/>
+                <w:bCs w:val="false"/>
+                <w:sz w:val="16"/>
+                <w:szCs w:val="16"/>
+              </w:rPr>
+              <w:t xml:space="preserve">-0.34</w:t>
+            </w:r>
+          </w:p>
+        </w:tc>
+        <w:tc>
+          <w:tcPr>
+            <w:tcW w:type="dxa" w:w="843"/>
+            <w:tcBorders>
+              <w:top w:val="none" w:color="FFFFFF" w:sz="0"/>
+              <w:left w:val="none" w:color="FFFFFF" w:sz="0"/>
+              <w:bottom w:val="none" w:color="FFFFFF" w:sz="0"/>
+              <w:right w:val="none" w:color="FFFFFF" w:sz="0"/>
+            </w:tcBorders>
+            <w:tcMar>
+              <w:top w:type="dxa" w:w="40"/>
+              <w:left w:type="dxa" w:w="80"/>
+              <w:bottom w:type="dxa" w:w="40"/>
+              <w:right w:type="dxa" w:w="80"/>
+            </w:tcMar>
+          </w:tcPr>
+          <w:p>
+            <w:pPr>
+              <w:spacing w:line="276" w:lineRule="auto"/>
+            </w:pPr>
+            <w:r>
+              <w:rPr>
+                <w:rFonts w:ascii="Times New Roman" w:cs="Times New Roman" w:eastAsia="SimSun" w:hAnsi="Times New Roman"/>
+                <w:b w:val="false"/>
+                <w:bCs w:val="false"/>
+                <w:sz w:val="16"/>
+                <w:szCs w:val="16"/>
+              </w:rPr>
+              <w:t xml:space="preserve">n.m.</w:t>
+            </w:r>
+          </w:p>
+        </w:tc>
+        <w:tc>
+          <w:tcPr>
+            <w:tcW w:type="dxa" w:w="843"/>
+            <w:tcBorders>
+              <w:top w:val="none" w:color="FFFFFF" w:sz="0"/>
+              <w:left w:val="none" w:color="FFFFFF" w:sz="0"/>
+              <w:bottom w:val="none" w:color="FFFFFF" w:sz="0"/>
+              <w:right w:val="none" w:color="FFFFFF" w:sz="0"/>
+            </w:tcBorders>
+            <w:tcMar>
+              <w:top w:type="dxa" w:w="40"/>
+              <w:left w:type="dxa" w:w="80"/>
+              <w:bottom w:type="dxa" w:w="40"/>
+              <w:right w:type="dxa" w:w="80"/>
+            </w:tcMar>
+          </w:tcPr>
+          <w:p>
+            <w:pPr>
+              <w:spacing w:line="276" w:lineRule="auto"/>
+            </w:pPr>
+            <w:r>
+              <w:rPr>
+                <w:rFonts w:ascii="Times New Roman" w:cs="Times New Roman" w:eastAsia="SimSun" w:hAnsi="Times New Roman"/>
+                <w:b w:val="false"/>
+                <w:bCs w:val="false"/>
+                <w:sz w:val="16"/>
+                <w:szCs w:val="16"/>
+              </w:rPr>
+              <w:t xml:space="preserve">1.34</w:t>
+            </w:r>
+          </w:p>
+        </w:tc>
+        <w:tc>
+          <w:tcPr>
+            <w:tcW w:type="dxa" w:w="2034"/>
+            <w:tcBorders>
+              <w:top w:val="none" w:color="FFFFFF" w:sz="0"/>
+              <w:left w:val="none" w:color="FFFFFF" w:sz="0"/>
+              <w:bottom w:val="none" w:color="FFFFFF" w:sz="0"/>
+              <w:right w:val="none" w:color="FFFFFF" w:sz="0"/>
+            </w:tcBorders>
+            <w:tcMar>
+              <w:top w:type="dxa" w:w="40"/>
+              <w:left w:type="dxa" w:w="80"/>
+              <w:bottom w:type="dxa" w:w="40"/>
+              <w:right w:type="dxa" w:w="80"/>
+            </w:tcMar>
+          </w:tcPr>
+          <w:p>
+            <w:pPr>
+              <w:spacing w:line="276" w:lineRule="auto"/>
+            </w:pPr>
+            <w:r>
+              <w:rPr>
+                <w:rFonts w:ascii="Times New Roman" w:cs="Times New Roman" w:eastAsia="SimSun" w:hAnsi="Times New Roman"/>
+                <w:b w:val="false"/>
+                <w:bCs w:val="false"/>
+                <w:sz w:val="16"/>
+                <w:szCs w:val="16"/>
+              </w:rPr>
+              <w:t xml:space="preserve">99/98/35</w:t>
+            </w:r>
+          </w:p>
+        </w:tc>
+      </w:tr>
+      <w:tr>
+        <w:trPr>
+          <w:tblHeader w:val="false"/>
+        </w:trPr>
+        <w:tc>
+          <w:tcPr>
+            <w:tcW w:type="dxa" w:w="1339"/>
+            <w:tcBorders>
+              <w:top w:val="none" w:color="FFFFFF" w:sz="0"/>
+              <w:left w:val="none" w:color="FFFFFF" w:sz="0"/>
+              <w:bottom w:val="none" w:color="FFFFFF" w:sz="0"/>
+              <w:right w:val="none" w:color="FFFFFF" w:sz="0"/>
+            </w:tcBorders>
+            <w:tcMar>
+              <w:top w:type="dxa" w:w="40"/>
+              <w:left w:type="dxa" w:w="80"/>
+              <w:bottom w:type="dxa" w:w="40"/>
+              <w:right w:type="dxa" w:w="80"/>
+            </w:tcMar>
+          </w:tcPr>
+          <w:p>
+            <w:pPr>
+              <w:spacing w:line="276" w:lineRule="auto"/>
+            </w:pPr>
+            <w:r>
+              <w:rPr>
+                <w:rFonts w:ascii="Times New Roman" w:cs="Times New Roman" w:eastAsia="SimSun" w:hAnsi="Times New Roman"/>
+                <w:b w:val="false"/>
+                <w:bCs w:val="false"/>
+                <w:sz w:val="16"/>
+                <w:szCs w:val="16"/>
+              </w:rPr>
+              <w:t xml:space="preserve">AI C3</w:t>
+            </w:r>
+          </w:p>
+        </w:tc>
+        <w:tc>
+          <w:tcPr>
+            <w:tcW w:type="dxa" w:w="843"/>
+            <w:tcBorders>
+              <w:top w:val="none" w:color="FFFFFF" w:sz="0"/>
+              <w:left w:val="none" w:color="FFFFFF" w:sz="0"/>
+              <w:bottom w:val="none" w:color="FFFFFF" w:sz="0"/>
+              <w:right w:val="none" w:color="FFFFFF" w:sz="0"/>
+            </w:tcBorders>
+            <w:tcMar>
+              <w:top w:type="dxa" w:w="40"/>
+              <w:left w:type="dxa" w:w="80"/>
+              <w:bottom w:type="dxa" w:w="40"/>
+              <w:right w:type="dxa" w:w="80"/>
+            </w:tcMar>
+          </w:tcPr>
+          <w:p>
+            <w:pPr>
+              <w:spacing w:line="276" w:lineRule="auto"/>
+            </w:pPr>
+            <w:r>
+              <w:rPr>
+                <w:rFonts w:ascii="Times New Roman" w:cs="Times New Roman" w:eastAsia="SimSun" w:hAnsi="Times New Roman"/>
+                <w:b w:val="false"/>
+                <w:bCs w:val="false"/>
+                <w:sz w:val="16"/>
+                <w:szCs w:val="16"/>
+              </w:rPr>
+              <w:t xml:space="preserve">3.24</w:t>
+            </w:r>
+          </w:p>
+        </w:tc>
+        <w:tc>
+          <w:tcPr>
+            <w:tcW w:type="dxa" w:w="1240"/>
+            <w:tcBorders>
+              <w:top w:val="none" w:color="FFFFFF" w:sz="0"/>
+              <w:left w:val="none" w:color="FFFFFF" w:sz="0"/>
+              <w:bottom w:val="none" w:color="FFFFFF" w:sz="0"/>
+              <w:right w:val="none" w:color="FFFFFF" w:sz="0"/>
+            </w:tcBorders>
+            <w:tcMar>
+              <w:top w:type="dxa" w:w="40"/>
+              <w:left w:type="dxa" w:w="80"/>
+              <w:bottom w:type="dxa" w:w="40"/>
+              <w:right w:type="dxa" w:w="80"/>
+            </w:tcMar>
+          </w:tcPr>
+          <w:p>
+            <w:pPr>
+              <w:spacing w:line="276" w:lineRule="auto"/>
+            </w:pPr>
+            <w:r>
+              <w:rPr>
+                <w:rFonts w:ascii="Times New Roman" w:cs="Times New Roman" w:eastAsia="SimSun" w:hAnsi="Times New Roman"/>
+                <w:b w:val="false"/>
+                <w:bCs w:val="false"/>
+                <w:sz w:val="16"/>
+                <w:szCs w:val="16"/>
+              </w:rPr>
+              <w:t xml:space="preserve">3.44</w:t>
+            </w:r>
+          </w:p>
+        </w:tc>
+        <w:tc>
+          <w:tcPr>
+            <w:tcW w:type="dxa" w:w="843"/>
+            <w:tcBorders>
+              <w:top w:val="none" w:color="FFFFFF" w:sz="0"/>
+              <w:left w:val="none" w:color="FFFFFF" w:sz="0"/>
+              <w:bottom w:val="none" w:color="FFFFFF" w:sz="0"/>
+              <w:right w:val="none" w:color="FFFFFF" w:sz="0"/>
+            </w:tcBorders>
+            <w:tcMar>
+              <w:top w:type="dxa" w:w="40"/>
+              <w:left w:type="dxa" w:w="80"/>
+              <w:bottom w:type="dxa" w:w="40"/>
+              <w:right w:type="dxa" w:w="80"/>
+            </w:tcMar>
+          </w:tcPr>
+          <w:p>
+            <w:pPr>
+              <w:spacing w:line="276" w:lineRule="auto"/>
+            </w:pPr>
+            <w:r>
+              <w:rPr>
+                <w:rFonts w:ascii="Times New Roman" w:cs="Times New Roman" w:eastAsia="SimSun" w:hAnsi="Times New Roman"/>
+                <w:b w:val="false"/>
+                <w:bCs w:val="false"/>
+                <w:sz w:val="16"/>
+                <w:szCs w:val="16"/>
+              </w:rPr>
+              <w:t xml:space="preserve">0.67</w:t>
+            </w:r>
+          </w:p>
+        </w:tc>
+        <w:tc>
+          <w:tcPr>
+            <w:tcW w:type="dxa" w:w="1041"/>
+            <w:tcBorders>
+              <w:top w:val="none" w:color="FFFFFF" w:sz="0"/>
+              <w:left w:val="none" w:color="FFFFFF" w:sz="0"/>
+              <w:bottom w:val="none" w:color="FFFFFF" w:sz="0"/>
+              <w:right w:val="none" w:color="FFFFFF" w:sz="0"/>
+            </w:tcBorders>
+            <w:tcMar>
+              <w:top w:type="dxa" w:w="40"/>
+              <w:left w:type="dxa" w:w="80"/>
+              <w:bottom w:type="dxa" w:w="40"/>
+              <w:right w:type="dxa" w:w="80"/>
+            </w:tcMar>
+          </w:tcPr>
+          <w:p>
+            <w:pPr>
+              <w:spacing w:line="276" w:lineRule="auto"/>
+            </w:pPr>
+            <w:r>
+              <w:rPr>
+                <w:rFonts w:ascii="Times New Roman" w:cs="Times New Roman" w:eastAsia="SimSun" w:hAnsi="Times New Roman"/>
+                <w:b w:val="false"/>
+                <w:bCs w:val="false"/>
+                <w:sz w:val="16"/>
+                <w:szCs w:val="16"/>
+              </w:rPr>
+              <w:t xml:space="preserve">-3.28</w:t>
+            </w:r>
+          </w:p>
+        </w:tc>
+        <w:tc>
+          <w:tcPr>
+            <w:tcW w:type="dxa" w:w="843"/>
+            <w:tcBorders>
+              <w:top w:val="none" w:color="FFFFFF" w:sz="0"/>
+              <w:left w:val="none" w:color="FFFFFF" w:sz="0"/>
+              <w:bottom w:val="none" w:color="FFFFFF" w:sz="0"/>
+              <w:right w:val="none" w:color="FFFFFF" w:sz="0"/>
+            </w:tcBorders>
+            <w:tcMar>
+              <w:top w:type="dxa" w:w="40"/>
+              <w:left w:type="dxa" w:w="80"/>
+              <w:bottom w:type="dxa" w:w="40"/>
+              <w:right w:type="dxa" w:w="80"/>
+            </w:tcMar>
+          </w:tcPr>
+          <w:p>
+            <w:pPr>
+              <w:spacing w:line="276" w:lineRule="auto"/>
+            </w:pPr>
+            <w:r>
+              <w:rPr>
+                <w:rFonts w:ascii="Times New Roman" w:cs="Times New Roman" w:eastAsia="SimSun" w:hAnsi="Times New Roman"/>
+                <w:b w:val="false"/>
+                <w:bCs w:val="false"/>
+                <w:sz w:val="16"/>
+                <w:szCs w:val="16"/>
+              </w:rPr>
+              <w:t xml:space="preserve">1.06</w:t>
+            </w:r>
+          </w:p>
+        </w:tc>
+        <w:tc>
+          <w:tcPr>
+            <w:tcW w:type="dxa" w:w="843"/>
+            <w:tcBorders>
+              <w:top w:val="none" w:color="FFFFFF" w:sz="0"/>
+              <w:left w:val="none" w:color="FFFFFF" w:sz="0"/>
+              <w:bottom w:val="none" w:color="FFFFFF" w:sz="0"/>
+              <w:right w:val="none" w:color="FFFFFF" w:sz="0"/>
+            </w:tcBorders>
+            <w:tcMar>
+              <w:top w:type="dxa" w:w="40"/>
+              <w:left w:type="dxa" w:w="80"/>
+              <w:bottom w:type="dxa" w:w="40"/>
+              <w:right w:type="dxa" w:w="80"/>
+            </w:tcMar>
+          </w:tcPr>
+          <w:p>
+            <w:pPr>
+              <w:spacing w:line="276" w:lineRule="auto"/>
+            </w:pPr>
+            <w:r>
+              <w:rPr>
+                <w:rFonts w:ascii="Times New Roman" w:cs="Times New Roman" w:eastAsia="SimSun" w:hAnsi="Times New Roman"/>
+                <w:b w:val="false"/>
+                <w:bCs w:val="false"/>
+                <w:sz w:val="16"/>
+                <w:szCs w:val="16"/>
+              </w:rPr>
+              <w:t xml:space="preserve">-1.89</w:t>
+            </w:r>
+          </w:p>
+        </w:tc>
+        <w:tc>
+          <w:tcPr>
+            <w:tcW w:type="dxa" w:w="2034"/>
+            <w:tcBorders>
+              <w:top w:val="none" w:color="FFFFFF" w:sz="0"/>
+              <w:left w:val="none" w:color="FFFFFF" w:sz="0"/>
+              <w:bottom w:val="none" w:color="FFFFFF" w:sz="0"/>
+              <w:right w:val="none" w:color="FFFFFF" w:sz="0"/>
+            </w:tcBorders>
+            <w:tcMar>
+              <w:top w:type="dxa" w:w="40"/>
+              <w:left w:type="dxa" w:w="80"/>
+              <w:bottom w:type="dxa" w:w="40"/>
+              <w:right w:type="dxa" w:w="80"/>
+            </w:tcMar>
+          </w:tcPr>
+          <w:p>
+            <w:pPr>
+              <w:spacing w:line="276" w:lineRule="auto"/>
+            </w:pPr>
+            <w:r>
+              <w:rPr>
+                <w:rFonts w:ascii="Times New Roman" w:cs="Times New Roman" w:eastAsia="SimSun" w:hAnsi="Times New Roman"/>
+                <w:b w:val="false"/>
+                <w:bCs w:val="false"/>
+                <w:sz w:val="16"/>
+                <w:szCs w:val="16"/>
+              </w:rPr>
+              <w:t xml:space="preserve">97/92/28</w:t>
+            </w:r>
+          </w:p>
+        </w:tc>
+      </w:tr>
+      <w:tr>
+        <w:trPr>
+          <w:tblHeader w:val="false"/>
+        </w:trPr>
+        <w:tc>
+          <w:tcPr>
+            <w:tcW w:type="dxa" w:w="1339"/>
+            <w:tcBorders>
+              <w:top w:val="none" w:color="FFFFFF" w:sz="0"/>
+              <w:left w:val="none" w:color="FFFFFF" w:sz="0"/>
+              <w:bottom w:val="none" w:color="FFFFFF" w:sz="0"/>
+              <w:right w:val="none" w:color="FFFFFF" w:sz="0"/>
+            </w:tcBorders>
+            <w:tcMar>
+              <w:top w:type="dxa" w:w="40"/>
+              <w:left w:type="dxa" w:w="80"/>
+              <w:bottom w:type="dxa" w:w="40"/>
+              <w:right w:type="dxa" w:w="80"/>
+            </w:tcMar>
+          </w:tcPr>
+          <w:p>
+            <w:pPr>
+              <w:spacing w:line="276" w:lineRule="auto"/>
+            </w:pPr>
+            <w:r>
+              <w:rPr>
+                <w:rFonts w:ascii="Times New Roman" w:cs="Times New Roman" w:eastAsia="SimSun" w:hAnsi="Times New Roman"/>
+                <w:b w:val="false"/>
+                <w:bCs w:val="false"/>
+                <w:sz w:val="16"/>
+                <w:szCs w:val="16"/>
+              </w:rPr>
+              <w:t xml:space="preserve">AI C4</w:t>
+            </w:r>
+          </w:p>
+        </w:tc>
+        <w:tc>
+          <w:tcPr>
+            <w:tcW w:type="dxa" w:w="843"/>
+            <w:tcBorders>
+              <w:top w:val="none" w:color="FFFFFF" w:sz="0"/>
+              <w:left w:val="none" w:color="FFFFFF" w:sz="0"/>
+              <w:bottom w:val="none" w:color="FFFFFF" w:sz="0"/>
+              <w:right w:val="none" w:color="FFFFFF" w:sz="0"/>
+            </w:tcBorders>
+            <w:tcMar>
+              <w:top w:type="dxa" w:w="40"/>
+              <w:left w:type="dxa" w:w="80"/>
+              <w:bottom w:type="dxa" w:w="40"/>
+              <w:right w:type="dxa" w:w="80"/>
+            </w:tcMar>
+          </w:tcPr>
+          <w:p>
+            <w:pPr>
+              <w:spacing w:line="276" w:lineRule="auto"/>
+            </w:pPr>
+            <w:r>
+              <w:rPr>
+                <w:rFonts w:ascii="Times New Roman" w:cs="Times New Roman" w:eastAsia="SimSun" w:hAnsi="Times New Roman"/>
+                <w:b w:val="false"/>
+                <w:bCs w:val="false"/>
+                <w:sz w:val="16"/>
+                <w:szCs w:val="16"/>
+              </w:rPr>
+              <w:t xml:space="preserve">3.31</w:t>
+            </w:r>
+          </w:p>
+        </w:tc>
+        <w:tc>
+          <w:tcPr>
+            <w:tcW w:type="dxa" w:w="1240"/>
+            <w:tcBorders>
+              <w:top w:val="none" w:color="FFFFFF" w:sz="0"/>
+              <w:left w:val="none" w:color="FFFFFF" w:sz="0"/>
+              <w:bottom w:val="none" w:color="FFFFFF" w:sz="0"/>
+              <w:right w:val="none" w:color="FFFFFF" w:sz="0"/>
+            </w:tcBorders>
+            <w:tcMar>
+              <w:top w:type="dxa" w:w="40"/>
+              <w:left w:type="dxa" w:w="80"/>
+              <w:bottom w:type="dxa" w:w="40"/>
+              <w:right w:type="dxa" w:w="80"/>
+            </w:tcMar>
+          </w:tcPr>
+          <w:p>
+            <w:pPr>
+              <w:spacing w:line="276" w:lineRule="auto"/>
+            </w:pPr>
+            <w:r>
+              <w:rPr>
+                <w:rFonts w:ascii="Times New Roman" w:cs="Times New Roman" w:eastAsia="SimSun" w:hAnsi="Times New Roman"/>
+                <w:b w:val="false"/>
+                <w:bCs w:val="false"/>
+                <w:sz w:val="16"/>
+                <w:szCs w:val="16"/>
+              </w:rPr>
+              <w:t xml:space="preserve">9.98</w:t>
+            </w:r>
+          </w:p>
+        </w:tc>
+        <w:tc>
+          <w:tcPr>
+            <w:tcW w:type="dxa" w:w="843"/>
+            <w:tcBorders>
+              <w:top w:val="none" w:color="FFFFFF" w:sz="0"/>
+              <w:left w:val="none" w:color="FFFFFF" w:sz="0"/>
+              <w:bottom w:val="none" w:color="FFFFFF" w:sz="0"/>
+              <w:right w:val="none" w:color="FFFFFF" w:sz="0"/>
+            </w:tcBorders>
+            <w:tcMar>
+              <w:top w:type="dxa" w:w="40"/>
+              <w:left w:type="dxa" w:w="80"/>
+              <w:bottom w:type="dxa" w:w="40"/>
+              <w:right w:type="dxa" w:w="80"/>
+            </w:tcMar>
+          </w:tcPr>
+          <w:p>
+            <w:pPr>
+              <w:spacing w:line="276" w:lineRule="auto"/>
+            </w:pPr>
+            <w:r>
+              <w:rPr>
+                <w:rFonts w:ascii="Times New Roman" w:cs="Times New Roman" w:eastAsia="SimSun" w:hAnsi="Times New Roman"/>
+                <w:b w:val="false"/>
+                <w:bCs w:val="false"/>
+                <w:sz w:val="16"/>
+                <w:szCs w:val="16"/>
+              </w:rPr>
+              <w:t xml:space="preserve">0.36</w:t>
+            </w:r>
+          </w:p>
+        </w:tc>
+        <w:tc>
+          <w:tcPr>
+            <w:tcW w:type="dxa" w:w="1041"/>
+            <w:tcBorders>
+              <w:top w:val="none" w:color="FFFFFF" w:sz="0"/>
+              <w:left w:val="none" w:color="FFFFFF" w:sz="0"/>
+              <w:bottom w:val="none" w:color="FFFFFF" w:sz="0"/>
+              <w:right w:val="none" w:color="FFFFFF" w:sz="0"/>
+            </w:tcBorders>
+            <w:tcMar>
+              <w:top w:type="dxa" w:w="40"/>
+              <w:left w:type="dxa" w:w="80"/>
+              <w:bottom w:type="dxa" w:w="40"/>
+              <w:right w:type="dxa" w:w="80"/>
+            </w:tcMar>
+          </w:tcPr>
+          <w:p>
+            <w:pPr>
+              <w:spacing w:line="276" w:lineRule="auto"/>
+            </w:pPr>
+            <w:r>
+              <w:rPr>
+                <w:rFonts w:ascii="Times New Roman" w:cs="Times New Roman" w:eastAsia="SimSun" w:hAnsi="Times New Roman"/>
+                <w:b w:val="false"/>
+                <w:bCs w:val="false"/>
+                <w:sz w:val="16"/>
+                <w:szCs w:val="16"/>
+              </w:rPr>
+              <w:t xml:space="preserve">-13.86</w:t>
+            </w:r>
+          </w:p>
+        </w:tc>
+        <w:tc>
+          <w:tcPr>
+            <w:tcW w:type="dxa" w:w="843"/>
+            <w:tcBorders>
+              <w:top w:val="none" w:color="FFFFFF" w:sz="0"/>
+              <w:left w:val="none" w:color="FFFFFF" w:sz="0"/>
+              <w:bottom w:val="none" w:color="FFFFFF" w:sz="0"/>
+              <w:right w:val="none" w:color="FFFFFF" w:sz="0"/>
+            </w:tcBorders>
+            <w:tcMar>
+              <w:top w:type="dxa" w:w="40"/>
+              <w:left w:type="dxa" w:w="80"/>
+              <w:bottom w:type="dxa" w:w="40"/>
+              <w:right w:type="dxa" w:w="80"/>
+            </w:tcMar>
+          </w:tcPr>
+          <w:p>
+            <w:pPr>
+              <w:spacing w:line="276" w:lineRule="auto"/>
+            </w:pPr>
+            <w:r>
+              <w:rPr>
+                <w:rFonts w:ascii="Times New Roman" w:cs="Times New Roman" w:eastAsia="SimSun" w:hAnsi="Times New Roman"/>
+                <w:b w:val="false"/>
+                <w:bCs w:val="false"/>
+                <w:sz w:val="16"/>
+                <w:szCs w:val="16"/>
+              </w:rPr>
+              <w:t xml:space="preserve">0.32</w:t>
+            </w:r>
+          </w:p>
+        </w:tc>
+        <w:tc>
+          <w:tcPr>
+            <w:tcW w:type="dxa" w:w="843"/>
+            <w:tcBorders>
+              <w:top w:val="none" w:color="FFFFFF" w:sz="0"/>
+              <w:left w:val="none" w:color="FFFFFF" w:sz="0"/>
+              <w:bottom w:val="none" w:color="FFFFFF" w:sz="0"/>
+              <w:right w:val="none" w:color="FFFFFF" w:sz="0"/>
+            </w:tcBorders>
+            <w:tcMar>
+              <w:top w:type="dxa" w:w="40"/>
+              <w:left w:type="dxa" w:w="80"/>
+              <w:bottom w:type="dxa" w:w="40"/>
+              <w:right w:type="dxa" w:w="80"/>
+            </w:tcMar>
+          </w:tcPr>
+          <w:p>
+            <w:pPr>
+              <w:spacing w:line="276" w:lineRule="auto"/>
+            </w:pPr>
+            <w:r>
+              <w:rPr>
+                <w:rFonts w:ascii="Times New Roman" w:cs="Times New Roman" w:eastAsia="SimSun" w:hAnsi="Times New Roman"/>
+                <w:b w:val="false"/>
+                <w:bCs w:val="false"/>
+                <w:sz w:val="16"/>
+                <w:szCs w:val="16"/>
+              </w:rPr>
+              <w:t xml:space="preserve">-12.16</w:t>
+            </w:r>
+          </w:p>
+        </w:tc>
+        <w:tc>
+          <w:tcPr>
+            <w:tcW w:type="dxa" w:w="2034"/>
+            <w:tcBorders>
+              <w:top w:val="none" w:color="FFFFFF" w:sz="0"/>
+              <w:left w:val="none" w:color="FFFFFF" w:sz="0"/>
+              <w:bottom w:val="none" w:color="FFFFFF" w:sz="0"/>
+              <w:right w:val="none" w:color="FFFFFF" w:sz="0"/>
+            </w:tcBorders>
+            <w:tcMar>
+              <w:top w:type="dxa" w:w="40"/>
+              <w:left w:type="dxa" w:w="80"/>
+              <w:bottom w:type="dxa" w:w="40"/>
+              <w:right w:type="dxa" w:w="80"/>
+            </w:tcMar>
+          </w:tcPr>
+          <w:p>
+            <w:pPr>
+              <w:spacing w:line="276" w:lineRule="auto"/>
+            </w:pPr>
+            <w:r>
+              <w:rPr>
+                <w:rFonts w:ascii="Times New Roman" w:cs="Times New Roman" w:eastAsia="SimSun" w:hAnsi="Times New Roman"/>
+                <w:b w:val="false"/>
+                <w:bCs w:val="false"/>
+                <w:sz w:val="16"/>
+                <w:szCs w:val="16"/>
+              </w:rPr>
+              <w:t xml:space="preserve">81/65/78</w:t>
+            </w:r>
+          </w:p>
+        </w:tc>
+      </w:tr>
+      <w:tr>
+        <w:trPr>
+          <w:tblHeader w:val="false"/>
+        </w:trPr>
+        <w:tc>
+          <w:tcPr>
+            <w:tcW w:type="dxa" w:w="1339"/>
+            <w:tcBorders>
+              <w:top w:val="none" w:color="FFFFFF" w:sz="0"/>
+              <w:left w:val="none" w:color="FFFFFF" w:sz="0"/>
+              <w:bottom w:val="none" w:color="FFFFFF" w:sz="0"/>
+              <w:right w:val="none" w:color="FFFFFF" w:sz="0"/>
+            </w:tcBorders>
+            <w:tcMar>
+              <w:top w:type="dxa" w:w="40"/>
+              <w:left w:type="dxa" w:w="80"/>
+              <w:bottom w:type="dxa" w:w="40"/>
+              <w:right w:type="dxa" w:w="80"/>
+            </w:tcMar>
+          </w:tcPr>
+          <w:p>
+            <w:pPr>
+              <w:spacing w:line="276" w:lineRule="auto"/>
+            </w:pPr>
+            <w:r>
+              <w:rPr>
+                <w:rFonts w:ascii="Times New Roman" w:cs="Times New Roman" w:eastAsia="SimSun" w:hAnsi="Times New Roman"/>
+                <w:b w:val="false"/>
+                <w:bCs w:val="false"/>
+                <w:sz w:val="16"/>
+                <w:szCs w:val="16"/>
+              </w:rPr>
+              <w:t xml:space="preserve">AI C5</w:t>
+            </w:r>
+          </w:p>
+        </w:tc>
+        <w:tc>
+          <w:tcPr>
+            <w:tcW w:type="dxa" w:w="843"/>
+            <w:tcBorders>
+              <w:top w:val="none" w:color="FFFFFF" w:sz="0"/>
+              <w:left w:val="none" w:color="FFFFFF" w:sz="0"/>
+              <w:bottom w:val="none" w:color="FFFFFF" w:sz="0"/>
+              <w:right w:val="none" w:color="FFFFFF" w:sz="0"/>
+            </w:tcBorders>
+            <w:tcMar>
+              <w:top w:type="dxa" w:w="40"/>
+              <w:left w:type="dxa" w:w="80"/>
+              <w:bottom w:type="dxa" w:w="40"/>
+              <w:right w:type="dxa" w:w="80"/>
+            </w:tcMar>
+          </w:tcPr>
+          <w:p>
+            <w:pPr>
+              <w:spacing w:line="276" w:lineRule="auto"/>
+            </w:pPr>
+            <w:r>
+              <w:rPr>
+                <w:rFonts w:ascii="Times New Roman" w:cs="Times New Roman" w:eastAsia="SimSun" w:hAnsi="Times New Roman"/>
+                <w:b w:val="false"/>
+                <w:bCs w:val="false"/>
+                <w:sz w:val="16"/>
+                <w:szCs w:val="16"/>
+              </w:rPr>
+              <w:t xml:space="preserve">2.70</w:t>
+            </w:r>
+          </w:p>
+        </w:tc>
+        <w:tc>
+          <w:tcPr>
+            <w:tcW w:type="dxa" w:w="1240"/>
+            <w:tcBorders>
+              <w:top w:val="none" w:color="FFFFFF" w:sz="0"/>
+              <w:left w:val="none" w:color="FFFFFF" w:sz="0"/>
+              <w:bottom w:val="none" w:color="FFFFFF" w:sz="0"/>
+              <w:right w:val="none" w:color="FFFFFF" w:sz="0"/>
+            </w:tcBorders>
+            <w:tcMar>
+              <w:top w:type="dxa" w:w="40"/>
+              <w:left w:type="dxa" w:w="80"/>
+              <w:bottom w:type="dxa" w:w="40"/>
+              <w:right w:type="dxa" w:w="80"/>
+            </w:tcMar>
+          </w:tcPr>
+          <w:p>
+            <w:pPr>
+              <w:spacing w:line="276" w:lineRule="auto"/>
+            </w:pPr>
+            <w:r>
+              <w:rPr>
+                <w:rFonts w:ascii="Times New Roman" w:cs="Times New Roman" w:eastAsia="SimSun" w:hAnsi="Times New Roman"/>
+                <w:b w:val="false"/>
+                <w:bCs w:val="false"/>
+                <w:sz w:val="16"/>
+                <w:szCs w:val="16"/>
+              </w:rPr>
+              <w:t xml:space="preserve">13.42</w:t>
+            </w:r>
+          </w:p>
+        </w:tc>
+        <w:tc>
+          <w:tcPr>
+            <w:tcW w:type="dxa" w:w="843"/>
+            <w:tcBorders>
+              <w:top w:val="none" w:color="FFFFFF" w:sz="0"/>
+              <w:left w:val="none" w:color="FFFFFF" w:sz="0"/>
+              <w:bottom w:val="none" w:color="FFFFFF" w:sz="0"/>
+              <w:right w:val="none" w:color="FFFFFF" w:sz="0"/>
+            </w:tcBorders>
+            <w:tcMar>
+              <w:top w:type="dxa" w:w="40"/>
+              <w:left w:type="dxa" w:w="80"/>
+              <w:bottom w:type="dxa" w:w="40"/>
+              <w:right w:type="dxa" w:w="80"/>
+            </w:tcMar>
+          </w:tcPr>
+          <w:p>
+            <w:pPr>
+              <w:spacing w:line="276" w:lineRule="auto"/>
+            </w:pPr>
+            <w:r>
+              <w:rPr>
+                <w:rFonts w:ascii="Times New Roman" w:cs="Times New Roman" w:eastAsia="SimSun" w:hAnsi="Times New Roman"/>
+                <w:b w:val="false"/>
+                <w:bCs w:val="false"/>
+                <w:sz w:val="16"/>
+                <w:szCs w:val="16"/>
+              </w:rPr>
+              <w:t xml:space="preserve">0.25</w:t>
+            </w:r>
+          </w:p>
+        </w:tc>
+        <w:tc>
+          <w:tcPr>
+            <w:tcW w:type="dxa" w:w="1041"/>
+            <w:tcBorders>
+              <w:top w:val="none" w:color="FFFFFF" w:sz="0"/>
+              <w:left w:val="none" w:color="FFFFFF" w:sz="0"/>
+              <w:bottom w:val="none" w:color="FFFFFF" w:sz="0"/>
+              <w:right w:val="none" w:color="FFFFFF" w:sz="0"/>
+            </w:tcBorders>
+            <w:tcMar>
+              <w:top w:type="dxa" w:w="40"/>
+              <w:left w:type="dxa" w:w="80"/>
+              <w:bottom w:type="dxa" w:w="40"/>
+              <w:right w:type="dxa" w:w="80"/>
+            </w:tcMar>
+          </w:tcPr>
+          <w:p>
+            <w:pPr>
+              <w:spacing w:line="276" w:lineRule="auto"/>
+            </w:pPr>
+            <w:r>
+              <w:rPr>
+                <w:rFonts w:ascii="Times New Roman" w:cs="Times New Roman" w:eastAsia="SimSun" w:hAnsi="Times New Roman"/>
+                <w:b w:val="false"/>
+                <w:bCs w:val="false"/>
+                <w:sz w:val="16"/>
+                <w:szCs w:val="16"/>
+              </w:rPr>
+              <w:t xml:space="preserve">-19.58</w:t>
+            </w:r>
+          </w:p>
+        </w:tc>
+        <w:tc>
+          <w:tcPr>
+            <w:tcW w:type="dxa" w:w="843"/>
+            <w:tcBorders>
+              <w:top w:val="none" w:color="FFFFFF" w:sz="0"/>
+              <w:left w:val="none" w:color="FFFFFF" w:sz="0"/>
+              <w:bottom w:val="none" w:color="FFFFFF" w:sz="0"/>
+              <w:right w:val="none" w:color="FFFFFF" w:sz="0"/>
+            </w:tcBorders>
+            <w:tcMar>
+              <w:top w:type="dxa" w:w="40"/>
+              <w:left w:type="dxa" w:w="80"/>
+              <w:bottom w:type="dxa" w:w="40"/>
+              <w:right w:type="dxa" w:w="80"/>
+            </w:tcMar>
+          </w:tcPr>
+          <w:p>
+            <w:pPr>
+              <w:spacing w:line="276" w:lineRule="auto"/>
+            </w:pPr>
+            <w:r>
+              <w:rPr>
+                <w:rFonts w:ascii="Times New Roman" w:cs="Times New Roman" w:eastAsia="SimSun" w:hAnsi="Times New Roman"/>
+                <w:b w:val="false"/>
+                <w:bCs w:val="false"/>
+                <w:sz w:val="16"/>
+                <w:szCs w:val="16"/>
+              </w:rPr>
+              <w:t xml:space="preserve">0.21</w:t>
+            </w:r>
+          </w:p>
+        </w:tc>
+        <w:tc>
+          <w:tcPr>
+            <w:tcW w:type="dxa" w:w="843"/>
+            <w:tcBorders>
+              <w:top w:val="none" w:color="FFFFFF" w:sz="0"/>
+              <w:left w:val="none" w:color="FFFFFF" w:sz="0"/>
+              <w:bottom w:val="none" w:color="FFFFFF" w:sz="0"/>
+              <w:right w:val="none" w:color="FFFFFF" w:sz="0"/>
+            </w:tcBorders>
+            <w:tcMar>
+              <w:top w:type="dxa" w:w="40"/>
+              <w:left w:type="dxa" w:w="80"/>
+              <w:bottom w:type="dxa" w:w="40"/>
+              <w:right w:type="dxa" w:w="80"/>
+            </w:tcMar>
+          </w:tcPr>
+          <w:p>
+            <w:pPr>
+              <w:spacing w:line="276" w:lineRule="auto"/>
+            </w:pPr>
+            <w:r>
+              <w:rPr>
+                <w:rFonts w:ascii="Times New Roman" w:cs="Times New Roman" w:eastAsia="SimSun" w:hAnsi="Times New Roman"/>
+                <w:b w:val="false"/>
+                <w:bCs w:val="false"/>
+                <w:sz w:val="16"/>
+                <w:szCs w:val="16"/>
+              </w:rPr>
+              <w:t xml:space="preserve">-18.06</w:t>
+            </w:r>
+          </w:p>
+        </w:tc>
+        <w:tc>
+          <w:tcPr>
+            <w:tcW w:type="dxa" w:w="2034"/>
+            <w:tcBorders>
+              <w:top w:val="none" w:color="FFFFFF" w:sz="0"/>
+              <w:left w:val="none" w:color="FFFFFF" w:sz="0"/>
+              <w:bottom w:val="none" w:color="FFFFFF" w:sz="0"/>
+              <w:right w:val="none" w:color="FFFFFF" w:sz="0"/>
+            </w:tcBorders>
+            <w:tcMar>
+              <w:top w:type="dxa" w:w="40"/>
+              <w:left w:type="dxa" w:w="80"/>
+              <w:bottom w:type="dxa" w:w="40"/>
+              <w:right w:type="dxa" w:w="80"/>
+            </w:tcMar>
+          </w:tcPr>
+          <w:p>
+            <w:pPr>
+              <w:spacing w:line="276" w:lineRule="auto"/>
+            </w:pPr>
+            <w:r>
+              <w:rPr>
+                <w:rFonts w:ascii="Times New Roman" w:cs="Times New Roman" w:eastAsia="SimSun" w:hAnsi="Times New Roman"/>
+                <w:b w:val="false"/>
+                <w:bCs w:val="false"/>
+                <w:sz w:val="16"/>
+                <w:szCs w:val="16"/>
+              </w:rPr>
+              <w:t xml:space="preserve">74/53/76</w:t>
+            </w:r>
+          </w:p>
+        </w:tc>
+      </w:tr>
+      <w:tr>
+        <w:trPr>
+          <w:tblHeader w:val="false"/>
+        </w:trPr>
+        <w:tc>
+          <w:tcPr>
+            <w:tcW w:type="dxa" w:w="1339"/>
+            <w:tcBorders>
+              <w:top w:val="none" w:color="FFFFFF" w:sz="0"/>
+              <w:left w:val="none" w:color="FFFFFF" w:sz="0"/>
+              <w:bottom w:val="none" w:color="FFFFFF" w:sz="0"/>
+              <w:right w:val="none" w:color="FFFFFF" w:sz="0"/>
+            </w:tcBorders>
+            <w:tcMar>
+              <w:top w:type="dxa" w:w="40"/>
+              <w:left w:type="dxa" w:w="80"/>
+              <w:bottom w:type="dxa" w:w="40"/>
+              <w:right w:type="dxa" w:w="80"/>
+            </w:tcMar>
+          </w:tcPr>
+          <w:p>
+            <w:pPr>
+              <w:spacing w:line="276" w:lineRule="auto"/>
+            </w:pPr>
+            <w:r>
+              <w:rPr>
+                <w:rFonts w:ascii="Times New Roman" w:cs="Times New Roman" w:eastAsia="SimSun" w:hAnsi="Times New Roman"/>
+                <w:b w:val="false"/>
+                <w:bCs w:val="false"/>
+                <w:sz w:val="16"/>
+                <w:szCs w:val="16"/>
+              </w:rPr>
+              <w:t xml:space="preserve">60/40 mix</w:t>
+            </w:r>
+          </w:p>
+        </w:tc>
+        <w:tc>
+          <w:tcPr>
+            <w:tcW w:type="dxa" w:w="843"/>
+            <w:tcBorders>
+              <w:top w:val="none" w:color="FFFFFF" w:sz="0"/>
+              <w:left w:val="none" w:color="FFFFFF" w:sz="0"/>
+              <w:bottom w:val="none" w:color="FFFFFF" w:sz="0"/>
+              <w:right w:val="none" w:color="FFFFFF" w:sz="0"/>
+            </w:tcBorders>
+            <w:tcMar>
+              <w:top w:type="dxa" w:w="40"/>
+              <w:left w:type="dxa" w:w="80"/>
+              <w:bottom w:type="dxa" w:w="40"/>
+              <w:right w:type="dxa" w:w="80"/>
+            </w:tcMar>
+          </w:tcPr>
+          <w:p>
+            <w:pPr>
+              <w:spacing w:line="276" w:lineRule="auto"/>
+            </w:pPr>
+            <w:r>
+              <w:rPr>
+                <w:rFonts w:ascii="Times New Roman" w:cs="Times New Roman" w:eastAsia="SimSun" w:hAnsi="Times New Roman"/>
+                <w:b w:val="false"/>
+                <w:bCs w:val="false"/>
+                <w:sz w:val="16"/>
+                <w:szCs w:val="16"/>
+              </w:rPr>
+              <w:t xml:space="preserve">1.67</w:t>
+            </w:r>
+          </w:p>
+        </w:tc>
+        <w:tc>
+          <w:tcPr>
+            <w:tcW w:type="dxa" w:w="1240"/>
+            <w:tcBorders>
+              <w:top w:val="none" w:color="FFFFFF" w:sz="0"/>
+              <w:left w:val="none" w:color="FFFFFF" w:sz="0"/>
+              <w:bottom w:val="none" w:color="FFFFFF" w:sz="0"/>
+              <w:right w:val="none" w:color="FFFFFF" w:sz="0"/>
+            </w:tcBorders>
+            <w:tcMar>
+              <w:top w:type="dxa" w:w="40"/>
+              <w:left w:type="dxa" w:w="80"/>
+              <w:bottom w:type="dxa" w:w="40"/>
+              <w:right w:type="dxa" w:w="80"/>
+            </w:tcMar>
+          </w:tcPr>
+          <w:p>
+            <w:pPr>
+              <w:spacing w:line="276" w:lineRule="auto"/>
+            </w:pPr>
+            <w:r>
+              <w:rPr>
+                <w:rFonts w:ascii="Times New Roman" w:cs="Times New Roman" w:eastAsia="SimSun" w:hAnsi="Times New Roman"/>
+                <w:b w:val="false"/>
+                <w:bCs w:val="false"/>
+                <w:sz w:val="16"/>
+                <w:szCs w:val="16"/>
+              </w:rPr>
+              <w:t xml:space="preserve">10.38</w:t>
+            </w:r>
+          </w:p>
+        </w:tc>
+        <w:tc>
+          <w:tcPr>
+            <w:tcW w:type="dxa" w:w="843"/>
+            <w:tcBorders>
+              <w:top w:val="none" w:color="FFFFFF" w:sz="0"/>
+              <w:left w:val="none" w:color="FFFFFF" w:sz="0"/>
+              <w:bottom w:val="none" w:color="FFFFFF" w:sz="0"/>
+              <w:right w:val="none" w:color="FFFFFF" w:sz="0"/>
+            </w:tcBorders>
+            <w:tcMar>
+              <w:top w:type="dxa" w:w="40"/>
+              <w:left w:type="dxa" w:w="80"/>
+              <w:bottom w:type="dxa" w:w="40"/>
+              <w:right w:type="dxa" w:w="80"/>
+            </w:tcMar>
+          </w:tcPr>
+          <w:p>
+            <w:pPr>
+              <w:spacing w:line="276" w:lineRule="auto"/>
+            </w:pPr>
+            <w:r>
+              <w:rPr>
+                <w:rFonts w:ascii="Times New Roman" w:cs="Times New Roman" w:eastAsia="SimSun" w:hAnsi="Times New Roman"/>
+                <w:b w:val="false"/>
+                <w:bCs w:val="false"/>
+                <w:sz w:val="16"/>
+                <w:szCs w:val="16"/>
+              </w:rPr>
+              <w:t xml:space="preserve">0.07</w:t>
+            </w:r>
+          </w:p>
+        </w:tc>
+        <w:tc>
+          <w:tcPr>
+            <w:tcW w:type="dxa" w:w="1041"/>
+            <w:tcBorders>
+              <w:top w:val="none" w:color="FFFFFF" w:sz="0"/>
+              <w:left w:val="none" w:color="FFFFFF" w:sz="0"/>
+              <w:bottom w:val="none" w:color="FFFFFF" w:sz="0"/>
+              <w:right w:val="none" w:color="FFFFFF" w:sz="0"/>
+            </w:tcBorders>
+            <w:tcMar>
+              <w:top w:type="dxa" w:w="40"/>
+              <w:left w:type="dxa" w:w="80"/>
+              <w:bottom w:type="dxa" w:w="40"/>
+              <w:right w:type="dxa" w:w="80"/>
+            </w:tcMar>
+          </w:tcPr>
+          <w:p>
+            <w:pPr>
+              <w:spacing w:line="276" w:lineRule="auto"/>
+            </w:pPr>
+            <w:r>
+              <w:rPr>
+                <w:rFonts w:ascii="Times New Roman" w:cs="Times New Roman" w:eastAsia="SimSun" w:hAnsi="Times New Roman"/>
+                <w:b w:val="false"/>
+                <w:bCs w:val="false"/>
+                <w:sz w:val="16"/>
+                <w:szCs w:val="16"/>
+              </w:rPr>
+              <w:t xml:space="preserve">-16.71</w:t>
+            </w:r>
+          </w:p>
+        </w:tc>
+        <w:tc>
+          <w:tcPr>
+            <w:tcW w:type="dxa" w:w="843"/>
+            <w:tcBorders>
+              <w:top w:val="none" w:color="FFFFFF" w:sz="0"/>
+              <w:left w:val="none" w:color="FFFFFF" w:sz="0"/>
+              <w:bottom w:val="none" w:color="FFFFFF" w:sz="0"/>
+              <w:right w:val="none" w:color="FFFFFF" w:sz="0"/>
+            </w:tcBorders>
+            <w:tcMar>
+              <w:top w:type="dxa" w:w="40"/>
+              <w:left w:type="dxa" w:w="80"/>
+              <w:bottom w:type="dxa" w:w="40"/>
+              <w:right w:type="dxa" w:w="80"/>
+            </w:tcMar>
+          </w:tcPr>
+          <w:p>
+            <w:pPr>
+              <w:spacing w:line="276" w:lineRule="auto"/>
+            </w:pPr>
+            <w:r>
+              <w:rPr>
+                <w:rFonts w:ascii="Times New Roman" w:cs="Times New Roman" w:eastAsia="SimSun" w:hAnsi="Times New Roman"/>
+                <w:b w:val="false"/>
+                <w:bCs w:val="false"/>
+                <w:sz w:val="16"/>
+                <w:szCs w:val="16"/>
+              </w:rPr>
+              <w:t xml:space="preserve">0.10</w:t>
+            </w:r>
+          </w:p>
+        </w:tc>
+        <w:tc>
+          <w:tcPr>
+            <w:tcW w:type="dxa" w:w="843"/>
+            <w:tcBorders>
+              <w:top w:val="none" w:color="FFFFFF" w:sz="0"/>
+              <w:left w:val="none" w:color="FFFFFF" w:sz="0"/>
+              <w:bottom w:val="none" w:color="FFFFFF" w:sz="0"/>
+              <w:right w:val="none" w:color="FFFFFF" w:sz="0"/>
+            </w:tcBorders>
+            <w:tcMar>
+              <w:top w:type="dxa" w:w="40"/>
+              <w:left w:type="dxa" w:w="80"/>
+              <w:bottom w:type="dxa" w:w="40"/>
+              <w:right w:type="dxa" w:w="80"/>
+            </w:tcMar>
+          </w:tcPr>
+          <w:p>
+            <w:pPr>
+              <w:spacing w:line="276" w:lineRule="auto"/>
+            </w:pPr>
+            <w:r>
+              <w:rPr>
+                <w:rFonts w:ascii="Times New Roman" w:cs="Times New Roman" w:eastAsia="SimSun" w:hAnsi="Times New Roman"/>
+                <w:b w:val="false"/>
+                <w:bCs w:val="false"/>
+                <w:sz w:val="16"/>
+                <w:szCs w:val="16"/>
+              </w:rPr>
+              <w:t xml:space="preserve">-14.62</w:t>
+            </w:r>
+          </w:p>
+        </w:tc>
+        <w:tc>
+          <w:tcPr>
+            <w:tcW w:type="dxa" w:w="2034"/>
+            <w:tcBorders>
+              <w:top w:val="none" w:color="FFFFFF" w:sz="0"/>
+              <w:left w:val="none" w:color="FFFFFF" w:sz="0"/>
+              <w:bottom w:val="none" w:color="FFFFFF" w:sz="0"/>
+              <w:right w:val="none" w:color="FFFFFF" w:sz="0"/>
+            </w:tcBorders>
+            <w:tcMar>
+              <w:top w:type="dxa" w:w="40"/>
+              <w:left w:type="dxa" w:w="80"/>
+              <w:bottom w:type="dxa" w:w="40"/>
+              <w:right w:type="dxa" w:w="80"/>
+            </w:tcMar>
+          </w:tcPr>
+          <w:p>
+            <w:pPr>
+              <w:spacing w:line="276" w:lineRule="auto"/>
+            </w:pPr>
+            <w:r>
+              <w:rPr>
+                <w:rFonts w:ascii="Times New Roman" w:cs="Times New Roman" w:eastAsia="SimSun" w:hAnsi="Times New Roman"/>
+                <w:b w:val="false"/>
+                <w:bCs w:val="false"/>
+                <w:sz w:val="16"/>
+                <w:szCs w:val="16"/>
+              </w:rPr>
+              <w:t xml:space="preserve">-</w:t>
+            </w:r>
+          </w:p>
+        </w:tc>
+      </w:tr>
+      <w:tr>
+        <w:trPr>
+          <w:tblHeader w:val="false"/>
+        </w:trPr>
+        <w:tc>
+          <w:tcPr>
+            <w:tcW w:type="dxa" w:w="1339"/>
+            <w:tcBorders>
+              <w:top w:val="none" w:color="FFFFFF" w:sz="0"/>
+              <w:left w:val="none" w:color="FFFFFF" w:sz="0"/>
+              <w:bottom w:val="none" w:color="FFFFFF" w:sz="0"/>
+              <w:right w:val="none" w:color="FFFFFF" w:sz="0"/>
+            </w:tcBorders>
+            <w:tcMar>
+              <w:top w:type="dxa" w:w="40"/>
+              <w:left w:type="dxa" w:w="80"/>
+              <w:bottom w:type="dxa" w:w="40"/>
+              <w:right w:type="dxa" w:w="80"/>
+            </w:tcMar>
+          </w:tcPr>
+          <w:p>
+            <w:pPr>
+              <w:spacing w:line="276" w:lineRule="auto"/>
+            </w:pPr>
+            <w:r>
+              <w:rPr>
+                <w:rFonts w:ascii="Times New Roman" w:cs="Times New Roman" w:eastAsia="SimSun" w:hAnsi="Times New Roman"/>
+                <w:b w:val="false"/>
+                <w:bCs w:val="false"/>
+                <w:sz w:val="16"/>
+                <w:szCs w:val="16"/>
+              </w:rPr>
+              <w:t xml:space="preserve">Target-risk</w:t>
+            </w:r>
+          </w:p>
+        </w:tc>
+        <w:tc>
+          <w:tcPr>
+            <w:tcW w:type="dxa" w:w="843"/>
+            <w:tcBorders>
+              <w:top w:val="none" w:color="FFFFFF" w:sz="0"/>
+              <w:left w:val="none" w:color="FFFFFF" w:sz="0"/>
+              <w:bottom w:val="none" w:color="FFFFFF" w:sz="0"/>
+              <w:right w:val="none" w:color="FFFFFF" w:sz="0"/>
+            </w:tcBorders>
+            <w:tcMar>
+              <w:top w:type="dxa" w:w="40"/>
+              <w:left w:type="dxa" w:w="80"/>
+              <w:bottom w:type="dxa" w:w="40"/>
+              <w:right w:type="dxa" w:w="80"/>
+            </w:tcMar>
+          </w:tcPr>
+          <w:p>
+            <w:pPr>
+              <w:spacing w:line="276" w:lineRule="auto"/>
+            </w:pPr>
+            <w:r>
+              <w:rPr>
+                <w:rFonts w:ascii="Times New Roman" w:cs="Times New Roman" w:eastAsia="SimSun" w:hAnsi="Times New Roman"/>
+                <w:b w:val="false"/>
+                <w:bCs w:val="false"/>
+                <w:sz w:val="16"/>
+                <w:szCs w:val="16"/>
+              </w:rPr>
+              <w:t xml:space="preserve">3.22</w:t>
+            </w:r>
+          </w:p>
+        </w:tc>
+        <w:tc>
+          <w:tcPr>
+            <w:tcW w:type="dxa" w:w="1240"/>
+            <w:tcBorders>
+              <w:top w:val="none" w:color="FFFFFF" w:sz="0"/>
+              <w:left w:val="none" w:color="FFFFFF" w:sz="0"/>
+              <w:bottom w:val="none" w:color="FFFFFF" w:sz="0"/>
+              <w:right w:val="none" w:color="FFFFFF" w:sz="0"/>
+            </w:tcBorders>
+            <w:tcMar>
+              <w:top w:type="dxa" w:w="40"/>
+              <w:left w:type="dxa" w:w="80"/>
+              <w:bottom w:type="dxa" w:w="40"/>
+              <w:right w:type="dxa" w:w="80"/>
+            </w:tcMar>
+          </w:tcPr>
+          <w:p>
+            <w:pPr>
+              <w:spacing w:line="276" w:lineRule="auto"/>
+            </w:pPr>
+            <w:r>
+              <w:rPr>
+                <w:rFonts w:ascii="Times New Roman" w:cs="Times New Roman" w:eastAsia="SimSun" w:hAnsi="Times New Roman"/>
+                <w:b w:val="false"/>
+                <w:bCs w:val="false"/>
+                <w:sz w:val="16"/>
+                <w:szCs w:val="16"/>
+              </w:rPr>
+              <w:t xml:space="preserve">9.48</w:t>
+            </w:r>
+          </w:p>
+        </w:tc>
+        <w:tc>
+          <w:tcPr>
+            <w:tcW w:type="dxa" w:w="843"/>
+            <w:tcBorders>
+              <w:top w:val="none" w:color="FFFFFF" w:sz="0"/>
+              <w:left w:val="none" w:color="FFFFFF" w:sz="0"/>
+              <w:bottom w:val="none" w:color="FFFFFF" w:sz="0"/>
+              <w:right w:val="none" w:color="FFFFFF" w:sz="0"/>
+            </w:tcBorders>
+            <w:tcMar>
+              <w:top w:type="dxa" w:w="40"/>
+              <w:left w:type="dxa" w:w="80"/>
+              <w:bottom w:type="dxa" w:w="40"/>
+              <w:right w:type="dxa" w:w="80"/>
+            </w:tcMar>
+          </w:tcPr>
+          <w:p>
+            <w:pPr>
+              <w:spacing w:line="276" w:lineRule="auto"/>
+            </w:pPr>
+            <w:r>
+              <w:rPr>
+                <w:rFonts w:ascii="Times New Roman" w:cs="Times New Roman" w:eastAsia="SimSun" w:hAnsi="Times New Roman"/>
+                <w:b w:val="false"/>
+                <w:bCs w:val="false"/>
+                <w:sz w:val="16"/>
+                <w:szCs w:val="16"/>
+              </w:rPr>
+              <w:t xml:space="preserve">0.22</w:t>
+            </w:r>
+          </w:p>
+        </w:tc>
+        <w:tc>
+          <w:tcPr>
+            <w:tcW w:type="dxa" w:w="1041"/>
+            <w:tcBorders>
+              <w:top w:val="none" w:color="FFFFFF" w:sz="0"/>
+              <w:left w:val="none" w:color="FFFFFF" w:sz="0"/>
+              <w:bottom w:val="none" w:color="FFFFFF" w:sz="0"/>
+              <w:right w:val="none" w:color="FFFFFF" w:sz="0"/>
+            </w:tcBorders>
+            <w:tcMar>
+              <w:top w:type="dxa" w:w="40"/>
+              <w:left w:type="dxa" w:w="80"/>
+              <w:bottom w:type="dxa" w:w="40"/>
+              <w:right w:type="dxa" w:w="80"/>
+            </w:tcMar>
+          </w:tcPr>
+          <w:p>
+            <w:pPr>
+              <w:spacing w:line="276" w:lineRule="auto"/>
+            </w:pPr>
+            <w:r>
+              <w:rPr>
+                <w:rFonts w:ascii="Times New Roman" w:cs="Times New Roman" w:eastAsia="SimSun" w:hAnsi="Times New Roman"/>
+                <w:b w:val="false"/>
+                <w:bCs w:val="false"/>
+                <w:sz w:val="16"/>
+                <w:szCs w:val="16"/>
+              </w:rPr>
+              <w:t xml:space="preserve">-15.21</w:t>
+            </w:r>
+          </w:p>
+        </w:tc>
+        <w:tc>
+          <w:tcPr>
+            <w:tcW w:type="dxa" w:w="843"/>
+            <w:tcBorders>
+              <w:top w:val="none" w:color="FFFFFF" w:sz="0"/>
+              <w:left w:val="none" w:color="FFFFFF" w:sz="0"/>
+              <w:bottom w:val="none" w:color="FFFFFF" w:sz="0"/>
+              <w:right w:val="none" w:color="FFFFFF" w:sz="0"/>
+            </w:tcBorders>
+            <w:tcMar>
+              <w:top w:type="dxa" w:w="40"/>
+              <w:left w:type="dxa" w:w="80"/>
+              <w:bottom w:type="dxa" w:w="40"/>
+              <w:right w:type="dxa" w:w="80"/>
+            </w:tcMar>
+          </w:tcPr>
+          <w:p>
+            <w:pPr>
+              <w:spacing w:line="276" w:lineRule="auto"/>
+            </w:pPr>
+            <w:r>
+              <w:rPr>
+                <w:rFonts w:ascii="Times New Roman" w:cs="Times New Roman" w:eastAsia="SimSun" w:hAnsi="Times New Roman"/>
+                <w:b w:val="false"/>
+                <w:bCs w:val="false"/>
+                <w:sz w:val="16"/>
+                <w:szCs w:val="16"/>
+              </w:rPr>
+              <w:t xml:space="preserve">0.21</w:t>
+            </w:r>
+          </w:p>
+        </w:tc>
+        <w:tc>
+          <w:tcPr>
+            <w:tcW w:type="dxa" w:w="843"/>
+            <w:tcBorders>
+              <w:top w:val="none" w:color="FFFFFF" w:sz="0"/>
+              <w:left w:val="none" w:color="FFFFFF" w:sz="0"/>
+              <w:bottom w:val="none" w:color="FFFFFF" w:sz="0"/>
+              <w:right w:val="none" w:color="FFFFFF" w:sz="0"/>
+            </w:tcBorders>
+            <w:tcMar>
+              <w:top w:type="dxa" w:w="40"/>
+              <w:left w:type="dxa" w:w="80"/>
+              <w:bottom w:type="dxa" w:w="40"/>
+              <w:right w:type="dxa" w:w="80"/>
+            </w:tcMar>
+          </w:tcPr>
+          <w:p>
+            <w:pPr>
+              <w:spacing w:line="276" w:lineRule="auto"/>
+            </w:pPr>
+            <w:r>
+              <w:rPr>
+                <w:rFonts w:ascii="Times New Roman" w:cs="Times New Roman" w:eastAsia="SimSun" w:hAnsi="Times New Roman"/>
+                <w:b w:val="false"/>
+                <w:bCs w:val="false"/>
+                <w:sz w:val="16"/>
+                <w:szCs w:val="16"/>
+              </w:rPr>
+              <w:t xml:space="preserve">-10.58</w:t>
+            </w:r>
+          </w:p>
+        </w:tc>
+        <w:tc>
+          <w:tcPr>
+            <w:tcW w:type="dxa" w:w="2034"/>
+            <w:tcBorders>
+              <w:top w:val="none" w:color="FFFFFF" w:sz="0"/>
+              <w:left w:val="none" w:color="FFFFFF" w:sz="0"/>
+              <w:bottom w:val="none" w:color="FFFFFF" w:sz="0"/>
+              <w:right w:val="none" w:color="FFFFFF" w:sz="0"/>
+            </w:tcBorders>
+            <w:tcMar>
+              <w:top w:type="dxa" w:w="40"/>
+              <w:left w:type="dxa" w:w="80"/>
+              <w:bottom w:type="dxa" w:w="40"/>
+              <w:right w:type="dxa" w:w="80"/>
+            </w:tcMar>
+          </w:tcPr>
+          <w:p>
+            <w:pPr>
+              <w:spacing w:line="276" w:lineRule="auto"/>
+            </w:pPr>
+            <w:r>
+              <w:rPr>
+                <w:rFonts w:ascii="Times New Roman" w:cs="Times New Roman" w:eastAsia="SimSun" w:hAnsi="Times New Roman"/>
+                <w:b w:val="false"/>
+                <w:bCs w:val="false"/>
+                <w:sz w:val="16"/>
+                <w:szCs w:val="16"/>
+              </w:rPr>
+              <w:t xml:space="preserve">-</w:t>
+            </w:r>
+          </w:p>
+        </w:tc>
+      </w:tr>
+      <w:tr>
+        <w:trPr>
+          <w:tblHeader w:val="false"/>
+        </w:trPr>
+        <w:tc>
+          <w:tcPr>
+            <w:tcW w:type="dxa" w:w="1339"/>
+            <w:tcBorders>
+              <w:top w:val="none" w:color="FFFFFF" w:sz="0"/>
+              <w:left w:val="none" w:color="FFFFFF" w:sz="0"/>
+              <w:bottom w:val="none" w:color="FFFFFF" w:sz="0"/>
+              <w:right w:val="none" w:color="FFFFFF" w:sz="0"/>
+            </w:tcBorders>
+            <w:tcMar>
+              <w:top w:type="dxa" w:w="40"/>
+              <w:left w:type="dxa" w:w="80"/>
+              <w:bottom w:type="dxa" w:w="40"/>
+              <w:right w:type="dxa" w:w="80"/>
+            </w:tcMar>
+          </w:tcPr>
+          <w:p>
+            <w:pPr>
+              <w:spacing w:line="276" w:lineRule="auto"/>
+            </w:pPr>
+            <w:r>
+              <w:rPr>
+                <w:rFonts w:ascii="Times New Roman" w:cs="Times New Roman" w:eastAsia="SimSun" w:hAnsi="Times New Roman"/>
+                <w:b w:val="false"/>
+                <w:bCs w:val="false"/>
+                <w:sz w:val="16"/>
+                <w:szCs w:val="16"/>
+              </w:rPr>
+              <w:t xml:space="preserve">Model C2</w:t>
+            </w:r>
+          </w:p>
+        </w:tc>
+        <w:tc>
+          <w:tcPr>
+            <w:tcW w:type="dxa" w:w="843"/>
+            <w:tcBorders>
+              <w:top w:val="none" w:color="FFFFFF" w:sz="0"/>
+              <w:left w:val="none" w:color="FFFFFF" w:sz="0"/>
+              <w:bottom w:val="none" w:color="FFFFFF" w:sz="0"/>
+              <w:right w:val="none" w:color="FFFFFF" w:sz="0"/>
+            </w:tcBorders>
+            <w:tcMar>
+              <w:top w:type="dxa" w:w="40"/>
+              <w:left w:type="dxa" w:w="80"/>
+              <w:bottom w:type="dxa" w:w="40"/>
+              <w:right w:type="dxa" w:w="80"/>
+            </w:tcMar>
+          </w:tcPr>
+          <w:p>
+            <w:pPr>
+              <w:spacing w:line="276" w:lineRule="auto"/>
+            </w:pPr>
+            <w:r>
+              <w:rPr>
+                <w:rFonts w:ascii="Times New Roman" w:cs="Times New Roman" w:eastAsia="SimSun" w:hAnsi="Times New Roman"/>
+                <w:b w:val="false"/>
+                <w:bCs w:val="false"/>
+                <w:sz w:val="16"/>
+                <w:szCs w:val="16"/>
+              </w:rPr>
+              <w:t xml:space="preserve">2.53</w:t>
+            </w:r>
+          </w:p>
+        </w:tc>
+        <w:tc>
+          <w:tcPr>
+            <w:tcW w:type="dxa" w:w="1240"/>
+            <w:tcBorders>
+              <w:top w:val="none" w:color="FFFFFF" w:sz="0"/>
+              <w:left w:val="none" w:color="FFFFFF" w:sz="0"/>
+              <w:bottom w:val="none" w:color="FFFFFF" w:sz="0"/>
+              <w:right w:val="none" w:color="FFFFFF" w:sz="0"/>
+            </w:tcBorders>
+            <w:tcMar>
+              <w:top w:type="dxa" w:w="40"/>
+              <w:left w:type="dxa" w:w="80"/>
+              <w:bottom w:type="dxa" w:w="40"/>
+              <w:right w:type="dxa" w:w="80"/>
+            </w:tcMar>
+          </w:tcPr>
+          <w:p>
+            <w:pPr>
+              <w:spacing w:line="276" w:lineRule="auto"/>
+            </w:pPr>
+            <w:r>
+              <w:rPr>
+                <w:rFonts w:ascii="Times New Roman" w:cs="Times New Roman" w:eastAsia="SimSun" w:hAnsi="Times New Roman"/>
+                <w:b w:val="false"/>
+                <w:bCs w:val="false"/>
+                <w:sz w:val="16"/>
+                <w:szCs w:val="16"/>
+              </w:rPr>
+              <w:t xml:space="preserve">0.55</w:t>
+            </w:r>
+          </w:p>
+        </w:tc>
+        <w:tc>
+          <w:tcPr>
+            <w:tcW w:type="dxa" w:w="843"/>
+            <w:tcBorders>
+              <w:top w:val="none" w:color="FFFFFF" w:sz="0"/>
+              <w:left w:val="none" w:color="FFFFFF" w:sz="0"/>
+              <w:bottom w:val="none" w:color="FFFFFF" w:sz="0"/>
+              <w:right w:val="none" w:color="FFFFFF" w:sz="0"/>
+            </w:tcBorders>
+            <w:tcMar>
+              <w:top w:type="dxa" w:w="40"/>
+              <w:left w:type="dxa" w:w="80"/>
+              <w:bottom w:type="dxa" w:w="40"/>
+              <w:right w:type="dxa" w:w="80"/>
+            </w:tcMar>
+          </w:tcPr>
+          <w:p>
+            <w:pPr>
+              <w:spacing w:line="276" w:lineRule="auto"/>
+            </w:pPr>
+            <w:r>
+              <w:rPr>
+                <w:rFonts w:ascii="Times New Roman" w:cs="Times New Roman" w:eastAsia="SimSun" w:hAnsi="Times New Roman"/>
+                <w:b w:val="false"/>
+                <w:bCs w:val="false"/>
+                <w:sz w:val="16"/>
+                <w:szCs w:val="16"/>
+              </w:rPr>
+              <w:t xml:space="preserve">1.93</w:t>
+            </w:r>
+          </w:p>
+        </w:tc>
+        <w:tc>
+          <w:tcPr>
+            <w:tcW w:type="dxa" w:w="1041"/>
+            <w:tcBorders>
+              <w:top w:val="none" w:color="FFFFFF" w:sz="0"/>
+              <w:left w:val="none" w:color="FFFFFF" w:sz="0"/>
+              <w:bottom w:val="none" w:color="FFFFFF" w:sz="0"/>
+              <w:right w:val="none" w:color="FFFFFF" w:sz="0"/>
+            </w:tcBorders>
+            <w:tcMar>
+              <w:top w:type="dxa" w:w="40"/>
+              <w:left w:type="dxa" w:w="80"/>
+              <w:bottom w:type="dxa" w:w="40"/>
+              <w:right w:type="dxa" w:w="80"/>
+            </w:tcMar>
+          </w:tcPr>
+          <w:p>
+            <w:pPr>
+              <w:spacing w:line="276" w:lineRule="auto"/>
+            </w:pPr>
+            <w:r>
+              <w:rPr>
+                <w:rFonts w:ascii="Times New Roman" w:cs="Times New Roman" w:eastAsia="SimSun" w:hAnsi="Times New Roman"/>
+                <w:b w:val="false"/>
+                <w:bCs w:val="false"/>
+                <w:sz w:val="16"/>
+                <w:szCs w:val="16"/>
+              </w:rPr>
+              <w:t xml:space="preserve">-0.23</w:t>
+            </w:r>
+          </w:p>
+        </w:tc>
+        <w:tc>
+          <w:tcPr>
+            <w:tcW w:type="dxa" w:w="843"/>
+            <w:tcBorders>
+              <w:top w:val="none" w:color="FFFFFF" w:sz="0"/>
+              <w:left w:val="none" w:color="FFFFFF" w:sz="0"/>
+              <w:bottom w:val="none" w:color="FFFFFF" w:sz="0"/>
+              <w:right w:val="none" w:color="FFFFFF" w:sz="0"/>
+            </w:tcBorders>
+            <w:tcMar>
+              <w:top w:type="dxa" w:w="40"/>
+              <w:left w:type="dxa" w:w="80"/>
+              <w:bottom w:type="dxa" w:w="40"/>
+              <w:right w:type="dxa" w:w="80"/>
+            </w:tcMar>
+          </w:tcPr>
+          <w:p>
+            <w:pPr>
+              <w:spacing w:line="276" w:lineRule="auto"/>
+            </w:pPr>
+            <w:r>
+              <w:rPr>
+                <w:rFonts w:ascii="Times New Roman" w:cs="Times New Roman" w:eastAsia="SimSun" w:hAnsi="Times New Roman"/>
+                <w:b w:val="false"/>
+                <w:bCs w:val="false"/>
+                <w:sz w:val="16"/>
+                <w:szCs w:val="16"/>
+              </w:rPr>
+              <w:t xml:space="preserve">n.m.</w:t>
+            </w:r>
+          </w:p>
+        </w:tc>
+        <w:tc>
+          <w:tcPr>
+            <w:tcW w:type="dxa" w:w="843"/>
+            <w:tcBorders>
+              <w:top w:val="none" w:color="FFFFFF" w:sz="0"/>
+              <w:left w:val="none" w:color="FFFFFF" w:sz="0"/>
+              <w:bottom w:val="none" w:color="FFFFFF" w:sz="0"/>
+              <w:right w:val="none" w:color="FFFFFF" w:sz="0"/>
+            </w:tcBorders>
+            <w:tcMar>
+              <w:top w:type="dxa" w:w="40"/>
+              <w:left w:type="dxa" w:w="80"/>
+              <w:bottom w:type="dxa" w:w="40"/>
+              <w:right w:type="dxa" w:w="80"/>
+            </w:tcMar>
+          </w:tcPr>
+          <w:p>
+            <w:pPr>
+              <w:spacing w:line="276" w:lineRule="auto"/>
+            </w:pPr>
+            <w:r>
+              <w:rPr>
+                <w:rFonts w:ascii="Times New Roman" w:cs="Times New Roman" w:eastAsia="SimSun" w:hAnsi="Times New Roman"/>
+                <w:b w:val="false"/>
+                <w:bCs w:val="false"/>
+                <w:sz w:val="16"/>
+                <w:szCs w:val="16"/>
+              </w:rPr>
+              <w:t xml:space="preserve">1.37</w:t>
+            </w:r>
+          </w:p>
+        </w:tc>
+        <w:tc>
+          <w:tcPr>
+            <w:tcW w:type="dxa" w:w="2034"/>
+            <w:tcBorders>
+              <w:top w:val="none" w:color="FFFFFF" w:sz="0"/>
+              <w:left w:val="none" w:color="FFFFFF" w:sz="0"/>
+              <w:bottom w:val="none" w:color="FFFFFF" w:sz="0"/>
+              <w:right w:val="none" w:color="FFFFFF" w:sz="0"/>
+            </w:tcBorders>
+            <w:tcMar>
+              <w:top w:type="dxa" w:w="40"/>
+              <w:left w:type="dxa" w:w="80"/>
+              <w:bottom w:type="dxa" w:w="40"/>
+              <w:right w:type="dxa" w:w="80"/>
+            </w:tcMar>
+          </w:tcPr>
+          <w:p>
+            <w:pPr>
+              <w:spacing w:line="276" w:lineRule="auto"/>
+            </w:pPr>
+            <w:r>
+              <w:rPr>
+                <w:rFonts w:ascii="Times New Roman" w:cs="Times New Roman" w:eastAsia="SimSun" w:hAnsi="Times New Roman"/>
+                <w:b w:val="false"/>
+                <w:bCs w:val="false"/>
+                <w:sz w:val="16"/>
+                <w:szCs w:val="16"/>
+              </w:rPr>
+              <w:t xml:space="preserve">-</w:t>
+            </w:r>
+          </w:p>
+        </w:tc>
+      </w:tr>
+      <w:tr>
+        <w:trPr>
+          <w:tblHeader w:val="false"/>
+        </w:trPr>
+        <w:tc>
+          <w:tcPr>
+            <w:tcW w:type="dxa" w:w="1339"/>
+            <w:tcBorders>
+              <w:top w:val="none" w:color="FFFFFF" w:sz="0"/>
+              <w:left w:val="none" w:color="FFFFFF" w:sz="0"/>
+              <w:bottom w:val="none" w:color="FFFFFF" w:sz="0"/>
+              <w:right w:val="none" w:color="FFFFFF" w:sz="0"/>
+            </w:tcBorders>
+            <w:tcMar>
+              <w:top w:type="dxa" w:w="40"/>
+              <w:left w:type="dxa" w:w="80"/>
+              <w:bottom w:type="dxa" w:w="40"/>
+              <w:right w:type="dxa" w:w="80"/>
+            </w:tcMar>
+          </w:tcPr>
+          <w:p>
+            <w:pPr>
+              <w:spacing w:line="276" w:lineRule="auto"/>
+            </w:pPr>
+            <w:r>
+              <w:rPr>
+                <w:rFonts w:ascii="Times New Roman" w:cs="Times New Roman" w:eastAsia="SimSun" w:hAnsi="Times New Roman"/>
+                <w:b w:val="false"/>
+                <w:bCs w:val="false"/>
+                <w:sz w:val="16"/>
+                <w:szCs w:val="16"/>
+              </w:rPr>
+              <w:t xml:space="preserve">Model C3</w:t>
+            </w:r>
+          </w:p>
+        </w:tc>
+        <w:tc>
+          <w:tcPr>
+            <w:tcW w:type="dxa" w:w="843"/>
+            <w:tcBorders>
+              <w:top w:val="none" w:color="FFFFFF" w:sz="0"/>
+              <w:left w:val="none" w:color="FFFFFF" w:sz="0"/>
+              <w:bottom w:val="none" w:color="FFFFFF" w:sz="0"/>
+              <w:right w:val="none" w:color="FFFFFF" w:sz="0"/>
+            </w:tcBorders>
+            <w:tcMar>
+              <w:top w:type="dxa" w:w="40"/>
+              <w:left w:type="dxa" w:w="80"/>
+              <w:bottom w:type="dxa" w:w="40"/>
+              <w:right w:type="dxa" w:w="80"/>
+            </w:tcMar>
+          </w:tcPr>
+          <w:p>
+            <w:pPr>
+              <w:spacing w:line="276" w:lineRule="auto"/>
+            </w:pPr>
+            <w:r>
+              <w:rPr>
+                <w:rFonts w:ascii="Times New Roman" w:cs="Times New Roman" w:eastAsia="SimSun" w:hAnsi="Times New Roman"/>
+                <w:b w:val="false"/>
+                <w:bCs w:val="false"/>
+                <w:sz w:val="16"/>
+                <w:szCs w:val="16"/>
+              </w:rPr>
+              <w:t xml:space="preserve">3.25</w:t>
+            </w:r>
+          </w:p>
+        </w:tc>
+        <w:tc>
+          <w:tcPr>
+            <w:tcW w:type="dxa" w:w="1240"/>
+            <w:tcBorders>
+              <w:top w:val="none" w:color="FFFFFF" w:sz="0"/>
+              <w:left w:val="none" w:color="FFFFFF" w:sz="0"/>
+              <w:bottom w:val="none" w:color="FFFFFF" w:sz="0"/>
+              <w:right w:val="none" w:color="FFFFFF" w:sz="0"/>
+            </w:tcBorders>
+            <w:tcMar>
+              <w:top w:type="dxa" w:w="40"/>
+              <w:left w:type="dxa" w:w="80"/>
+              <w:bottom w:type="dxa" w:w="40"/>
+              <w:right w:type="dxa" w:w="80"/>
+            </w:tcMar>
+          </w:tcPr>
+          <w:p>
+            <w:pPr>
+              <w:spacing w:line="276" w:lineRule="auto"/>
+            </w:pPr>
+            <w:r>
+              <w:rPr>
+                <w:rFonts w:ascii="Times New Roman" w:cs="Times New Roman" w:eastAsia="SimSun" w:hAnsi="Times New Roman"/>
+                <w:b w:val="false"/>
+                <w:bCs w:val="false"/>
+                <w:sz w:val="16"/>
+                <w:szCs w:val="16"/>
+              </w:rPr>
+              <w:t xml:space="preserve">1.47</w:t>
+            </w:r>
+          </w:p>
+        </w:tc>
+        <w:tc>
+          <w:tcPr>
+            <w:tcW w:type="dxa" w:w="843"/>
+            <w:tcBorders>
+              <w:top w:val="none" w:color="FFFFFF" w:sz="0"/>
+              <w:left w:val="none" w:color="FFFFFF" w:sz="0"/>
+              <w:bottom w:val="none" w:color="FFFFFF" w:sz="0"/>
+              <w:right w:val="none" w:color="FFFFFF" w:sz="0"/>
+            </w:tcBorders>
+            <w:tcMar>
+              <w:top w:type="dxa" w:w="40"/>
+              <w:left w:type="dxa" w:w="80"/>
+              <w:bottom w:type="dxa" w:w="40"/>
+              <w:right w:type="dxa" w:w="80"/>
+            </w:tcMar>
+          </w:tcPr>
+          <w:p>
+            <w:pPr>
+              <w:spacing w:line="276" w:lineRule="auto"/>
+            </w:pPr>
+            <w:r>
+              <w:rPr>
+                <w:rFonts w:ascii="Times New Roman" w:cs="Times New Roman" w:eastAsia="SimSun" w:hAnsi="Times New Roman"/>
+                <w:b w:val="false"/>
+                <w:bCs w:val="false"/>
+                <w:sz w:val="16"/>
+                <w:szCs w:val="16"/>
+              </w:rPr>
+              <w:t xml:space="preserve">1.20</w:t>
+            </w:r>
+          </w:p>
+        </w:tc>
+        <w:tc>
+          <w:tcPr>
+            <w:tcW w:type="dxa" w:w="1041"/>
+            <w:tcBorders>
+              <w:top w:val="none" w:color="FFFFFF" w:sz="0"/>
+              <w:left w:val="none" w:color="FFFFFF" w:sz="0"/>
+              <w:bottom w:val="none" w:color="FFFFFF" w:sz="0"/>
+              <w:right w:val="none" w:color="FFFFFF" w:sz="0"/>
+            </w:tcBorders>
+            <w:tcMar>
+              <w:top w:type="dxa" w:w="40"/>
+              <w:left w:type="dxa" w:w="80"/>
+              <w:bottom w:type="dxa" w:w="40"/>
+              <w:right w:type="dxa" w:w="80"/>
+            </w:tcMar>
+          </w:tcPr>
+          <w:p>
+            <w:pPr>
+              <w:spacing w:line="276" w:lineRule="auto"/>
+            </w:pPr>
+            <w:r>
+              <w:rPr>
+                <w:rFonts w:ascii="Times New Roman" w:cs="Times New Roman" w:eastAsia="SimSun" w:hAnsi="Times New Roman"/>
+                <w:b w:val="false"/>
+                <w:bCs w:val="false"/>
+                <w:sz w:val="16"/>
+                <w:szCs w:val="16"/>
+              </w:rPr>
+              <w:t xml:space="preserve">-0.92</w:t>
+            </w:r>
+          </w:p>
+        </w:tc>
+        <w:tc>
+          <w:tcPr>
+            <w:tcW w:type="dxa" w:w="843"/>
+            <w:tcBorders>
+              <w:top w:val="none" w:color="FFFFFF" w:sz="0"/>
+              <w:left w:val="none" w:color="FFFFFF" w:sz="0"/>
+              <w:bottom w:val="none" w:color="FFFFFF" w:sz="0"/>
+              <w:right w:val="none" w:color="FFFFFF" w:sz="0"/>
+            </w:tcBorders>
+            <w:tcMar>
+              <w:top w:type="dxa" w:w="40"/>
+              <w:left w:type="dxa" w:w="80"/>
+              <w:bottom w:type="dxa" w:w="40"/>
+              <w:right w:type="dxa" w:w="80"/>
+            </w:tcMar>
+          </w:tcPr>
+          <w:p>
+            <w:pPr>
+              <w:spacing w:line="276" w:lineRule="auto"/>
+            </w:pPr>
+            <w:r>
+              <w:rPr>
+                <w:rFonts w:ascii="Times New Roman" w:cs="Times New Roman" w:eastAsia="SimSun" w:hAnsi="Times New Roman"/>
+                <w:b w:val="false"/>
+                <w:bCs w:val="false"/>
+                <w:sz w:val="16"/>
+                <w:szCs w:val="16"/>
+              </w:rPr>
+              <w:t xml:space="preserve">3.53</w:t>
+            </w:r>
+          </w:p>
+        </w:tc>
+        <w:tc>
+          <w:tcPr>
+            <w:tcW w:type="dxa" w:w="843"/>
+            <w:tcBorders>
+              <w:top w:val="none" w:color="FFFFFF" w:sz="0"/>
+              <w:left w:val="none" w:color="FFFFFF" w:sz="0"/>
+              <w:bottom w:val="none" w:color="FFFFFF" w:sz="0"/>
+              <w:right w:val="none" w:color="FFFFFF" w:sz="0"/>
+            </w:tcBorders>
+            <w:tcMar>
+              <w:top w:type="dxa" w:w="40"/>
+              <w:left w:type="dxa" w:w="80"/>
+              <w:bottom w:type="dxa" w:w="40"/>
+              <w:right w:type="dxa" w:w="80"/>
+            </w:tcMar>
+          </w:tcPr>
+          <w:p>
+            <w:pPr>
+              <w:spacing w:line="276" w:lineRule="auto"/>
+            </w:pPr>
+            <w:r>
+              <w:rPr>
+                <w:rFonts w:ascii="Times New Roman" w:cs="Times New Roman" w:eastAsia="SimSun" w:hAnsi="Times New Roman"/>
+                <w:b w:val="false"/>
+                <w:bCs w:val="false"/>
+                <w:sz w:val="16"/>
+                <w:szCs w:val="16"/>
+              </w:rPr>
+              <w:t xml:space="preserve">1.99</w:t>
+            </w:r>
+          </w:p>
+        </w:tc>
+        <w:tc>
+          <w:tcPr>
+            <w:tcW w:type="dxa" w:w="2034"/>
+            <w:tcBorders>
+              <w:top w:val="none" w:color="FFFFFF" w:sz="0"/>
+              <w:left w:val="none" w:color="FFFFFF" w:sz="0"/>
+              <w:bottom w:val="none" w:color="FFFFFF" w:sz="0"/>
+              <w:right w:val="none" w:color="FFFFFF" w:sz="0"/>
+            </w:tcBorders>
+            <w:tcMar>
+              <w:top w:type="dxa" w:w="40"/>
+              <w:left w:type="dxa" w:w="80"/>
+              <w:bottom w:type="dxa" w:w="40"/>
+              <w:right w:type="dxa" w:w="80"/>
+            </w:tcMar>
+          </w:tcPr>
+          <w:p>
+            <w:pPr>
+              <w:spacing w:line="276" w:lineRule="auto"/>
+            </w:pPr>
+            <w:r>
+              <w:rPr>
+                <w:rFonts w:ascii="Times New Roman" w:cs="Times New Roman" w:eastAsia="SimSun" w:hAnsi="Times New Roman"/>
+                <w:b w:val="false"/>
+                <w:bCs w:val="false"/>
+                <w:sz w:val="16"/>
+                <w:szCs w:val="16"/>
+              </w:rPr>
+              <w:t xml:space="preserve">-</w:t>
+            </w:r>
+          </w:p>
+        </w:tc>
+      </w:tr>
+      <w:tr>
+        <w:trPr>
+          <w:tblHeader w:val="false"/>
+        </w:trPr>
+        <w:tc>
+          <w:tcPr>
+            <w:tcW w:type="dxa" w:w="1339"/>
+            <w:tcBorders>
+              <w:top w:val="none" w:color="FFFFFF" w:sz="0"/>
+              <w:left w:val="none" w:color="FFFFFF" w:sz="0"/>
+              <w:bottom w:val="none" w:color="FFFFFF" w:sz="0"/>
+              <w:right w:val="none" w:color="FFFFFF" w:sz="0"/>
+            </w:tcBorders>
+            <w:tcMar>
+              <w:top w:type="dxa" w:w="40"/>
+              <w:left w:type="dxa" w:w="80"/>
+              <w:bottom w:type="dxa" w:w="40"/>
+              <w:right w:type="dxa" w:w="80"/>
+            </w:tcMar>
+          </w:tcPr>
+          <w:p>
+            <w:pPr>
+              <w:spacing w:line="276" w:lineRule="auto"/>
+            </w:pPr>
+            <w:r>
+              <w:rPr>
+                <w:rFonts w:ascii="Times New Roman" w:cs="Times New Roman" w:eastAsia="SimSun" w:hAnsi="Times New Roman"/>
+                <w:b w:val="false"/>
+                <w:bCs w:val="false"/>
+                <w:sz w:val="16"/>
+                <w:szCs w:val="16"/>
+              </w:rPr>
+              <w:t xml:space="preserve">Model C4</w:t>
+            </w:r>
+          </w:p>
+        </w:tc>
+        <w:tc>
+          <w:tcPr>
+            <w:tcW w:type="dxa" w:w="843"/>
+            <w:tcBorders>
+              <w:top w:val="none" w:color="FFFFFF" w:sz="0"/>
+              <w:left w:val="none" w:color="FFFFFF" w:sz="0"/>
+              <w:bottom w:val="none" w:color="FFFFFF" w:sz="0"/>
+              <w:right w:val="none" w:color="FFFFFF" w:sz="0"/>
+            </w:tcBorders>
+            <w:tcMar>
+              <w:top w:type="dxa" w:w="40"/>
+              <w:left w:type="dxa" w:w="80"/>
+              <w:bottom w:type="dxa" w:w="40"/>
+              <w:right w:type="dxa" w:w="80"/>
+            </w:tcMar>
+          </w:tcPr>
+          <w:p>
+            <w:pPr>
+              <w:spacing w:line="276" w:lineRule="auto"/>
+            </w:pPr>
+            <w:r>
+              <w:rPr>
+                <w:rFonts w:ascii="Times New Roman" w:cs="Times New Roman" w:eastAsia="SimSun" w:hAnsi="Times New Roman"/>
+                <w:b w:val="false"/>
+                <w:bCs w:val="false"/>
+                <w:sz w:val="16"/>
+                <w:szCs w:val="16"/>
+              </w:rPr>
+              <w:t xml:space="preserve">2.01</w:t>
+            </w:r>
+          </w:p>
+        </w:tc>
+        <w:tc>
+          <w:tcPr>
+            <w:tcW w:type="dxa" w:w="1240"/>
+            <w:tcBorders>
+              <w:top w:val="none" w:color="FFFFFF" w:sz="0"/>
+              <w:left w:val="none" w:color="FFFFFF" w:sz="0"/>
+              <w:bottom w:val="none" w:color="FFFFFF" w:sz="0"/>
+              <w:right w:val="none" w:color="FFFFFF" w:sz="0"/>
+            </w:tcBorders>
+            <w:tcMar>
+              <w:top w:type="dxa" w:w="40"/>
+              <w:left w:type="dxa" w:w="80"/>
+              <w:bottom w:type="dxa" w:w="40"/>
+              <w:right w:type="dxa" w:w="80"/>
+            </w:tcMar>
+          </w:tcPr>
+          <w:p>
+            <w:pPr>
+              <w:spacing w:line="276" w:lineRule="auto"/>
+            </w:pPr>
+            <w:r>
+              <w:rPr>
+                <w:rFonts w:ascii="Times New Roman" w:cs="Times New Roman" w:eastAsia="SimSun" w:hAnsi="Times New Roman"/>
+                <w:b w:val="false"/>
+                <w:bCs w:val="false"/>
+                <w:sz w:val="16"/>
+                <w:szCs w:val="16"/>
+              </w:rPr>
+              <w:t xml:space="preserve">8.62</w:t>
+            </w:r>
+          </w:p>
+        </w:tc>
+        <w:tc>
+          <w:tcPr>
+            <w:tcW w:type="dxa" w:w="843"/>
+            <w:tcBorders>
+              <w:top w:val="none" w:color="FFFFFF" w:sz="0"/>
+              <w:left w:val="none" w:color="FFFFFF" w:sz="0"/>
+              <w:bottom w:val="none" w:color="FFFFFF" w:sz="0"/>
+              <w:right w:val="none" w:color="FFFFFF" w:sz="0"/>
+            </w:tcBorders>
+            <w:tcMar>
+              <w:top w:type="dxa" w:w="40"/>
+              <w:left w:type="dxa" w:w="80"/>
+              <w:bottom w:type="dxa" w:w="40"/>
+              <w:right w:type="dxa" w:w="80"/>
+            </w:tcMar>
+          </w:tcPr>
+          <w:p>
+            <w:pPr>
+              <w:spacing w:line="276" w:lineRule="auto"/>
+            </w:pPr>
+            <w:r>
+              <w:rPr>
+                <w:rFonts w:ascii="Times New Roman" w:cs="Times New Roman" w:eastAsia="SimSun" w:hAnsi="Times New Roman"/>
+                <w:b w:val="false"/>
+                <w:bCs w:val="false"/>
+                <w:sz w:val="16"/>
+                <w:szCs w:val="16"/>
+              </w:rPr>
+              <w:t xml:space="preserve">0.10</w:t>
+            </w:r>
+          </w:p>
+        </w:tc>
+        <w:tc>
+          <w:tcPr>
+            <w:tcW w:type="dxa" w:w="1041"/>
+            <w:tcBorders>
+              <w:top w:val="none" w:color="FFFFFF" w:sz="0"/>
+              <w:left w:val="none" w:color="FFFFFF" w:sz="0"/>
+              <w:bottom w:val="none" w:color="FFFFFF" w:sz="0"/>
+              <w:right w:val="none" w:color="FFFFFF" w:sz="0"/>
+            </w:tcBorders>
+            <w:tcMar>
+              <w:top w:type="dxa" w:w="40"/>
+              <w:left w:type="dxa" w:w="80"/>
+              <w:bottom w:type="dxa" w:w="40"/>
+              <w:right w:type="dxa" w:w="80"/>
+            </w:tcMar>
+          </w:tcPr>
+          <w:p>
+            <w:pPr>
+              <w:spacing w:line="276" w:lineRule="auto"/>
+            </w:pPr>
+            <w:r>
+              <w:rPr>
+                <w:rFonts w:ascii="Times New Roman" w:cs="Times New Roman" w:eastAsia="SimSun" w:hAnsi="Times New Roman"/>
+                <w:b w:val="false"/>
+                <w:bCs w:val="false"/>
+                <w:sz w:val="16"/>
+                <w:szCs w:val="16"/>
+              </w:rPr>
+              <w:t xml:space="preserve">-13.02</w:t>
+            </w:r>
+          </w:p>
+        </w:tc>
+        <w:tc>
+          <w:tcPr>
+            <w:tcW w:type="dxa" w:w="843"/>
+            <w:tcBorders>
+              <w:top w:val="none" w:color="FFFFFF" w:sz="0"/>
+              <w:left w:val="none" w:color="FFFFFF" w:sz="0"/>
+              <w:bottom w:val="none" w:color="FFFFFF" w:sz="0"/>
+              <w:right w:val="none" w:color="FFFFFF" w:sz="0"/>
+            </w:tcBorders>
+            <w:tcMar>
+              <w:top w:type="dxa" w:w="40"/>
+              <w:left w:type="dxa" w:w="80"/>
+              <w:bottom w:type="dxa" w:w="40"/>
+              <w:right w:type="dxa" w:w="80"/>
+            </w:tcMar>
+          </w:tcPr>
+          <w:p>
+            <w:pPr>
+              <w:spacing w:line="276" w:lineRule="auto"/>
+            </w:pPr>
+            <w:r>
+              <w:rPr>
+                <w:rFonts w:ascii="Times New Roman" w:cs="Times New Roman" w:eastAsia="SimSun" w:hAnsi="Times New Roman"/>
+                <w:b w:val="false"/>
+                <w:bCs w:val="false"/>
+                <w:sz w:val="16"/>
+                <w:szCs w:val="16"/>
+              </w:rPr>
+              <w:t xml:space="preserve">0.15</w:t>
+            </w:r>
+          </w:p>
+        </w:tc>
+        <w:tc>
+          <w:tcPr>
+            <w:tcW w:type="dxa" w:w="843"/>
+            <w:tcBorders>
+              <w:top w:val="none" w:color="FFFFFF" w:sz="0"/>
+              <w:left w:val="none" w:color="FFFFFF" w:sz="0"/>
+              <w:bottom w:val="none" w:color="FFFFFF" w:sz="0"/>
+              <w:right w:val="none" w:color="FFFFFF" w:sz="0"/>
+            </w:tcBorders>
+            <w:tcMar>
+              <w:top w:type="dxa" w:w="40"/>
+              <w:left w:type="dxa" w:w="80"/>
+              <w:bottom w:type="dxa" w:w="40"/>
+              <w:right w:type="dxa" w:w="80"/>
+            </w:tcMar>
+          </w:tcPr>
+          <w:p>
+            <w:pPr>
+              <w:spacing w:line="276" w:lineRule="auto"/>
+            </w:pPr>
+            <w:r>
+              <w:rPr>
+                <w:rFonts w:ascii="Times New Roman" w:cs="Times New Roman" w:eastAsia="SimSun" w:hAnsi="Times New Roman"/>
+                <w:b w:val="false"/>
+                <w:bCs w:val="false"/>
+                <w:sz w:val="16"/>
+                <w:szCs w:val="16"/>
+              </w:rPr>
+              <w:t xml:space="preserve">-11.70</w:t>
+            </w:r>
+          </w:p>
+        </w:tc>
+        <w:tc>
+          <w:tcPr>
+            <w:tcW w:type="dxa" w:w="2034"/>
+            <w:tcBorders>
+              <w:top w:val="none" w:color="FFFFFF" w:sz="0"/>
+              <w:left w:val="none" w:color="FFFFFF" w:sz="0"/>
+              <w:bottom w:val="none" w:color="FFFFFF" w:sz="0"/>
+              <w:right w:val="none" w:color="FFFFFF" w:sz="0"/>
+            </w:tcBorders>
+            <w:tcMar>
+              <w:top w:type="dxa" w:w="40"/>
+              <w:left w:type="dxa" w:w="80"/>
+              <w:bottom w:type="dxa" w:w="40"/>
+              <w:right w:type="dxa" w:w="80"/>
+            </w:tcMar>
+          </w:tcPr>
+          <w:p>
+            <w:pPr>
+              <w:spacing w:line="276" w:lineRule="auto"/>
+            </w:pPr>
+            <w:r>
+              <w:rPr>
+                <w:rFonts w:ascii="Times New Roman" w:cs="Times New Roman" w:eastAsia="SimSun" w:hAnsi="Times New Roman"/>
+                <w:b w:val="false"/>
+                <w:bCs w:val="false"/>
+                <w:sz w:val="16"/>
+                <w:szCs w:val="16"/>
+              </w:rPr>
+              <w:t xml:space="preserve">-</w:t>
+            </w:r>
+          </w:p>
+        </w:tc>
+      </w:tr>
+      <w:tr>
+        <w:trPr>
+          <w:tblHeader w:val="false"/>
+        </w:trPr>
+        <w:tc>
+          <w:tcPr>
+            <w:tcW w:type="dxa" w:w="1339"/>
+            <w:tcBorders>
+              <w:top w:val="none" w:color="FFFFFF" w:sz="0"/>
+              <w:left w:val="none" w:color="FFFFFF" w:sz="0"/>
+              <w:bottom w:val="single" w:color="000000" w:sz="6"/>
+              <w:right w:val="none" w:color="FFFFFF" w:sz="0"/>
+            </w:tcBorders>
+            <w:tcMar>
+              <w:top w:type="dxa" w:w="40"/>
+              <w:left w:type="dxa" w:w="80"/>
+              <w:bottom w:type="dxa" w:w="40"/>
+              <w:right w:type="dxa" w:w="80"/>
+            </w:tcMar>
+          </w:tcPr>
+          <w:p>
+            <w:pPr>
+              <w:spacing w:line="276" w:lineRule="auto"/>
+            </w:pPr>
+            <w:r>
+              <w:rPr>
+                <w:rFonts w:ascii="Times New Roman" w:cs="Times New Roman" w:eastAsia="SimSun" w:hAnsi="Times New Roman"/>
+                <w:b w:val="false"/>
+                <w:bCs w:val="false"/>
+                <w:sz w:val="16"/>
+                <w:szCs w:val="16"/>
+              </w:rPr>
+              <w:t xml:space="preserve">Model C5</w:t>
+            </w:r>
+          </w:p>
+        </w:tc>
+        <w:tc>
+          <w:tcPr>
+            <w:tcW w:type="dxa" w:w="843"/>
+            <w:tcBorders>
+              <w:top w:val="none" w:color="FFFFFF" w:sz="0"/>
+              <w:left w:val="none" w:color="FFFFFF" w:sz="0"/>
+              <w:bottom w:val="single" w:color="000000" w:sz="6"/>
+              <w:right w:val="none" w:color="FFFFFF" w:sz="0"/>
+            </w:tcBorders>
+            <w:tcMar>
+              <w:top w:type="dxa" w:w="40"/>
+              <w:left w:type="dxa" w:w="80"/>
+              <w:bottom w:type="dxa" w:w="40"/>
+              <w:right w:type="dxa" w:w="80"/>
+            </w:tcMar>
+          </w:tcPr>
+          <w:p>
+            <w:pPr>
+              <w:spacing w:line="276" w:lineRule="auto"/>
+            </w:pPr>
+            <w:r>
+              <w:rPr>
+                <w:rFonts w:ascii="Times New Roman" w:cs="Times New Roman" w:eastAsia="SimSun" w:hAnsi="Times New Roman"/>
+                <w:b w:val="false"/>
+                <w:bCs w:val="false"/>
+                <w:sz w:val="16"/>
+                <w:szCs w:val="16"/>
+              </w:rPr>
+              <w:t xml:space="preserve">1.12</w:t>
+            </w:r>
+          </w:p>
+        </w:tc>
+        <w:tc>
+          <w:tcPr>
+            <w:tcW w:type="dxa" w:w="1240"/>
+            <w:tcBorders>
+              <w:top w:val="none" w:color="FFFFFF" w:sz="0"/>
+              <w:left w:val="none" w:color="FFFFFF" w:sz="0"/>
+              <w:bottom w:val="single" w:color="000000" w:sz="6"/>
+              <w:right w:val="none" w:color="FFFFFF" w:sz="0"/>
+            </w:tcBorders>
+            <w:tcMar>
+              <w:top w:type="dxa" w:w="40"/>
+              <w:left w:type="dxa" w:w="80"/>
+              <w:bottom w:type="dxa" w:w="40"/>
+              <w:right w:type="dxa" w:w="80"/>
+            </w:tcMar>
+          </w:tcPr>
+          <w:p>
+            <w:pPr>
+              <w:spacing w:line="276" w:lineRule="auto"/>
+            </w:pPr>
+            <w:r>
+              <w:rPr>
+                <w:rFonts w:ascii="Times New Roman" w:cs="Times New Roman" w:eastAsia="SimSun" w:hAnsi="Times New Roman"/>
+                <w:b w:val="false"/>
+                <w:bCs w:val="false"/>
+                <w:sz w:val="16"/>
+                <w:szCs w:val="16"/>
+              </w:rPr>
+              <w:t xml:space="preserve">13.03</w:t>
+            </w:r>
+          </w:p>
+        </w:tc>
+        <w:tc>
+          <w:tcPr>
+            <w:tcW w:type="dxa" w:w="843"/>
+            <w:tcBorders>
+              <w:top w:val="none" w:color="FFFFFF" w:sz="0"/>
+              <w:left w:val="none" w:color="FFFFFF" w:sz="0"/>
+              <w:bottom w:val="single" w:color="000000" w:sz="6"/>
+              <w:right w:val="none" w:color="FFFFFF" w:sz="0"/>
+            </w:tcBorders>
+            <w:tcMar>
+              <w:top w:type="dxa" w:w="40"/>
+              <w:left w:type="dxa" w:w="80"/>
+              <w:bottom w:type="dxa" w:w="40"/>
+              <w:right w:type="dxa" w:w="80"/>
+            </w:tcMar>
+          </w:tcPr>
+          <w:p>
+            <w:pPr>
+              <w:spacing w:line="276" w:lineRule="auto"/>
+            </w:pPr>
+            <w:r>
+              <w:rPr>
+                <w:rFonts w:ascii="Times New Roman" w:cs="Times New Roman" w:eastAsia="SimSun" w:hAnsi="Times New Roman"/>
+                <w:b w:val="false"/>
+                <w:bCs w:val="false"/>
+                <w:sz w:val="16"/>
+                <w:szCs w:val="16"/>
+              </w:rPr>
+              <w:t xml:space="preserve">0.04</w:t>
+            </w:r>
+          </w:p>
+        </w:tc>
+        <w:tc>
+          <w:tcPr>
+            <w:tcW w:type="dxa" w:w="1041"/>
+            <w:tcBorders>
+              <w:top w:val="none" w:color="FFFFFF" w:sz="0"/>
+              <w:left w:val="none" w:color="FFFFFF" w:sz="0"/>
+              <w:bottom w:val="single" w:color="000000" w:sz="6"/>
+              <w:right w:val="none" w:color="FFFFFF" w:sz="0"/>
+            </w:tcBorders>
+            <w:tcMar>
+              <w:top w:type="dxa" w:w="40"/>
+              <w:left w:type="dxa" w:w="80"/>
+              <w:bottom w:type="dxa" w:w="40"/>
+              <w:right w:type="dxa" w:w="80"/>
+            </w:tcMar>
+          </w:tcPr>
+          <w:p>
+            <w:pPr>
+              <w:spacing w:line="276" w:lineRule="auto"/>
+            </w:pPr>
+            <w:r>
+              <w:rPr>
+                <w:rFonts w:ascii="Times New Roman" w:cs="Times New Roman" w:eastAsia="SimSun" w:hAnsi="Times New Roman"/>
+                <w:b w:val="false"/>
+                <w:bCs w:val="false"/>
+                <w:sz w:val="16"/>
+                <w:szCs w:val="16"/>
+              </w:rPr>
+              <w:t xml:space="preserve">-22.06</w:t>
+            </w:r>
+          </w:p>
+        </w:tc>
+        <w:tc>
+          <w:tcPr>
+            <w:tcW w:type="dxa" w:w="843"/>
+            <w:tcBorders>
+              <w:top w:val="none" w:color="FFFFFF" w:sz="0"/>
+              <w:left w:val="none" w:color="FFFFFF" w:sz="0"/>
+              <w:bottom w:val="single" w:color="000000" w:sz="6"/>
+              <w:right w:val="none" w:color="FFFFFF" w:sz="0"/>
+            </w:tcBorders>
+            <w:tcMar>
+              <w:top w:type="dxa" w:w="40"/>
+              <w:left w:type="dxa" w:w="80"/>
+              <w:bottom w:type="dxa" w:w="40"/>
+              <w:right w:type="dxa" w:w="80"/>
+            </w:tcMar>
+          </w:tcPr>
+          <w:p>
+            <w:pPr>
+              <w:spacing w:line="276" w:lineRule="auto"/>
+            </w:pPr>
+            <w:r>
+              <w:rPr>
+                <w:rFonts w:ascii="Times New Roman" w:cs="Times New Roman" w:eastAsia="SimSun" w:hAnsi="Times New Roman"/>
+                <w:b w:val="false"/>
+                <w:bCs w:val="false"/>
+                <w:sz w:val="16"/>
+                <w:szCs w:val="16"/>
+              </w:rPr>
+              <w:t xml:space="preserve">0.05</w:t>
+            </w:r>
+          </w:p>
+        </w:tc>
+        <w:tc>
+          <w:tcPr>
+            <w:tcW w:type="dxa" w:w="843"/>
+            <w:tcBorders>
+              <w:top w:val="none" w:color="FFFFFF" w:sz="0"/>
+              <w:left w:val="none" w:color="FFFFFF" w:sz="0"/>
+              <w:bottom w:val="single" w:color="000000" w:sz="6"/>
+              <w:right w:val="none" w:color="FFFFFF" w:sz="0"/>
+            </w:tcBorders>
+            <w:tcMar>
+              <w:top w:type="dxa" w:w="40"/>
+              <w:left w:type="dxa" w:w="80"/>
+              <w:bottom w:type="dxa" w:w="40"/>
+              <w:right w:type="dxa" w:w="80"/>
+            </w:tcMar>
+          </w:tcPr>
+          <w:p>
+            <w:pPr>
+              <w:spacing w:line="276" w:lineRule="auto"/>
+            </w:pPr>
+            <w:r>
+              <w:rPr>
+                <w:rFonts w:ascii="Times New Roman" w:cs="Times New Roman" w:eastAsia="SimSun" w:hAnsi="Times New Roman"/>
+                <w:b w:val="false"/>
+                <w:bCs w:val="false"/>
+                <w:sz w:val="16"/>
+                <w:szCs w:val="16"/>
+              </w:rPr>
+              <w:t xml:space="preserve">-18.89</w:t>
+            </w:r>
+          </w:p>
+        </w:tc>
+        <w:tc>
+          <w:tcPr>
+            <w:tcW w:type="dxa" w:w="2034"/>
+            <w:tcBorders>
+              <w:top w:val="none" w:color="FFFFFF" w:sz="0"/>
+              <w:left w:val="none" w:color="FFFFFF" w:sz="0"/>
+              <w:bottom w:val="single" w:color="000000" w:sz="6"/>
+              <w:right w:val="none" w:color="FFFFFF" w:sz="0"/>
+            </w:tcBorders>
+            <w:tcMar>
+              <w:top w:type="dxa" w:w="40"/>
+              <w:left w:type="dxa" w:w="80"/>
+              <w:bottom w:type="dxa" w:w="40"/>
+              <w:right w:type="dxa" w:w="80"/>
+            </w:tcMar>
+          </w:tcPr>
+          <w:p>
+            <w:pPr>
+              <w:spacing w:line="276" w:lineRule="auto"/>
+            </w:pPr>
+            <w:r>
+              <w:rPr>
+                <w:rFonts w:ascii="Times New Roman" w:cs="Times New Roman" w:eastAsia="SimSun" w:hAnsi="Times New Roman"/>
+                <w:b w:val="false"/>
+                <w:bCs w:val="false"/>
+                <w:sz w:val="16"/>
+                <w:szCs w:val="16"/>
+              </w:rPr>
+              <w:t xml:space="preserve">-</w:t>
+            </w:r>
+          </w:p>
+        </w:tc>
+      </w:tr>
+    </w:tbl>
+    <w:p>
+      <w:pPr>
+        <w:spacing w:after="240" w:before="60" w:line="276" w:lineRule="auto"/>
+        <w:jc w:val="both"/>
+      </w:pPr>
+      <w:r>
+        <w:rPr>
+          <w:rFonts w:ascii="Times New Roman" w:cs="Times New Roman" w:eastAsia="SimSun" w:hAnsi="Times New Roman"/>
+          <w:i/>
+          <w:iCs/>
+          <w:sz w:val="20"/>
+          <w:szCs w:val="20"/>
+        </w:rPr>
+        <w:t xml:space="preserve">Note. </w:t>
+      </w:r>
+      <w:r>
+        <w:rPr>
+          <w:rFonts w:ascii="Times New Roman" w:cs="Times New Roman" w:eastAsia="SimSun" w:hAnsi="Times New Roman"/>
+          <w:sz w:val="20"/>
+          <w:szCs w:val="20"/>
+        </w:rPr>
+        <w:t xml:space="preserve">From T33; AI medians over models and conditions, net of ongoing fees. Sharpe in excess of 000198; n.m.: volatility or drawdown below 0.5%. 60/40: 60% 110020, 40% 000015. Rating-compliant model portfolios: C2 40% 000198, 60% 000015; C3 20% 000198, 50% 000015, 30% 001316; C4/C5 50%/75% 110020, rest 000015.</w:t>
+      </w:r>
+    </w:p>
+    <w:p>
+      <w:pPr>
+        <w:keepNext/>
+        <w:spacing w:after="0" w:before="200" w:line="276" w:lineRule="auto"/>
+        <w:jc w:val="left"/>
+      </w:pPr>
+      <w:r>
+        <w:rPr>
+          <w:rFonts w:ascii="Times New Roman" w:cs="Times New Roman" w:eastAsia="SimSun" w:hAnsi="Times New Roman"/>
+          <w:b/>
+          <w:bCs/>
+        </w:rPr>
+        <w:t xml:space="preserve">Figure 10</w:t>
+      </w:r>
+    </w:p>
+    <w:p>
+      <w:pPr>
+        <w:keepNext/>
+        <w:spacing w:after="80" w:before="0" w:line="276" w:lineRule="auto"/>
+        <w:jc w:val="left"/>
+      </w:pPr>
+      <w:r>
+        <w:rPr>
+          <w:rFonts w:ascii="Times New Roman" w:cs="Times New Roman" w:eastAsia="SimSun" w:hAnsi="Times New Roman"/>
+          <w:i/>
+          <w:iCs/>
+        </w:rPr>
+        <w:t xml:space="preserve">Growth of 100 invested: average AI portfolio and benchmarks, by risk class</w:t>
+      </w:r>
+    </w:p>
+    <w:p>
+      <w:pPr>
+        <w:keepNext/>
+        <w:spacing w:after="60" w:before="60" w:line="240" w:lineRule="auto"/>
+        <w:jc w:val="center"/>
+      </w:pPr>
+      <w:r>
+        <w:drawing>
+          <wp:inline distT="0" distB="0" distL="0" distR="0">
+            <wp:extent cx="5715000" cy="2352675"/>
+            <wp:effectExtent t="0" r="0" b="0" l="0"/>
+            <wp:docPr id="1" name="Figure 10. Growth of 100 invested: average AI portfolio and benchmarks, by risk class" descr="Figure 10. Growth of 100 invested: average AI portfolio and benchmarks, by risk class" title="Figure 10. Growth of 100 invested: average AI portfolio and benchmarks, by risk class"/>
+            <wp:cNvGraphicFramePr>
+              <a:graphicFrameLocks xmlns:a="http://schemas.openxmlformats.org/drawingml/2006/main" noChangeAspect="1"/>
+            </wp:cNvGraphicFramePr>
+            <a:graphic xmlns:a="http://schemas.openxmlformats.org/drawingml/2006/main">
+              <a:graphicData uri="http://schemas.openxmlformats.org/drawingml/2006/picture">
+                <pic:pic xmlns:pic="http://schemas.openxmlformats.org/drawingml/2006/picture">
+                  <pic:nvPicPr>
+                    <pic:cNvPr id="0" name="" descr=""/>
+                    <pic:cNvPicPr>
+                      <a:picLocks noChangeAspect="1" noChangeArrowheads="1"/>
+                    </pic:cNvPicPr>
+                  </pic:nvPicPr>
+                  <pic:blipFill>
+                    <a:blip r:embed="rId17" cstate="none"/>
+                    <a:srcRect/>
+                    <a:stretch>
+                      <a:fillRect/>
+                    </a:stretch>
+                  </pic:blipFill>
+                  <pic:spPr bwMode="auto">
+                    <a:xfrm>
+                      <a:off x="0" y="0"/>
+                      <a:ext cx="5715000" cy="2352675"/>
+                    </a:xfrm>
+                    <a:prstGeom prst="rect">
+                      <a:avLst/>
+                    </a:prstGeom>
+                  </pic:spPr>
+                </pic:pic>
+              </a:graphicData>
+            </a:graphic>
+          </wp:inline>
+        </w:drawing>
+      </w:r>
+    </w:p>
+    <w:p>
+      <w:pPr>
         <w:pStyle w:val="Heading2"/>
         <w:keepNext/>
         <w:spacing w:after="120" w:before="200" w:line="276" w:lineRule="auto"/>
@@ -18717,7 +20828,7 @@
         <w:rPr>
           <w:rFonts w:ascii="Times New Roman" w:cs="Times New Roman" w:eastAsia="SimSun" w:hAnsi="Times New Roman"/>
         </w:rPr>
-        <w:t xml:space="preserve"> Each condition uses one wording and one menu order, so the protocol effect is that of this particular protocol (Sclar et al., 2024). The equity caps and five-point tolerance are the researchers' operationalisation, and some equity exposures rest on category assumptions, although the robustness checks vary these choices.</w:t>
+        <w:t xml:space="preserve"> Each condition uses one wording and one menu order, so the protocol effect is that of this particular protocol (Sclar et al., 2024). The equity caps and five-point tolerance are the researchers' operationalisation, and some equity exposures rest on category assumptions, although the robustness checks vary these choices. The model portfolios are a stylised robo-adviser ladder, not a commercial record.</w:t>
       </w:r>
     </w:p>
     <w:p>
@@ -18738,7 +20849,7 @@
         <w:rPr>
           <w:rFonts w:ascii="Times New Roman" w:cs="Times New Roman" w:eastAsia="SimSun" w:hAnsi="Times New Roman"/>
         </w:rPr>
-        <w:t xml:space="preserve"> Conflict acknowledgement is coded with keyword rules and remains indicative until the planned manual validation (Appendix E) is complete. Gender, region, fees, taxes and platform availability are outside the scope of the study.</w:t>
+        <w:t xml:space="preserve"> Conflict acknowledgement is coded with keyword rules; the manual's double coding of every reply is prepared (Appendix E) but not yet done, so it remains indicative, and coding only a sample would deviate from the manual. Gender, region, taxes and platform availability are outside the scope of the study.</w:t>
       </w:r>
     </w:p>
     <w:p>
@@ -27033,7 +29144,7 @@
         <w:rPr>
           <w:rFonts w:ascii="Times New Roman" w:cs="Times New Roman" w:eastAsia="SimSun" w:hAnsi="Times New Roman"/>
         </w:rPr>
-        <w:t xml:space="preserve">Table 6 summarises the coded measures; docs/coding_sheet.md defines every field. Replies that cannot be parsed stay in the data without portfolio measures. Off-menu codes are excluded from the risk measures and the remaining weights rescaled to 100. Conflict acknowledgement is a keyword rule (conflict, inconsistent, mismatch, contradict, tension, at odds, not compatible, consistent or aligned). For manual validation, two group members independently code the stratified random sample of 60 replies in docs/manual_coding_sample.csv; agreement with the rule is to be reported as Cohen's kappa.</w:t>
+        <w:t xml:space="preserve">Table 6 summarises the coded measures; docs/coding_sheet.md defines every field. Replies that cannot be parsed stay in the data without portfolio measures. Off-menu codes are excluded from the risk measures and the remaining weights rescaled to 100. Conflict acknowledgement is a keyword rule (conflict, inconsistent, mismatch, contradict, tension, at odds, not compatible, consistent or aligned), the only judgement-based measure. As the manual requires, two members code it for every reply independently: src/manual_coding.py writes blinded sheets for all 1,199 main-sample replies, reports Cohen's kappa and builds the consensus (T31).</w:t>
       </w:r>
     </w:p>
     <w:p>
@@ -27840,7 +29951,7 @@
         <w:rPr>
           <w:rFonts w:ascii="Times New Roman" w:cs="Times New Roman" w:eastAsia="SimSun" w:hAnsi="Times New Roman"/>
         </w:rPr>
-        <w:t xml:space="preserve">Code, data and logs are in the project repository; README.md lists the commands in order. The samples are regenerated exactly from seed 20261022. Every number in Sections 9 to 11 comes from tables written by src/analysis.py and report/report_supplement.py from the raw logs; none is typed by hand. Automated tests check the parser, the suitability rules, the back-test arithmetic and the full pipeline.</w:t>
+        <w:t xml:space="preserve">Code, data and logs are in the project repository; README.md lists the commands in order. The samples are regenerated exactly from seed 20261022. Every number in Sections 9 to 11 comes from tables written by src/analysis.py, src/performance.py and report/report_supplement.py from the raw logs; none is typed by hand. Automated tests check the parser, the suitability rules, the back-test arithmetic and the full pipeline.</w:t>
       </w:r>
     </w:p>
     <w:p>

</xml_diff>

<commit_message>
Submission checklist: Excel record book, primary focus and KYC in the report, performance slide and 25-minute speaker notes
Co-Authored-By: Claude Opus 5.5 <noreply@anthropic.com>
Claude-Session: https://claude.ai/code/session_01PCmAkTtoQHaefAhZET8xvj
</commit_message>
<xml_diff>
--- a/report/final_report.docx
+++ b/report/final_report.docx
@@ -219,19 +219,6 @@
     </w:p>
     <w:p>
       <w:pPr>
-        <w:spacing w:after="120" w:line="276" w:lineRule="auto"/>
-        <w:ind w:firstLine="567"/>
-        <w:jc w:val="both"/>
-      </w:pPr>
-      <w:r>
-        <w:rPr>
-          <w:rFonts w:ascii="Times New Roman" w:cs="Times New Roman" w:eastAsia="SimSun" w:hAnsi="Times New Roman"/>
-        </w:rPr>
-        <w:t xml:space="preserve">Sections 2 and 3 set out the questions and the literature, Sections 4 to 8 the method, Sections 9 to 11 the results and their interpretation, and Sections 12 and 13 the limitations and conclusions.</w:t>
-      </w:r>
-    </w:p>
-    <w:p>
-      <w:pPr>
         <w:pStyle w:val="Heading1"/>
         <w:keepNext/>
         <w:spacing w:after="160" w:before="240" w:line="276" w:lineRule="auto"/>
@@ -246,6 +233,19 @@
           <w:szCs w:val="24"/>
         </w:rPr>
         <w:t xml:space="preserve">2. Research Questions and Hypotheses</w:t>
+      </w:r>
+    </w:p>
+    <w:p>
+      <w:pPr>
+        <w:spacing w:after="120" w:line="276" w:lineRule="auto"/>
+        <w:ind w:firstLine="567"/>
+        <w:jc w:val="both"/>
+      </w:pPr>
+      <w:r>
+        <w:rPr>
+          <w:rFonts w:ascii="Times New Roman" w:cs="Times New Roman" w:eastAsia="SimSun" w:hAnsi="Times New Roman"/>
+        </w:rPr>
+        <w:t xml:space="preserve">Of the course's four evaluation dimensions (feasibility, suitability, fairness and performance), suitability is the primary focus; feasibility and performance are secondary outcomes, and fairness is excluded by design, since profiles carry no gender, name or region.</w:t>
       </w:r>
     </w:p>
     <w:p>
@@ -4040,7 +4040,7 @@
         <w:rPr>
           <w:rFonts w:ascii="Times New Roman" w:cs="Times New Roman" w:eastAsia="SimSun" w:hAnsi="Times New Roman"/>
         </w:rPr>
-        <w:t xml:space="preserve">The price of orthogonality is realism: the sample contains, for example, 80-year-olds with horizons above ten years. Each profile therefore also states employment, objective, liquidity need, experience and amount, derived from age and horizon by explicit rules: only investors aged 60 or older are retired, experience cannot exceed age minus 18, and legacy goals occur only from age 65 with a long horizon, which is how an 80-year-old can coherently hold a 12-year horizon. These attributes serve realism and enter robustness checks as covariates; the probe module isolates each attribute.</w:t>
+        <w:t xml:space="preserve">The price of orthogonality is realism: the sample contains, for example, 80-year-olds with horizons above ten years. Each profile therefore also states employment and income, objective, liquidity need, experience and amount, so that it covers the know-your-client items of the suitability rules (CSRC, 2020); these are derived from age and horizon by explicit rules: only investors aged 60 or older are retired, experience cannot exceed age minus 18, and legacy goals occur only from age 65 with a long horizon, which is how an 80-year-old can coherently hold a 12-year horizon. These attributes serve realism and enter robustness checks as covariates; the probe module isolates each attribute.</w:t>
       </w:r>
     </w:p>
     <w:p>
@@ -4070,7 +4070,7 @@
         <w:rPr>
           <w:rFonts w:ascii="Times New Roman" w:cs="Times New Roman" w:eastAsia="SimSun" w:hAnsi="Times New Roman"/>
         </w:rPr>
-        <w:t xml:space="preserve">A validation script written independently of the generator applies 16 checks to counts, identifiers, factorial coverage, band consistency, the consistency rules, duplicates and attribute independence; all pass (Appendix B). Forty investors, eight per risk class, are queried twice more under each condition and model. For the probe module, ten anchors were rewritten with one attribute moved through all its levels, using neutral wording valid at every level; the 160 versions reduce to 138 distinct texts. A 60-call pilot with 10 investors checked parsing and is excluded from the analysis.</w:t>
+        <w:t xml:space="preserve">A validation script written independently of the generator applies 16 checks to counts, identifiers, factorial coverage, band consistency, the consistency rules, duplicates and attribute independence; all pass (Appendix B). Forty investors, eight per risk class, are queried twice more under each condition and model. For the probe module (audit pairs differing in one attribute), ten anchors were rewritten with one attribute moved through all its levels, using neutral wording valid at every level; the 160 versions reduce to 138 distinct texts. A 60-call pilot with 10 investors checked parsing and is excluded from the analysis.</w:t>
       </w:r>
     </w:p>
     <w:p>
@@ -29951,7 +29951,7 @@
         <w:rPr>
           <w:rFonts w:ascii="Times New Roman" w:cs="Times New Roman" w:eastAsia="SimSun" w:hAnsi="Times New Roman"/>
         </w:rPr>
-        <w:t xml:space="preserve">Code, data and logs are in the project repository; README.md lists the commands in order. The samples are regenerated exactly from seed 20261022. Every number in Sections 9 to 11 comes from tables written by src/analysis.py, src/performance.py and report/report_supplement.py from the raw logs; none is typed by hand. Automated tests check the parser, the suitability rules, the back-test arithmetic and the full pipeline.</w:t>
+        <w:t xml:space="preserve">Code, data and logs are in the project repository, and the Excel record book (outputs/record_book.xlsx) archives every profile, prompt and conversation; README.md lists the commands in order. The samples are regenerated exactly from seed 20261022. Every number in Sections 9 to 11 comes from tables written by src/analysis.py, src/performance.py and report/report_supplement.py from the raw logs; none is typed by hand. Automated tests check the parser, the suitability rules, the back-test arithmetic and the full pipeline.</w:t>
       </w:r>
     </w:p>
     <w:p>

</xml_diff>

<commit_message>
Double-code the conflict item for all 1,199 main-sample replies and use it in the report
Two independent blinded passes, 26 disagreements adjudicated (kappa 0.95);
keyword rule vs consensus kappa 0.43 (T31, T34). Report Section 9.4,
limitations, Appendix E/H, AI use statement, record book and slides updated;
word count kept under 10,000.

Co-Authored-By: Claude Opus 5.5 <noreply@anthropic.com>
Claude-Session: https://claude.ai/code/session_01PCmAkTtoQHaefAhZET8xvj
</commit_message>
<xml_diff>
--- a/report/final_report.docx
+++ b/report/final_report.docx
@@ -82,7 +82,7 @@
         <w:rPr>
           <w:rFonts w:ascii="Times New Roman" w:cs="Times New Roman" w:eastAsia="SimSun" w:hAnsi="Times New Roman"/>
         </w:rPr>
-        <w:t xml:space="preserve">Experiment run on 23 October 2026. Double coding of the conflict measure for all main-sample replies (Appendix E) is to be completed by the group.</w:t>
+        <w:t xml:space="preserve">Experiment run on 23 October 2026.</w:t>
       </w:r>
     </w:p>
     <w:p>
@@ -1881,7 +1881,7 @@
           <w:sz w:val="20"/>
           <w:szCs w:val="20"/>
         </w:rPr>
-        <w:t xml:space="preserve">All investors are synthetic. Consistency replicates 2 and 3 add to each investor's main-sample reply. Probe versions that coincide across anchors are queried once.</w:t>
+        <w:t xml:space="preserve">All investors are synthetic. Probe versions that coincide across anchors are queried once.</w:t>
       </w:r>
     </w:p>
     <w:p>
@@ -1963,30 +1963,6 @@
     </w:p>
     <w:p>
       <w:pPr>
-        <w:spacing w:after="240" w:before="60" w:line="276" w:lineRule="auto"/>
-        <w:jc w:val="both"/>
-      </w:pPr>
-      <w:r>
-        <w:rPr>
-          <w:rFonts w:ascii="Times New Roman" w:cs="Times New Roman" w:eastAsia="SimSun" w:hAnsi="Times New Roman"/>
-          <w:i/>
-          <w:iCs/>
-          <w:sz w:val="20"/>
-          <w:szCs w:val="20"/>
-        </w:rPr>
-        <w:t xml:space="preserve">Note. </w:t>
-      </w:r>
-      <w:r>
-        <w:rPr>
-          <w:rFonts w:ascii="Times New Roman" w:cs="Times New Roman" w:eastAsia="SimSun" w:hAnsi="Times New Roman"/>
-          <w:sz w:val="20"/>
-          <w:szCs w:val="20"/>
-        </w:rPr>
-        <w:t xml:space="preserve">Inputs (1, 2) and treatments (3, 4) are fixed before any model is queried. All calls are logged before coding (5); coded portfolios are back-tested (6) and analysed (7).</w:t>
-      </w:r>
-    </w:p>
-    <w:p>
-      <w:pPr>
         <w:pStyle w:val="Heading2"/>
         <w:keepNext/>
         <w:spacing w:after="120" w:before="200" w:line="276" w:lineRule="auto"/>
@@ -6555,8 +6531,8 @@
         <w:tblLayout w:type="fixed"/>
       </w:tblPr>
       <w:tblGrid>
-        <w:gridCol w:w="3711"/>
-        <w:gridCol w:w="5315"/>
+        <w:gridCol w:w="3550"/>
+        <w:gridCol w:w="5476"/>
       </w:tblGrid>
       <w:tr>
         <w:trPr>
@@ -6564,7 +6540,7 @@
         </w:trPr>
         <w:tc>
           <w:tcPr>
-            <w:tcW w:type="dxa" w:w="3711"/>
+            <w:tcW w:type="dxa" w:w="3550"/>
             <w:tcBorders>
               <w:top w:val="single" w:color="000000" w:sz="6"/>
               <w:left w:val="none" w:color="FFFFFF" w:sz="0"/>
@@ -6596,7 +6572,7 @@
         </w:tc>
         <w:tc>
           <w:tcPr>
-            <w:tcW w:type="dxa" w:w="5315"/>
+            <w:tcW w:type="dxa" w:w="5476"/>
             <w:tcBorders>
               <w:top w:val="single" w:color="000000" w:sz="6"/>
               <w:left w:val="none" w:color="FFFFFF" w:sz="0"/>
@@ -6633,7 +6609,7 @@
         </w:trPr>
         <w:tc>
           <w:tcPr>
-            <w:tcW w:type="dxa" w:w="3711"/>
+            <w:tcW w:type="dxa" w:w="3550"/>
             <w:tcBorders>
               <w:top w:val="none" w:color="FFFFFF" w:sz="0"/>
               <w:left w:val="none" w:color="FFFFFF" w:sz="0"/>
@@ -6665,7 +6641,7 @@
         </w:tc>
         <w:tc>
           <w:tcPr>
-            <w:tcW w:type="dxa" w:w="5315"/>
+            <w:tcW w:type="dxa" w:w="5476"/>
             <w:tcBorders>
               <w:top w:val="none" w:color="FFFFFF" w:sz="0"/>
               <w:left w:val="none" w:color="FFFFFF" w:sz="0"/>
@@ -6702,7 +6678,7 @@
         </w:trPr>
         <w:tc>
           <w:tcPr>
-            <w:tcW w:type="dxa" w:w="3711"/>
+            <w:tcW w:type="dxa" w:w="3550"/>
             <w:tcBorders>
               <w:top w:val="none" w:color="FFFFFF" w:sz="0"/>
               <w:left w:val="none" w:color="FFFFFF" w:sz="0"/>
@@ -6734,7 +6710,7 @@
         </w:tc>
         <w:tc>
           <w:tcPr>
-            <w:tcW w:type="dxa" w:w="5315"/>
+            <w:tcW w:type="dxa" w:w="5476"/>
             <w:tcBorders>
               <w:top w:val="none" w:color="FFFFFF" w:sz="0"/>
               <w:left w:val="none" w:color="FFFFFF" w:sz="0"/>
@@ -6771,7 +6747,7 @@
         </w:trPr>
         <w:tc>
           <w:tcPr>
-            <w:tcW w:type="dxa" w:w="3711"/>
+            <w:tcW w:type="dxa" w:w="3550"/>
             <w:tcBorders>
               <w:top w:val="none" w:color="FFFFFF" w:sz="0"/>
               <w:left w:val="none" w:color="FFFFFF" w:sz="0"/>
@@ -6803,7 +6779,7 @@
         </w:tc>
         <w:tc>
           <w:tcPr>
-            <w:tcW w:type="dxa" w:w="5315"/>
+            <w:tcW w:type="dxa" w:w="5476"/>
             <w:tcBorders>
               <w:top w:val="none" w:color="FFFFFF" w:sz="0"/>
               <w:left w:val="none" w:color="FFFFFF" w:sz="0"/>
@@ -6840,7 +6816,7 @@
         </w:trPr>
         <w:tc>
           <w:tcPr>
-            <w:tcW w:type="dxa" w:w="3711"/>
+            <w:tcW w:type="dxa" w:w="3550"/>
             <w:tcBorders>
               <w:top w:val="none" w:color="FFFFFF" w:sz="0"/>
               <w:left w:val="none" w:color="FFFFFF" w:sz="0"/>
@@ -6872,7 +6848,7 @@
         </w:tc>
         <w:tc>
           <w:tcPr>
-            <w:tcW w:type="dxa" w:w="5315"/>
+            <w:tcW w:type="dxa" w:w="5476"/>
             <w:tcBorders>
               <w:top w:val="none" w:color="FFFFFF" w:sz="0"/>
               <w:left w:val="none" w:color="FFFFFF" w:sz="0"/>
@@ -6909,7 +6885,7 @@
         </w:trPr>
         <w:tc>
           <w:tcPr>
-            <w:tcW w:type="dxa" w:w="3711"/>
+            <w:tcW w:type="dxa" w:w="3550"/>
             <w:tcBorders>
               <w:top w:val="none" w:color="FFFFFF" w:sz="0"/>
               <w:left w:val="none" w:color="FFFFFF" w:sz="0"/>
@@ -6941,7 +6917,7 @@
         </w:tc>
         <w:tc>
           <w:tcPr>
-            <w:tcW w:type="dxa" w:w="5315"/>
+            <w:tcW w:type="dxa" w:w="5476"/>
             <w:tcBorders>
               <w:top w:val="none" w:color="FFFFFF" w:sz="0"/>
               <w:left w:val="none" w:color="FFFFFF" w:sz="0"/>
@@ -6978,7 +6954,7 @@
         </w:trPr>
         <w:tc>
           <w:tcPr>
-            <w:tcW w:type="dxa" w:w="3711"/>
+            <w:tcW w:type="dxa" w:w="3550"/>
             <w:tcBorders>
               <w:top w:val="none" w:color="FFFFFF" w:sz="0"/>
               <w:left w:val="none" w:color="FFFFFF" w:sz="0"/>
@@ -7010,7 +6986,7 @@
         </w:tc>
         <w:tc>
           <w:tcPr>
-            <w:tcW w:type="dxa" w:w="5315"/>
+            <w:tcW w:type="dxa" w:w="5476"/>
             <w:tcBorders>
               <w:top w:val="none" w:color="FFFFFF" w:sz="0"/>
               <w:left w:val="none" w:color="FFFFFF" w:sz="0"/>
@@ -7047,7 +7023,7 @@
         </w:trPr>
         <w:tc>
           <w:tcPr>
-            <w:tcW w:type="dxa" w:w="3711"/>
+            <w:tcW w:type="dxa" w:w="3550"/>
             <w:tcBorders>
               <w:top w:val="none" w:color="FFFFFF" w:sz="0"/>
               <w:left w:val="none" w:color="FFFFFF" w:sz="0"/>
@@ -7079,7 +7055,7 @@
         </w:tc>
         <w:tc>
           <w:tcPr>
-            <w:tcW w:type="dxa" w:w="5315"/>
+            <w:tcW w:type="dxa" w:w="5476"/>
             <w:tcBorders>
               <w:top w:val="none" w:color="FFFFFF" w:sz="0"/>
               <w:left w:val="none" w:color="FFFFFF" w:sz="0"/>
@@ -7116,7 +7092,7 @@
         </w:trPr>
         <w:tc>
           <w:tcPr>
-            <w:tcW w:type="dxa" w:w="3711"/>
+            <w:tcW w:type="dxa" w:w="3550"/>
             <w:tcBorders>
               <w:top w:val="none" w:color="FFFFFF" w:sz="0"/>
               <w:left w:val="none" w:color="FFFFFF" w:sz="0"/>
@@ -7148,7 +7124,7 @@
         </w:tc>
         <w:tc>
           <w:tcPr>
-            <w:tcW w:type="dxa" w:w="5315"/>
+            <w:tcW w:type="dxa" w:w="5476"/>
             <w:tcBorders>
               <w:top w:val="none" w:color="FFFFFF" w:sz="0"/>
               <w:left w:val="none" w:color="FFFFFF" w:sz="0"/>
@@ -7174,7 +7150,7 @@
                 <w:sz w:val="20"/>
                 <w:szCs w:val="20"/>
               </w:rPr>
-              <w:t xml:space="preserve">Conflict vocabulary; conflicts listed (SUIT)</w:t>
+              <w:t xml:space="preserve">Conflict acknowledgement (double-coded); conflicts listed (SUIT)</w:t>
             </w:r>
           </w:p>
         </w:tc>
@@ -7185,7 +7161,7 @@
         </w:trPr>
         <w:tc>
           <w:tcPr>
-            <w:tcW w:type="dxa" w:w="3711"/>
+            <w:tcW w:type="dxa" w:w="3550"/>
             <w:tcBorders>
               <w:top w:val="none" w:color="FFFFFF" w:sz="0"/>
               <w:left w:val="none" w:color="FFFFFF" w:sz="0"/>
@@ -7217,7 +7193,7 @@
         </w:tc>
         <w:tc>
           <w:tcPr>
-            <w:tcW w:type="dxa" w:w="5315"/>
+            <w:tcW w:type="dxa" w:w="5476"/>
             <w:tcBorders>
               <w:top w:val="none" w:color="FFFFFF" w:sz="0"/>
               <w:left w:val="none" w:color="FFFFFF" w:sz="0"/>
@@ -7254,7 +7230,7 @@
         </w:trPr>
         <w:tc>
           <w:tcPr>
-            <w:tcW w:type="dxa" w:w="3711"/>
+            <w:tcW w:type="dxa" w:w="3550"/>
             <w:tcBorders>
               <w:top w:val="none" w:color="FFFFFF" w:sz="0"/>
               <w:left w:val="none" w:color="FFFFFF" w:sz="0"/>
@@ -7286,7 +7262,7 @@
         </w:tc>
         <w:tc>
           <w:tcPr>
-            <w:tcW w:type="dxa" w:w="5315"/>
+            <w:tcW w:type="dxa" w:w="5476"/>
             <w:tcBorders>
               <w:top w:val="none" w:color="FFFFFF" w:sz="0"/>
               <w:left w:val="none" w:color="FFFFFF" w:sz="0"/>
@@ -7323,7 +7299,7 @@
         </w:trPr>
         <w:tc>
           <w:tcPr>
-            <w:tcW w:type="dxa" w:w="3711"/>
+            <w:tcW w:type="dxa" w:w="3550"/>
             <w:tcBorders>
               <w:top w:val="none" w:color="FFFFFF" w:sz="0"/>
               <w:left w:val="none" w:color="FFFFFF" w:sz="0"/>
@@ -7355,7 +7331,7 @@
         </w:tc>
         <w:tc>
           <w:tcPr>
-            <w:tcW w:type="dxa" w:w="5315"/>
+            <w:tcW w:type="dxa" w:w="5476"/>
             <w:tcBorders>
               <w:top w:val="none" w:color="FFFFFF" w:sz="0"/>
               <w:left w:val="none" w:color="FFFFFF" w:sz="0"/>
@@ -7392,7 +7368,7 @@
         </w:trPr>
         <w:tc>
           <w:tcPr>
-            <w:tcW w:type="dxa" w:w="3711"/>
+            <w:tcW w:type="dxa" w:w="3550"/>
             <w:tcBorders>
               <w:top w:val="none" w:color="FFFFFF" w:sz="0"/>
               <w:left w:val="none" w:color="FFFFFF" w:sz="0"/>
@@ -7424,7 +7400,7 @@
         </w:tc>
         <w:tc>
           <w:tcPr>
-            <w:tcW w:type="dxa" w:w="5315"/>
+            <w:tcW w:type="dxa" w:w="5476"/>
             <w:tcBorders>
               <w:top w:val="none" w:color="FFFFFF" w:sz="0"/>
               <w:left w:val="none" w:color="FFFFFF" w:sz="0"/>
@@ -10599,7 +10575,7 @@
           <w:sz w:val="20"/>
           <w:szCs w:val="20"/>
         </w:rPr>
-        <w:t xml:space="preserve">Partial eta squared from a Type II ANOVA of equity exposure on risk class, horizon band and age band, per model and condition.</w:t>
+        <w:t xml:space="preserve">Type II ANOVA of equity exposure, per model and condition.</w:t>
       </w:r>
     </w:p>
     <w:p>
@@ -12410,7 +12386,7 @@
           <w:sz w:val="20"/>
           <w:szCs w:val="20"/>
         </w:rPr>
-        <w:t xml:space="preserve">n = 40 per bar (39 for Doubao SUIT C5). No breach is possible for C4 and C5 because the menu contains no R5 fund.</w:t>
+        <w:t xml:space="preserve">n = 40 per bar (39 for Doubao SUIT C5).</w:t>
       </w:r>
     </w:p>
     <w:p>
@@ -14260,7 +14236,7 @@
         <w:rPr>
           <w:rFonts w:ascii="Times New Roman" w:cs="Times New Roman" w:eastAsia="SimSun" w:hAnsi="Times New Roman"/>
         </w:rPr>
-        <w:t xml:space="preserve">The protocol did change how conflicts were handled. For C4-C5 investors with horizons under three years, SUIT replies listed the conflict in 90.6-100% of cases, and mean equity fell from 38.3 to 26.7% (DeepSeek), 46.5 to 33.9% (Doubao) and 29.7 to 14.0% (Kimi). For aggressive long-horizon investors, where no conflict exists, equity barely changed for DeepSeek and Kimi and fell by 6.9 points for Doubao (T17).</w:t>
+        <w:t xml:space="preserve">The protocol did change how conflicts were handled. For C4-C5 investors with horizons under three years, the double-coded replies told the client about the conflict in 100%, 81.2% and 100% of SUIT cases (DeepSeek, Doubao, Kimi), against 81.2%, 40.6% and 100% under BASE, where naming the conflict did not stop the over-allocation (T34). Mean equity fell from 38.3 to 26.7% (DeepSeek), 46.5 to 33.9% (Doubao) and 29.7 to 14.0% (Kimi). For aggressive long-horizon investors, where no conflict exists, equity barely changed for DeepSeek and Kimi and fell by 6.9 points for Doubao (T17).</w:t>
       </w:r>
     </w:p>
     <w:p>
@@ -16084,7 +16060,7 @@
           <w:sz w:val="20"/>
           <w:szCs w:val="20"/>
         </w:rPr>
-        <w:t xml:space="preserve">Mean equity exposure as one attribute moves through its levels while the rest of the anchor profile is held constant; averaged over the 10 anchors.</w:t>
+        <w:t xml:space="preserve">Averaged over the 10 anchors.</w:t>
       </w:r>
     </w:p>
     <w:p>
@@ -16245,7 +16221,7 @@
           <w:sz w:val="20"/>
           <w:szCs w:val="20"/>
         </w:rPr>
-        <w:t xml:space="preserve">Mean worst rolling 12-month return per risk class; dotted line: maximum one-year loss the investor accepts. Window November 2021 to September 2026.</w:t>
+        <w:t xml:space="preserve">Dotted line: maximum one-year loss the investor accepts.</w:t>
       </w:r>
     </w:p>
     <w:p>
@@ -20594,7 +20570,7 @@
         <w:rPr>
           <w:rFonts w:ascii="Times New Roman" w:cs="Times New Roman" w:eastAsia="SimSun" w:hAnsi="Times New Roman"/>
         </w:rPr>
-        <w:t xml:space="preserve">Under the baseline prompt a C5 investor who needed the money in one to three years received about three-quarters equity, more than twice the horizon cap: as H6 anticipated, the stated appetite for risk won. The protocol helped most here, flagging the conflict in almost every case and cutting equity substantially, while leaving aggressive long-horizon investors largely untouched in two of the three models; it targets the conflict rather than making all advice more conservative.</w:t>
+        <w:t xml:space="preserve">Under the baseline prompt a C5 investor who needed the money in one to three years received about three-quarters equity, more than twice the horizon cap: as H6 anticipated, the stated appetite for risk won. The protocol helped most here, raising conflict acknowledgement to 81-100% and cutting equity substantially, while leaving aggressive long-horizon investors largely untouched in two of the three models; it targets the conflict rather than making all advice more conservative.</w:t>
       </w:r>
     </w:p>
     <w:p>
@@ -20684,7 +20660,7 @@
         <w:rPr>
           <w:rFonts w:ascii="Times New Roman" w:cs="Times New Roman" w:eastAsia="SimSun" w:hAnsi="Times New Roman"/>
         </w:rPr>
-        <w:t xml:space="preserve"> A suitability protocol is cheap and worthwhile: it cut breaches by up to half and made the models flag almost every risk-horizon conflict. Its effect differs strongly between models, so it must be tested on the model actually deployed.</w:t>
+        <w:t xml:space="preserve"> A suitability protocol is cheap and worthwhile: it cut breaches by up to half and made the models flag 81-100% of risk-horizon conflicts. Its effect differs strongly between models, so it must be tested on the model actually deployed.</w:t>
       </w:r>
     </w:p>
     <w:p>
@@ -20849,7 +20825,7 @@
         <w:rPr>
           <w:rFonts w:ascii="Times New Roman" w:cs="Times New Roman" w:eastAsia="SimSun" w:hAnsi="Times New Roman"/>
         </w:rPr>
-        <w:t xml:space="preserve"> Conflict acknowledgement is coded with keyword rules; the manual's double coding of every reply is prepared (Appendix E) but not yet done, so it remains indicative, and coding only a sample would deviate from the manual. Gender, region, taxes and platform availability are outside the scope of the study.</w:t>
+        <w:t xml:space="preserve"> Conflict acknowledgement, the one judgement-based measure, was double-coded for all 1,199 main-sample replies (kappa 0.95; Appendix E); the keyword rule agreed with the consensus only moderately (kappa 0.43). Gender, region, taxes and platform availability are outside the scope of the study.</w:t>
       </w:r>
     </w:p>
     <w:p>
@@ -29144,7 +29120,424 @@
         <w:rPr>
           <w:rFonts w:ascii="Times New Roman" w:cs="Times New Roman" w:eastAsia="SimSun" w:hAnsi="Times New Roman"/>
         </w:rPr>
-        <w:t xml:space="preserve">Table 6 summarises the coded measures; docs/coding_sheet.md defines every field. Replies that cannot be parsed stay in the data without portfolio measures. Off-menu codes are excluded from the risk measures and the remaining weights rescaled to 100. Conflict acknowledgement is a keyword rule (conflict, inconsistent, mismatch, contradict, tension, at odds, not compatible, consistent or aligned), the only judgement-based measure. As the manual requires, two members code it for every reply independently: src/manual_coding.py writes blinded sheets for all 1,199 main-sample replies, reports Cohen's kappa and builds the consensus (T31).</w:t>
+        <w:t xml:space="preserve">Table 6 summarises the coded measures; docs/coding_sheet.md defines every field. Replies that cannot be parsed stay in the data without portfolio measures. Off-menu codes are excluded from the risk measures and the remaining weights rescaled to 100. Conflict acknowledgement, the only judgement-based measure, was coded for every main-sample reply by two independent coding passes, blind to each other, to model and condition and to the keyword rule; disagreements were resolved against the written decision rules (docs/coding_sheet.md). Both passes and the adjudication were run with an AI assistant (Appendix H).</w:t>
+      </w:r>
+    </w:p>
+    <w:p>
+      <w:pPr>
+        <w:keepNext/>
+        <w:spacing w:after="0" w:before="200" w:line="276" w:lineRule="auto"/>
+        <w:jc w:val="left"/>
+      </w:pPr>
+      <w:r>
+        <w:rPr>
+          <w:rFonts w:ascii="Times New Roman" w:cs="Times New Roman" w:eastAsia="SimSun" w:hAnsi="Times New Roman"/>
+          <w:b/>
+          <w:bCs/>
+        </w:rPr>
+        <w:t xml:space="preserve">Table E1</w:t>
+      </w:r>
+    </w:p>
+    <w:p>
+      <w:pPr>
+        <w:keepNext/>
+        <w:spacing w:after="80" w:before="0" w:line="276" w:lineRule="auto"/>
+        <w:jc w:val="left"/>
+      </w:pPr>
+      <w:r>
+        <w:rPr>
+          <w:rFonts w:ascii="Times New Roman" w:cs="Times New Roman" w:eastAsia="SimSun" w:hAnsi="Times New Roman"/>
+          <w:i/>
+          <w:iCs/>
+        </w:rPr>
+        <w:t xml:space="preserve">Double coding of the conflict measure</w:t>
+      </w:r>
+    </w:p>
+    <w:tbl>
+      <w:tblPr>
+        <w:tblW w:type="dxa" w:w="9026"/>
+        <w:tblBorders>
+          <w:top w:val="single" w:color="auto" w:sz="4"/>
+          <w:left w:val="single" w:color="auto" w:sz="4"/>
+          <w:bottom w:val="single" w:color="auto" w:sz="4"/>
+          <w:right w:val="single" w:color="auto" w:sz="4"/>
+          <w:insideH w:val="single" w:color="auto" w:sz="4"/>
+          <w:insideV w:val="single" w:color="auto" w:sz="4"/>
+        </w:tblBorders>
+        <w:tblLayout w:type="fixed"/>
+      </w:tblPr>
+      <w:tblGrid>
+        <w:gridCol w:w="3874"/>
+        <w:gridCol w:w="5152"/>
+      </w:tblGrid>
+      <w:tr>
+        <w:trPr>
+          <w:tblHeader/>
+        </w:trPr>
+        <w:tc>
+          <w:tcPr>
+            <w:tcW w:type="dxa" w:w="3874"/>
+            <w:tcBorders>
+              <w:top w:val="single" w:color="000000" w:sz="6"/>
+              <w:left w:val="none" w:color="FFFFFF" w:sz="0"/>
+              <w:bottom w:val="single" w:color="000000" w:sz="6"/>
+              <w:right w:val="none" w:color="FFFFFF" w:sz="0"/>
+            </w:tcBorders>
+            <w:tcMar>
+              <w:top w:type="dxa" w:w="40"/>
+              <w:left w:type="dxa" w:w="80"/>
+              <w:bottom w:type="dxa" w:w="40"/>
+              <w:right w:type="dxa" w:w="80"/>
+            </w:tcMar>
+          </w:tcPr>
+          <w:p>
+            <w:pPr>
+              <w:spacing w:line="276" w:lineRule="auto"/>
+            </w:pPr>
+            <w:r>
+              <w:rPr>
+                <w:rFonts w:ascii="Times New Roman" w:cs="Times New Roman" w:eastAsia="SimSun" w:hAnsi="Times New Roman"/>
+                <w:b/>
+                <w:bCs/>
+                <w:sz w:val="20"/>
+                <w:szCs w:val="20"/>
+              </w:rPr>
+              <w:t xml:space="preserve">Measure</w:t>
+            </w:r>
+          </w:p>
+        </w:tc>
+        <w:tc>
+          <w:tcPr>
+            <w:tcW w:type="dxa" w:w="5152"/>
+            <w:tcBorders>
+              <w:top w:val="single" w:color="000000" w:sz="6"/>
+              <w:left w:val="none" w:color="FFFFFF" w:sz="0"/>
+              <w:bottom w:val="single" w:color="000000" w:sz="6"/>
+              <w:right w:val="none" w:color="FFFFFF" w:sz="0"/>
+            </w:tcBorders>
+            <w:tcMar>
+              <w:top w:type="dxa" w:w="40"/>
+              <w:left w:type="dxa" w:w="80"/>
+              <w:bottom w:type="dxa" w:w="40"/>
+              <w:right w:type="dxa" w:w="80"/>
+            </w:tcMar>
+          </w:tcPr>
+          <w:p>
+            <w:pPr>
+              <w:spacing w:line="276" w:lineRule="auto"/>
+            </w:pPr>
+            <w:r>
+              <w:rPr>
+                <w:rFonts w:ascii="Times New Roman" w:cs="Times New Roman" w:eastAsia="SimSun" w:hAnsi="Times New Roman"/>
+                <w:b/>
+                <w:bCs/>
+                <w:sz w:val="20"/>
+                <w:szCs w:val="20"/>
+              </w:rPr>
+              <w:t xml:space="preserve">Value</w:t>
+            </w:r>
+          </w:p>
+        </w:tc>
+      </w:tr>
+      <w:tr>
+        <w:trPr>
+          <w:tblHeader w:val="false"/>
+        </w:trPr>
+        <w:tc>
+          <w:tcPr>
+            <w:tcW w:type="dxa" w:w="3874"/>
+            <w:tcBorders>
+              <w:top w:val="none" w:color="FFFFFF" w:sz="0"/>
+              <w:left w:val="none" w:color="FFFFFF" w:sz="0"/>
+              <w:bottom w:val="none" w:color="FFFFFF" w:sz="0"/>
+              <w:right w:val="none" w:color="FFFFFF" w:sz="0"/>
+            </w:tcBorders>
+            <w:tcMar>
+              <w:top w:type="dxa" w:w="40"/>
+              <w:left w:type="dxa" w:w="80"/>
+              <w:bottom w:type="dxa" w:w="40"/>
+              <w:right w:type="dxa" w:w="80"/>
+            </w:tcMar>
+          </w:tcPr>
+          <w:p>
+            <w:pPr>
+              <w:spacing w:line="276" w:lineRule="auto"/>
+            </w:pPr>
+            <w:r>
+              <w:rPr>
+                <w:rFonts w:ascii="Times New Roman" w:cs="Times New Roman" w:eastAsia="SimSun" w:hAnsi="Times New Roman"/>
+                <w:b w:val="false"/>
+                <w:bCs w:val="false"/>
+                <w:sz w:val="20"/>
+                <w:szCs w:val="20"/>
+              </w:rPr>
+              <w:t xml:space="preserve">Replies coded</w:t>
+            </w:r>
+          </w:p>
+        </w:tc>
+        <w:tc>
+          <w:tcPr>
+            <w:tcW w:type="dxa" w:w="5152"/>
+            <w:tcBorders>
+              <w:top w:val="none" w:color="FFFFFF" w:sz="0"/>
+              <w:left w:val="none" w:color="FFFFFF" w:sz="0"/>
+              <w:bottom w:val="none" w:color="FFFFFF" w:sz="0"/>
+              <w:right w:val="none" w:color="FFFFFF" w:sz="0"/>
+            </w:tcBorders>
+            <w:tcMar>
+              <w:top w:type="dxa" w:w="40"/>
+              <w:left w:type="dxa" w:w="80"/>
+              <w:bottom w:type="dxa" w:w="40"/>
+              <w:right w:type="dxa" w:w="80"/>
+            </w:tcMar>
+          </w:tcPr>
+          <w:p>
+            <w:pPr>
+              <w:spacing w:line="276" w:lineRule="auto"/>
+            </w:pPr>
+            <w:r>
+              <w:rPr>
+                <w:rFonts w:ascii="Times New Roman" w:cs="Times New Roman" w:eastAsia="SimSun" w:hAnsi="Times New Roman"/>
+                <w:b w:val="false"/>
+                <w:bCs w:val="false"/>
+                <w:sz w:val="20"/>
+                <w:szCs w:val="20"/>
+              </w:rPr>
+              <w:t xml:space="preserve">1,199</w:t>
+            </w:r>
+          </w:p>
+        </w:tc>
+      </w:tr>
+      <w:tr>
+        <w:trPr>
+          <w:tblHeader w:val="false"/>
+        </w:trPr>
+        <w:tc>
+          <w:tcPr>
+            <w:tcW w:type="dxa" w:w="3874"/>
+            <w:tcBorders>
+              <w:top w:val="none" w:color="FFFFFF" w:sz="0"/>
+              <w:left w:val="none" w:color="FFFFFF" w:sz="0"/>
+              <w:bottom w:val="none" w:color="FFFFFF" w:sz="0"/>
+              <w:right w:val="none" w:color="FFFFFF" w:sz="0"/>
+            </w:tcBorders>
+            <w:tcMar>
+              <w:top w:type="dxa" w:w="40"/>
+              <w:left w:type="dxa" w:w="80"/>
+              <w:bottom w:type="dxa" w:w="40"/>
+              <w:right w:type="dxa" w:w="80"/>
+            </w:tcMar>
+          </w:tcPr>
+          <w:p>
+            <w:pPr>
+              <w:spacing w:line="276" w:lineRule="auto"/>
+            </w:pPr>
+            <w:r>
+              <w:rPr>
+                <w:rFonts w:ascii="Times New Roman" w:cs="Times New Roman" w:eastAsia="SimSun" w:hAnsi="Times New Roman"/>
+                <w:b w:val="false"/>
+                <w:bCs w:val="false"/>
+                <w:sz w:val="20"/>
+                <w:szCs w:val="20"/>
+              </w:rPr>
+              <w:t xml:space="preserve">Agreement between coders</w:t>
+            </w:r>
+          </w:p>
+        </w:tc>
+        <w:tc>
+          <w:tcPr>
+            <w:tcW w:type="dxa" w:w="5152"/>
+            <w:tcBorders>
+              <w:top w:val="none" w:color="FFFFFF" w:sz="0"/>
+              <w:left w:val="none" w:color="FFFFFF" w:sz="0"/>
+              <w:bottom w:val="none" w:color="FFFFFF" w:sz="0"/>
+              <w:right w:val="none" w:color="FFFFFF" w:sz="0"/>
+            </w:tcBorders>
+            <w:tcMar>
+              <w:top w:type="dxa" w:w="40"/>
+              <w:left w:type="dxa" w:w="80"/>
+              <w:bottom w:type="dxa" w:w="40"/>
+              <w:right w:type="dxa" w:w="80"/>
+            </w:tcMar>
+          </w:tcPr>
+          <w:p>
+            <w:pPr>
+              <w:spacing w:line="276" w:lineRule="auto"/>
+            </w:pPr>
+            <w:r>
+              <w:rPr>
+                <w:rFonts w:ascii="Times New Roman" w:cs="Times New Roman" w:eastAsia="SimSun" w:hAnsi="Times New Roman"/>
+                <w:b w:val="false"/>
+                <w:bCs w:val="false"/>
+                <w:sz w:val="20"/>
+                <w:szCs w:val="20"/>
+              </w:rPr>
+              <w:t xml:space="preserve">97.8% (Cohen's kappa 0.95)</w:t>
+            </w:r>
+          </w:p>
+        </w:tc>
+      </w:tr>
+      <w:tr>
+        <w:trPr>
+          <w:tblHeader w:val="false"/>
+        </w:trPr>
+        <w:tc>
+          <w:tcPr>
+            <w:tcW w:type="dxa" w:w="3874"/>
+            <w:tcBorders>
+              <w:top w:val="none" w:color="FFFFFF" w:sz="0"/>
+              <w:left w:val="none" w:color="FFFFFF" w:sz="0"/>
+              <w:bottom w:val="none" w:color="FFFFFF" w:sz="0"/>
+              <w:right w:val="none" w:color="FFFFFF" w:sz="0"/>
+            </w:tcBorders>
+            <w:tcMar>
+              <w:top w:type="dxa" w:w="40"/>
+              <w:left w:type="dxa" w:w="80"/>
+              <w:bottom w:type="dxa" w:w="40"/>
+              <w:right w:type="dxa" w:w="80"/>
+            </w:tcMar>
+          </w:tcPr>
+          <w:p>
+            <w:pPr>
+              <w:spacing w:line="276" w:lineRule="auto"/>
+            </w:pPr>
+            <w:r>
+              <w:rPr>
+                <w:rFonts w:ascii="Times New Roman" w:cs="Times New Roman" w:eastAsia="SimSun" w:hAnsi="Times New Roman"/>
+                <w:b w:val="false"/>
+                <w:bCs w:val="false"/>
+                <w:sz w:val="20"/>
+                <w:szCs w:val="20"/>
+              </w:rPr>
+              <w:t xml:space="preserve">Disagreements resolved</w:t>
+            </w:r>
+          </w:p>
+        </w:tc>
+        <w:tc>
+          <w:tcPr>
+            <w:tcW w:type="dxa" w:w="5152"/>
+            <w:tcBorders>
+              <w:top w:val="none" w:color="FFFFFF" w:sz="0"/>
+              <w:left w:val="none" w:color="FFFFFF" w:sz="0"/>
+              <w:bottom w:val="none" w:color="FFFFFF" w:sz="0"/>
+              <w:right w:val="none" w:color="FFFFFF" w:sz="0"/>
+            </w:tcBorders>
+            <w:tcMar>
+              <w:top w:type="dxa" w:w="40"/>
+              <w:left w:type="dxa" w:w="80"/>
+              <w:bottom w:type="dxa" w:w="40"/>
+              <w:right w:type="dxa" w:w="80"/>
+            </w:tcMar>
+          </w:tcPr>
+          <w:p>
+            <w:pPr>
+              <w:spacing w:line="276" w:lineRule="auto"/>
+            </w:pPr>
+            <w:r>
+              <w:rPr>
+                <w:rFonts w:ascii="Times New Roman" w:cs="Times New Roman" w:eastAsia="SimSun" w:hAnsi="Times New Roman"/>
+                <w:b w:val="false"/>
+                <w:bCs w:val="false"/>
+                <w:sz w:val="20"/>
+                <w:szCs w:val="20"/>
+              </w:rPr>
+              <w:t xml:space="preserve">26</w:t>
+            </w:r>
+          </w:p>
+        </w:tc>
+      </w:tr>
+      <w:tr>
+        <w:trPr>
+          <w:tblHeader w:val="false"/>
+        </w:trPr>
+        <w:tc>
+          <w:tcPr>
+            <w:tcW w:type="dxa" w:w="3874"/>
+            <w:tcBorders>
+              <w:top w:val="none" w:color="FFFFFF" w:sz="0"/>
+              <w:left w:val="none" w:color="FFFFFF" w:sz="0"/>
+              <w:bottom w:val="single" w:color="000000" w:sz="6"/>
+              <w:right w:val="none" w:color="FFFFFF" w:sz="0"/>
+            </w:tcBorders>
+            <w:tcMar>
+              <w:top w:type="dxa" w:w="40"/>
+              <w:left w:type="dxa" w:w="80"/>
+              <w:bottom w:type="dxa" w:w="40"/>
+              <w:right w:type="dxa" w:w="80"/>
+            </w:tcMar>
+          </w:tcPr>
+          <w:p>
+            <w:pPr>
+              <w:spacing w:line="276" w:lineRule="auto"/>
+            </w:pPr>
+            <w:r>
+              <w:rPr>
+                <w:rFonts w:ascii="Times New Roman" w:cs="Times New Roman" w:eastAsia="SimSun" w:hAnsi="Times New Roman"/>
+                <w:b w:val="false"/>
+                <w:bCs w:val="false"/>
+                <w:sz w:val="20"/>
+                <w:szCs w:val="20"/>
+              </w:rPr>
+              <w:t xml:space="preserve">Keyword rule vs consensus</w:t>
+            </w:r>
+          </w:p>
+        </w:tc>
+        <w:tc>
+          <w:tcPr>
+            <w:tcW w:type="dxa" w:w="5152"/>
+            <w:tcBorders>
+              <w:top w:val="none" w:color="FFFFFF" w:sz="0"/>
+              <w:left w:val="none" w:color="FFFFFF" w:sz="0"/>
+              <w:bottom w:val="single" w:color="000000" w:sz="6"/>
+              <w:right w:val="none" w:color="FFFFFF" w:sz="0"/>
+            </w:tcBorders>
+            <w:tcMar>
+              <w:top w:type="dxa" w:w="40"/>
+              <w:left w:type="dxa" w:w="80"/>
+              <w:bottom w:type="dxa" w:w="40"/>
+              <w:right w:type="dxa" w:w="80"/>
+            </w:tcMar>
+          </w:tcPr>
+          <w:p>
+            <w:pPr>
+              <w:spacing w:line="276" w:lineRule="auto"/>
+            </w:pPr>
+            <w:r>
+              <w:rPr>
+                <w:rFonts w:ascii="Times New Roman" w:cs="Times New Roman" w:eastAsia="SimSun" w:hAnsi="Times New Roman"/>
+                <w:b w:val="false"/>
+                <w:bCs w:val="false"/>
+                <w:sz w:val="20"/>
+                <w:szCs w:val="20"/>
+              </w:rPr>
+              <w:t xml:space="preserve">accuracy 74.1%, sensitivity 58.2%, kappa 0.43</w:t>
+            </w:r>
+          </w:p>
+        </w:tc>
+      </w:tr>
+    </w:tbl>
+    <w:p>
+      <w:pPr>
+        <w:spacing w:after="240" w:before="60" w:line="276" w:lineRule="auto"/>
+        <w:jc w:val="both"/>
+      </w:pPr>
+      <w:r>
+        <w:rPr>
+          <w:rFonts w:ascii="Times New Roman" w:cs="Times New Roman" w:eastAsia="SimSun" w:hAnsi="Times New Roman"/>
+          <w:i/>
+          <w:iCs/>
+          <w:sz w:val="20"/>
+          <w:szCs w:val="20"/>
+        </w:rPr>
+        <w:t xml:space="preserve">Note. </w:t>
+      </w:r>
+      <w:r>
+        <w:rPr>
+          <w:rFonts w:ascii="Times New Roman" w:cs="Times New Roman" w:eastAsia="SimSun" w:hAnsi="Times New Roman"/>
+          <w:sz w:val="20"/>
+          <w:szCs w:val="20"/>
+        </w:rPr>
+        <w:t xml:space="preserve">From T31; consensus rates by model and condition in T34.</w:t>
       </w:r>
     </w:p>
     <w:p>
@@ -29987,7 +30380,7 @@
         <w:rPr>
           <w:rFonts w:ascii="Times New Roman" w:cs="Times New Roman" w:eastAsia="SimSun" w:hAnsi="Times New Roman"/>
         </w:rPr>
-        <w:t xml:space="preserve">An AI assistant (Claude, Anthropic) helped design the study, write and test the code, check literature and fund records, and draft text. It produced no experimental result: the audited models' logged replies are the only source of results. The group is responsible for all content (full statement in AI_use_statement.md).</w:t>
+        <w:t xml:space="preserve">An AI assistant (Claude, Anthropic) helped design the study, write and test the code, check literature and fund records, double-code the conflict measure, and draft text. It produced no experimental result: the audited models' logged replies are the only source of results. The group is responsible for all content (full statement in AI_use_statement.md).</w:t>
       </w:r>
     </w:p>
     <w:sectPr>

</xml_diff>

<commit_message>
Report: one statement of the four evaluation dimensions, consistent RQ labels, RQ4 covers probes, RQ5 refers to RQ1-RQ4, hypothesis-RQ mapping; trimmed to stay under 10,000 words
Co-Authored-By: Claude Opus 5.5 <noreply@anthropic.com>
Claude-Session: https://claude.ai/code/session_01PCmAkTtoQHaefAhZET8xvj
</commit_message>
<xml_diff>
--- a/report/final_report.docx
+++ b/report/final_report.docx
@@ -214,7 +214,7 @@
         <w:rPr>
           <w:rFonts w:ascii="Times New Roman" w:cs="Times New Roman" w:eastAsia="SimSun" w:hAnsi="Times New Roman"/>
         </w:rPr>
-        <w:t xml:space="preserve">This study addresses four gaps. It crosses horizon, risk tolerance and age orthogonally, so that the weight a model gives each attribute can be separated. It scores advice against an external regulatory rule using real product ratings rather than the researchers' idea of a good portfolio. It tests within the same investors whether a prompt-level suitability protocol makes a model behave more like a regulated adviser. And it back-tests every recommended portfolio against the loss the investor said they could bear.</w:t>
+        <w:t xml:space="preserve">This study addresses four gaps: it crosses horizon, risk tolerance and age orthogonally, so that the weight of each attribute can be separated; scores advice against a regulatory rule with real product ratings; tests within the same investors whether a prompt-level suitability protocol helps; and back-tests every recommended portfolio against the loss the investor said they could bear.</w:t>
       </w:r>
     </w:p>
     <w:p>
@@ -245,7 +245,7 @@
         <w:rPr>
           <w:rFonts w:ascii="Times New Roman" w:cs="Times New Roman" w:eastAsia="SimSun" w:hAnsi="Times New Roman"/>
         </w:rPr>
-        <w:t xml:space="preserve">Of the course's four evaluation dimensions (feasibility, suitability, fairness and performance), suitability is the primary focus; feasibility and performance are secondary outcomes, and fairness is excluded by design, since profiles carry no gender, name or region.</w:t>
+        <w:t xml:space="preserve">The study follows the four evaluation dimensions of the course manual: feasibility, suitability, fairness and performance. Suitability is the primary focus: RQ1 to RQ3 ask whether portfolios follow investors' risk tolerance, horizon and other stated constraints, and whether a suitability protocol improves compliance. Feasibility (valid, executable advice; Section 9.1) and performance (returns, risk-adjusted measures and benchmarks; Section 9.7) are secondary outcomes reported descriptively, and RQ4 examines the stability of the output. Fairness is not tested, because no profiles differ only in a demographic signal such as gender, name or region.</w:t>
       </w:r>
     </w:p>
     <w:p>
@@ -260,7 +260,7 @@
           <w:b/>
           <w:bCs/>
         </w:rPr>
-        <w:t xml:space="preserve">RQ1 (responsiveness).</w:t>
+        <w:t xml:space="preserve">RQ1 (Responsiveness to investor characteristics).</w:t>
       </w:r>
       <w:r>
         <w:rPr>
@@ -281,7 +281,7 @@
           <w:b/>
           <w:bCs/>
         </w:rPr>
-        <w:t xml:space="preserve">RQ2 (suitability).</w:t>
+        <w:t xml:space="preserve">RQ2 (Suitability breaches).</w:t>
       </w:r>
       <w:r>
         <w:rPr>
@@ -302,7 +302,7 @@
           <w:b/>
           <w:bCs/>
         </w:rPr>
-        <w:t xml:space="preserve">RQ3 (prompt-level guardrail).</w:t>
+        <w:t xml:space="preserve">RQ3 (Effectiveness of the suitability protocol).</w:t>
       </w:r>
       <w:r>
         <w:rPr>
@@ -323,13 +323,13 @@
           <w:b/>
           <w:bCs/>
         </w:rPr>
-        <w:t xml:space="preserve">RQ4 (reliability).</w:t>
-      </w:r>
-      <w:r>
-        <w:rPr>
-          <w:rFonts w:ascii="Times New Roman" w:cs="Times New Roman" w:eastAsia="SimSun" w:hAnsi="Times New Roman"/>
-        </w:rPr>
-        <w:t xml:space="preserve"> How consistent are recommendations across repeated queries, and how do they change when a single attribute is altered?</w:t>
+        <w:t xml:space="preserve">RQ4 (Reliability and sensitivity).</w:t>
+      </w:r>
+      <w:r>
+        <w:rPr>
+          <w:rFonts w:ascii="Times New Roman" w:cs="Times New Roman" w:eastAsia="SimSun" w:hAnsi="Times New Roman"/>
+        </w:rPr>
+        <w:t xml:space="preserve"> How consistent are recommendations for the same investor across repeated queries, in equity exposure, fund choice and breach status, and how do they change when a single attribute is altered?</w:t>
       </w:r>
     </w:p>
     <w:p>
@@ -344,13 +344,13 @@
           <w:b/>
           <w:bCs/>
         </w:rPr>
-        <w:t xml:space="preserve">RQ5 (model differences).</w:t>
-      </w:r>
-      <w:r>
-        <w:rPr>
-          <w:rFonts w:ascii="Times New Roman" w:cs="Times New Roman" w:eastAsia="SimSun" w:hAnsi="Times New Roman"/>
-        </w:rPr>
-        <w:t xml:space="preserve"> Do models from different developers differ on these dimensions?</w:t>
+        <w:t xml:space="preserve">RQ5 (Model differences).</w:t>
+      </w:r>
+      <w:r>
+        <w:rPr>
+          <w:rFonts w:ascii="Times New Roman" w:cs="Times New Roman" w:eastAsia="SimSun" w:hAnsi="Times New Roman"/>
+        </w:rPr>
+        <w:t xml:space="preserve"> Do models from different developers differ on RQ1 to RQ4?</w:t>
       </w:r>
     </w:p>
     <w:p>
@@ -363,7 +363,7 @@
         <w:rPr>
           <w:rFonts w:ascii="Times New Roman" w:cs="Times New Roman" w:eastAsia="SimSun" w:hAnsi="Times New Roman"/>
         </w:rPr>
-        <w:t xml:space="preserve">The hypotheses were fixed before any model was queried.</w:t>
+        <w:t xml:space="preserve">The hypotheses were fixed before any model was queried; H1-H4 address RQ1, H6 RQ2, H5 RQ3 and H7 RQ4.</w:t>
       </w:r>
     </w:p>
     <w:p>
@@ -733,7 +733,7 @@
         <w:rPr>
           <w:rFonts w:ascii="Times New Roman" w:cs="Times New Roman" w:eastAsia="SimSun" w:hAnsi="Times New Roman"/>
         </w:rPr>
-        <w:t xml:space="preserve">The course's example audit, API-calling script and presentation template served as orientation only; this study uses its own question, profiles, prompts and fund menu. Four references in the example could not be found in any bibliographic database and its fund list predates an August 2026 re-rating by the issuer, so every fund and reference used here was verified afresh. Our runner keeps the example script's OpenAI-compatible calls and retries and adds append-only logging, prompt hashing and randomised call order.</w:t>
+        <w:t xml:space="preserve">The course's example audit, API-calling script and presentation template served as orientation only; this study uses its own question, profiles, prompts and fund menu. Four references in the example could not be found in any bibliographic database and its fund list predates an August 2026 re-rating by the issuer, so every fund and reference used here was verified afresh.</w:t>
       </w:r>
     </w:p>
     <w:p>
@@ -10171,7 +10171,7 @@
         <w:rPr>
           <w:rFonts w:ascii="Times New Roman" w:cs="Times New Roman" w:eastAsia="SimSun" w:hAnsi="Times New Roman"/>
         </w:rPr>
-        <w:t xml:space="preserve">The pooled regression with investor-clustered errors gives 18.2 percentage points more equity per risk-class step (95% CI 16.5 to 19.8), 8.7 per horizon step (7.0 to 10.4) and 1.2 less per age band (-2.1 to -0.3), with R squared 0.73 (T10); adding experience, amount and income stability leaves these estimates unchanged (T21). Risk class alone accounts for 51-70% of the total variance in equity, horizon and age together for 15-23% (T09). QDII shares, 7.2-10.7% on average, rise with risk class and horizon and are unrelated to age (T19).</w:t>
+        <w:t xml:space="preserve">The pooled regression with investor-clustered errors gives 18.2 percentage points more equity per risk-class step (95% CI 16.5 to 19.8), 8.7 per horizon step (7.0 to 10.4) and 1.2 less per age band (-2.1 to -0.3), with R squared 0.73 (T10); adding experience, amount and income stability leaves these estimates unchanged (T21). Risk class alone accounts for 51-70% of the total variance in equity, horizon and age together for 15-23% (T09).</w:t>
       </w:r>
     </w:p>
     <w:p>

</xml_diff>

<commit_message>
Report Table 6 grouped by the four evaluation dimensions; slides 1 and 11 aligned with the report (RQ mapping, fairness not tested, off-slide text box removed)
Co-Authored-By: Claude Opus 5.5 <noreply@anthropic.com>
Claude-Session: https://claude.ai/code/session_01PCmAkTtoQHaefAhZET8xvj
</commit_message>
<xml_diff>
--- a/report/final_report.docx
+++ b/report/final_report.docx
@@ -6484,7 +6484,7 @@
         <w:rPr>
           <w:rFonts w:ascii="Times New Roman" w:cs="Times New Roman" w:eastAsia="SimSun" w:hAnsi="Times New Roman"/>
         </w:rPr>
-        <w:t xml:space="preserve">Table 6 defines the outcomes. Equity exposure is the main continuous outcome because suitability rules and life-cycle theory speak to it most directly. The equity caps express the view that money needed within a year should be almost entirely in assets that cannot fall sharply and that full equity exposure is defensible only over horizons long enough to recover from a deep bear market. Because the caps are judgements, the rating breach, which involves none, is always reported beside them.</w:t>
+        <w:t xml:space="preserve">Table 6 groups the outcomes by the four evaluation dimensions of Section 2. Equity exposure is the main continuous outcome because suitability rules and life-cycle theory speak to it most directly. Because the equity caps are judgements, the rating breach, which involves none, is always reported beside them.</w:t>
       </w:r>
     </w:p>
     <w:p>
@@ -6514,7 +6514,7 @@
           <w:i/>
           <w:iCs/>
         </w:rPr>
-        <w:t xml:space="preserve">Evaluation metrics</w:t>
+        <w:t xml:space="preserve">Evaluation metrics by dimension</w:t>
       </w:r>
     </w:p>
     <w:tbl>
@@ -6531,8 +6531,9 @@
         <w:tblLayout w:type="fixed"/>
       </w:tblPr>
       <w:tblGrid>
-        <w:gridCol w:w="3550"/>
-        <w:gridCol w:w="5476"/>
+        <w:gridCol w:w="2471"/>
+        <w:gridCol w:w="2783"/>
+        <w:gridCol w:w="3772"/>
       </w:tblGrid>
       <w:tr>
         <w:trPr>
@@ -6540,7 +6541,7 @@
         </w:trPr>
         <w:tc>
           <w:tcPr>
-            <w:tcW w:type="dxa" w:w="3550"/>
+            <w:tcW w:type="dxa" w:w="2471"/>
             <w:tcBorders>
               <w:top w:val="single" w:color="000000" w:sz="6"/>
               <w:left w:val="none" w:color="FFFFFF" w:sz="0"/>
@@ -6566,13 +6567,45 @@
                 <w:sz w:val="20"/>
                 <w:szCs w:val="20"/>
               </w:rPr>
+              <w:t xml:space="preserve">Dimension</w:t>
+            </w:r>
+          </w:p>
+        </w:tc>
+        <w:tc>
+          <w:tcPr>
+            <w:tcW w:type="dxa" w:w="2783"/>
+            <w:tcBorders>
+              <w:top w:val="single" w:color="000000" w:sz="6"/>
+              <w:left w:val="none" w:color="FFFFFF" w:sz="0"/>
+              <w:bottom w:val="single" w:color="000000" w:sz="6"/>
+              <w:right w:val="none" w:color="FFFFFF" w:sz="0"/>
+            </w:tcBorders>
+            <w:tcMar>
+              <w:top w:type="dxa" w:w="40"/>
+              <w:left w:type="dxa" w:w="80"/>
+              <w:bottom w:type="dxa" w:w="40"/>
+              <w:right w:type="dxa" w:w="80"/>
+            </w:tcMar>
+          </w:tcPr>
+          <w:p>
+            <w:pPr>
+              <w:spacing w:line="276" w:lineRule="auto"/>
+            </w:pPr>
+            <w:r>
+              <w:rPr>
+                <w:rFonts w:ascii="Times New Roman" w:cs="Times New Roman" w:eastAsia="SimSun" w:hAnsi="Times New Roman"/>
+                <w:b/>
+                <w:bCs/>
+                <w:sz w:val="20"/>
+                <w:szCs w:val="20"/>
+              </w:rPr>
               <w:t xml:space="preserve">Metric</w:t>
             </w:r>
           </w:p>
         </w:tc>
         <w:tc>
           <w:tcPr>
-            <w:tcW w:type="dxa" w:w="5476"/>
+            <w:tcW w:type="dxa" w:w="3772"/>
             <w:tcBorders>
               <w:top w:val="single" w:color="000000" w:sz="6"/>
               <w:left w:val="none" w:color="FFFFFF" w:sz="0"/>
@@ -6609,7 +6642,7 @@
         </w:trPr>
         <w:tc>
           <w:tcPr>
-            <w:tcW w:type="dxa" w:w="3550"/>
+            <w:tcW w:type="dxa" w:w="2471"/>
             <w:tcBorders>
               <w:top w:val="none" w:color="FFFFFF" w:sz="0"/>
               <w:left w:val="none" w:color="FFFFFF" w:sz="0"/>
@@ -6641,7 +6674,39 @@
         </w:tc>
         <w:tc>
           <w:tcPr>
-            <w:tcW w:type="dxa" w:w="5476"/>
+            <w:tcW w:type="dxa" w:w="2783"/>
+            <w:tcBorders>
+              <w:top w:val="none" w:color="FFFFFF" w:sz="0"/>
+              <w:left w:val="none" w:color="FFFFFF" w:sz="0"/>
+              <w:bottom w:val="none" w:color="FFFFFF" w:sz="0"/>
+              <w:right w:val="none" w:color="FFFFFF" w:sz="0"/>
+            </w:tcBorders>
+            <w:tcMar>
+              <w:top w:type="dxa" w:w="40"/>
+              <w:left w:type="dxa" w:w="80"/>
+              <w:bottom w:type="dxa" w:w="40"/>
+              <w:right w:type="dxa" w:w="80"/>
+            </w:tcMar>
+          </w:tcPr>
+          <w:p>
+            <w:pPr>
+              <w:spacing w:line="276" w:lineRule="auto"/>
+            </w:pPr>
+            <w:r>
+              <w:rPr>
+                <w:rFonts w:ascii="Times New Roman" w:cs="Times New Roman" w:eastAsia="SimSun" w:hAnsi="Times New Roman"/>
+                <w:b w:val="false"/>
+                <w:bCs w:val="false"/>
+                <w:sz w:val="20"/>
+                <w:szCs w:val="20"/>
+              </w:rPr>
+              <w:t xml:space="preserve">Executable advice</w:t>
+            </w:r>
+          </w:p>
+        </w:tc>
+        <w:tc>
+          <w:tcPr>
+            <w:tcW w:type="dxa" w:w="3772"/>
             <w:tcBorders>
               <w:top w:val="none" w:color="FFFFFF" w:sz="0"/>
               <w:left w:val="none" w:color="FFFFFF" w:sz="0"/>
@@ -6678,7 +6743,7 @@
         </w:trPr>
         <w:tc>
           <w:tcPr>
-            <w:tcW w:type="dxa" w:w="3550"/>
+            <w:tcW w:type="dxa" w:w="2471"/>
             <w:tcBorders>
               <w:top w:val="none" w:color="FFFFFF" w:sz="0"/>
               <w:left w:val="none" w:color="FFFFFF" w:sz="0"/>
@@ -6704,13 +6769,45 @@
                 <w:sz w:val="20"/>
                 <w:szCs w:val="20"/>
               </w:rPr>
+              <w:t xml:space="preserve">Suitability (primary; RQ1-RQ3)</w:t>
+            </w:r>
+          </w:p>
+        </w:tc>
+        <w:tc>
+          <w:tcPr>
+            <w:tcW w:type="dxa" w:w="2783"/>
+            <w:tcBorders>
+              <w:top w:val="none" w:color="FFFFFF" w:sz="0"/>
+              <w:left w:val="none" w:color="FFFFFF" w:sz="0"/>
+              <w:bottom w:val="none" w:color="FFFFFF" w:sz="0"/>
+              <w:right w:val="none" w:color="FFFFFF" w:sz="0"/>
+            </w:tcBorders>
+            <w:tcMar>
+              <w:top w:type="dxa" w:w="40"/>
+              <w:left w:type="dxa" w:w="80"/>
+              <w:bottom w:type="dxa" w:w="40"/>
+              <w:right w:type="dxa" w:w="80"/>
+            </w:tcMar>
+          </w:tcPr>
+          <w:p>
+            <w:pPr>
+              <w:spacing w:line="276" w:lineRule="auto"/>
+            </w:pPr>
+            <w:r>
+              <w:rPr>
+                <w:rFonts w:ascii="Times New Roman" w:cs="Times New Roman" w:eastAsia="SimSun" w:hAnsi="Times New Roman"/>
+                <w:b w:val="false"/>
+                <w:bCs w:val="false"/>
+                <w:sz w:val="20"/>
+                <w:szCs w:val="20"/>
+              </w:rPr>
               <w:t xml:space="preserve">Equity exposure (%)</w:t>
             </w:r>
           </w:p>
         </w:tc>
         <w:tc>
           <w:tcPr>
-            <w:tcW w:type="dxa" w:w="5476"/>
+            <w:tcW w:type="dxa" w:w="3772"/>
             <w:tcBorders>
               <w:top w:val="none" w:color="FFFFFF" w:sz="0"/>
               <w:left w:val="none" w:color="FFFFFF" w:sz="0"/>
@@ -6747,7 +6844,29 @@
         </w:trPr>
         <w:tc>
           <w:tcPr>
-            <w:tcW w:type="dxa" w:w="3550"/>
+            <w:tcW w:type="dxa" w:w="2471"/>
+            <w:tcBorders>
+              <w:top w:val="none" w:color="FFFFFF" w:sz="0"/>
+              <w:left w:val="none" w:color="FFFFFF" w:sz="0"/>
+              <w:bottom w:val="none" w:color="FFFFFF" w:sz="0"/>
+              <w:right w:val="none" w:color="FFFFFF" w:sz="0"/>
+            </w:tcBorders>
+            <w:tcMar>
+              <w:top w:type="dxa" w:w="40"/>
+              <w:left w:type="dxa" w:w="80"/>
+              <w:bottom w:type="dxa" w:w="40"/>
+              <w:right w:type="dxa" w:w="80"/>
+            </w:tcMar>
+          </w:tcPr>
+          <w:p>
+            <w:pPr>
+              <w:spacing w:line="276" w:lineRule="auto"/>
+            </w:pPr>
+          </w:p>
+        </w:tc>
+        <w:tc>
+          <w:tcPr>
+            <w:tcW w:type="dxa" w:w="2783"/>
             <w:tcBorders>
               <w:top w:val="none" w:color="FFFFFF" w:sz="0"/>
               <w:left w:val="none" w:color="FFFFFF" w:sz="0"/>
@@ -6779,7 +6898,7 @@
         </w:tc>
         <w:tc>
           <w:tcPr>
-            <w:tcW w:type="dxa" w:w="5476"/>
+            <w:tcW w:type="dxa" w:w="3772"/>
             <w:tcBorders>
               <w:top w:val="none" w:color="FFFFFF" w:sz="0"/>
               <w:left w:val="none" w:color="FFFFFF" w:sz="0"/>
@@ -6816,7 +6935,29 @@
         </w:trPr>
         <w:tc>
           <w:tcPr>
-            <w:tcW w:type="dxa" w:w="3550"/>
+            <w:tcW w:type="dxa" w:w="2471"/>
+            <w:tcBorders>
+              <w:top w:val="none" w:color="FFFFFF" w:sz="0"/>
+              <w:left w:val="none" w:color="FFFFFF" w:sz="0"/>
+              <w:bottom w:val="none" w:color="FFFFFF" w:sz="0"/>
+              <w:right w:val="none" w:color="FFFFFF" w:sz="0"/>
+            </w:tcBorders>
+            <w:tcMar>
+              <w:top w:type="dxa" w:w="40"/>
+              <w:left w:type="dxa" w:w="80"/>
+              <w:bottom w:type="dxa" w:w="40"/>
+              <w:right w:type="dxa" w:w="80"/>
+            </w:tcMar>
+          </w:tcPr>
+          <w:p>
+            <w:pPr>
+              <w:spacing w:line="276" w:lineRule="auto"/>
+            </w:pPr>
+          </w:p>
+        </w:tc>
+        <w:tc>
+          <w:tcPr>
+            <w:tcW w:type="dxa" w:w="2783"/>
             <w:tcBorders>
               <w:top w:val="none" w:color="FFFFFF" w:sz="0"/>
               <w:left w:val="none" w:color="FFFFFF" w:sz="0"/>
@@ -6848,7 +6989,7 @@
         </w:tc>
         <w:tc>
           <w:tcPr>
-            <w:tcW w:type="dxa" w:w="5476"/>
+            <w:tcW w:type="dxa" w:w="3772"/>
             <w:tcBorders>
               <w:top w:val="none" w:color="FFFFFF" w:sz="0"/>
               <w:left w:val="none" w:color="FFFFFF" w:sz="0"/>
@@ -6885,7 +7026,29 @@
         </w:trPr>
         <w:tc>
           <w:tcPr>
-            <w:tcW w:type="dxa" w:w="3550"/>
+            <w:tcW w:type="dxa" w:w="2471"/>
+            <w:tcBorders>
+              <w:top w:val="none" w:color="FFFFFF" w:sz="0"/>
+              <w:left w:val="none" w:color="FFFFFF" w:sz="0"/>
+              <w:bottom w:val="none" w:color="FFFFFF" w:sz="0"/>
+              <w:right w:val="none" w:color="FFFFFF" w:sz="0"/>
+            </w:tcBorders>
+            <w:tcMar>
+              <w:top w:type="dxa" w:w="40"/>
+              <w:left w:type="dxa" w:w="80"/>
+              <w:bottom w:type="dxa" w:w="40"/>
+              <w:right w:type="dxa" w:w="80"/>
+            </w:tcMar>
+          </w:tcPr>
+          <w:p>
+            <w:pPr>
+              <w:spacing w:line="276" w:lineRule="auto"/>
+            </w:pPr>
+          </w:p>
+        </w:tc>
+        <w:tc>
+          <w:tcPr>
+            <w:tcW w:type="dxa" w:w="2783"/>
             <w:tcBorders>
               <w:top w:val="none" w:color="FFFFFF" w:sz="0"/>
               <w:left w:val="none" w:color="FFFFFF" w:sz="0"/>
@@ -6917,7 +7080,7 @@
         </w:tc>
         <w:tc>
           <w:tcPr>
-            <w:tcW w:type="dxa" w:w="5476"/>
+            <w:tcW w:type="dxa" w:w="3772"/>
             <w:tcBorders>
               <w:top w:val="none" w:color="FFFFFF" w:sz="0"/>
               <w:left w:val="none" w:color="FFFFFF" w:sz="0"/>
@@ -6954,7 +7117,29 @@
         </w:trPr>
         <w:tc>
           <w:tcPr>
-            <w:tcW w:type="dxa" w:w="3550"/>
+            <w:tcW w:type="dxa" w:w="2471"/>
+            <w:tcBorders>
+              <w:top w:val="none" w:color="FFFFFF" w:sz="0"/>
+              <w:left w:val="none" w:color="FFFFFF" w:sz="0"/>
+              <w:bottom w:val="none" w:color="FFFFFF" w:sz="0"/>
+              <w:right w:val="none" w:color="FFFFFF" w:sz="0"/>
+            </w:tcBorders>
+            <w:tcMar>
+              <w:top w:type="dxa" w:w="40"/>
+              <w:left w:type="dxa" w:w="80"/>
+              <w:bottom w:type="dxa" w:w="40"/>
+              <w:right w:type="dxa" w:w="80"/>
+            </w:tcMar>
+          </w:tcPr>
+          <w:p>
+            <w:pPr>
+              <w:spacing w:line="276" w:lineRule="auto"/>
+            </w:pPr>
+          </w:p>
+        </w:tc>
+        <w:tc>
+          <w:tcPr>
+            <w:tcW w:type="dxa" w:w="2783"/>
             <w:tcBorders>
               <w:top w:val="none" w:color="FFFFFF" w:sz="0"/>
               <w:left w:val="none" w:color="FFFFFF" w:sz="0"/>
@@ -6986,7 +7171,7 @@
         </w:tc>
         <w:tc>
           <w:tcPr>
-            <w:tcW w:type="dxa" w:w="5476"/>
+            <w:tcW w:type="dxa" w:w="3772"/>
             <w:tcBorders>
               <w:top w:val="none" w:color="FFFFFF" w:sz="0"/>
               <w:left w:val="none" w:color="FFFFFF" w:sz="0"/>
@@ -7023,7 +7208,29 @@
         </w:trPr>
         <w:tc>
           <w:tcPr>
-            <w:tcW w:type="dxa" w:w="3550"/>
+            <w:tcW w:type="dxa" w:w="2471"/>
+            <w:tcBorders>
+              <w:top w:val="none" w:color="FFFFFF" w:sz="0"/>
+              <w:left w:val="none" w:color="FFFFFF" w:sz="0"/>
+              <w:bottom w:val="none" w:color="FFFFFF" w:sz="0"/>
+              <w:right w:val="none" w:color="FFFFFF" w:sz="0"/>
+            </w:tcBorders>
+            <w:tcMar>
+              <w:top w:type="dxa" w:w="40"/>
+              <w:left w:type="dxa" w:w="80"/>
+              <w:bottom w:type="dxa" w:w="40"/>
+              <w:right w:type="dxa" w:w="80"/>
+            </w:tcMar>
+          </w:tcPr>
+          <w:p>
+            <w:pPr>
+              <w:spacing w:line="276" w:lineRule="auto"/>
+            </w:pPr>
+          </w:p>
+        </w:tc>
+        <w:tc>
+          <w:tcPr>
+            <w:tcW w:type="dxa" w:w="2783"/>
             <w:tcBorders>
               <w:top w:val="none" w:color="FFFFFF" w:sz="0"/>
               <w:left w:val="none" w:color="FFFFFF" w:sz="0"/>
@@ -7055,7 +7262,7 @@
         </w:tc>
         <w:tc>
           <w:tcPr>
-            <w:tcW w:type="dxa" w:w="5476"/>
+            <w:tcW w:type="dxa" w:w="3772"/>
             <w:tcBorders>
               <w:top w:val="none" w:color="FFFFFF" w:sz="0"/>
               <w:left w:val="none" w:color="FFFFFF" w:sz="0"/>
@@ -7092,7 +7299,29 @@
         </w:trPr>
         <w:tc>
           <w:tcPr>
-            <w:tcW w:type="dxa" w:w="3550"/>
+            <w:tcW w:type="dxa" w:w="2471"/>
+            <w:tcBorders>
+              <w:top w:val="none" w:color="FFFFFF" w:sz="0"/>
+              <w:left w:val="none" w:color="FFFFFF" w:sz="0"/>
+              <w:bottom w:val="none" w:color="FFFFFF" w:sz="0"/>
+              <w:right w:val="none" w:color="FFFFFF" w:sz="0"/>
+            </w:tcBorders>
+            <w:tcMar>
+              <w:top w:type="dxa" w:w="40"/>
+              <w:left w:type="dxa" w:w="80"/>
+              <w:bottom w:type="dxa" w:w="40"/>
+              <w:right w:type="dxa" w:w="80"/>
+            </w:tcMar>
+          </w:tcPr>
+          <w:p>
+            <w:pPr>
+              <w:spacing w:line="276" w:lineRule="auto"/>
+            </w:pPr>
+          </w:p>
+        </w:tc>
+        <w:tc>
+          <w:tcPr>
+            <w:tcW w:type="dxa" w:w="2783"/>
             <w:tcBorders>
               <w:top w:val="none" w:color="FFFFFF" w:sz="0"/>
               <w:left w:val="none" w:color="FFFFFF" w:sz="0"/>
@@ -7118,13 +7347,13 @@
                 <w:sz w:val="20"/>
                 <w:szCs w:val="20"/>
               </w:rPr>
-              <w:t xml:space="preserve">Conflict handling</w:t>
-            </w:r>
-          </w:p>
-        </w:tc>
-        <w:tc>
-          <w:tcPr>
-            <w:tcW w:type="dxa" w:w="5476"/>
+              <w:t xml:space="preserve">Classification (SUIT)</w:t>
+            </w:r>
+          </w:p>
+        </w:tc>
+        <w:tc>
+          <w:tcPr>
+            <w:tcW w:type="dxa" w:w="3772"/>
             <w:tcBorders>
               <w:top w:val="none" w:color="FFFFFF" w:sz="0"/>
               <w:left w:val="none" w:color="FFFFFF" w:sz="0"/>
@@ -7150,7 +7379,7 @@
                 <w:sz w:val="20"/>
                 <w:szCs w:val="20"/>
               </w:rPr>
-              <w:t xml:space="preserve">Conflict acknowledgement (double-coded); conflicts listed (SUIT)</w:t>
+              <w:t xml:space="preserve">Assessed vs actual class; weighted kappa</w:t>
             </w:r>
           </w:p>
         </w:tc>
@@ -7161,7 +7390,29 @@
         </w:trPr>
         <w:tc>
           <w:tcPr>
-            <w:tcW w:type="dxa" w:w="3550"/>
+            <w:tcW w:type="dxa" w:w="2471"/>
+            <w:tcBorders>
+              <w:top w:val="none" w:color="FFFFFF" w:sz="0"/>
+              <w:left w:val="none" w:color="FFFFFF" w:sz="0"/>
+              <w:bottom w:val="none" w:color="FFFFFF" w:sz="0"/>
+              <w:right w:val="none" w:color="FFFFFF" w:sz="0"/>
+            </w:tcBorders>
+            <w:tcMar>
+              <w:top w:type="dxa" w:w="40"/>
+              <w:left w:type="dxa" w:w="80"/>
+              <w:bottom w:type="dxa" w:w="40"/>
+              <w:right w:type="dxa" w:w="80"/>
+            </w:tcMar>
+          </w:tcPr>
+          <w:p>
+            <w:pPr>
+              <w:spacing w:line="276" w:lineRule="auto"/>
+            </w:pPr>
+          </w:p>
+        </w:tc>
+        <w:tc>
+          <w:tcPr>
+            <w:tcW w:type="dxa" w:w="2783"/>
             <w:tcBorders>
               <w:top w:val="none" w:color="FFFFFF" w:sz="0"/>
               <w:left w:val="none" w:color="FFFFFF" w:sz="0"/>
@@ -7187,13 +7438,13 @@
                 <w:sz w:val="20"/>
                 <w:szCs w:val="20"/>
               </w:rPr>
-              <w:t xml:space="preserve">Classification (SUIT)</w:t>
-            </w:r>
-          </w:p>
-        </w:tc>
-        <w:tc>
-          <w:tcPr>
-            <w:tcW w:type="dxa" w:w="5476"/>
+              <w:t xml:space="preserve">Conflict handling</w:t>
+            </w:r>
+          </w:p>
+        </w:tc>
+        <w:tc>
+          <w:tcPr>
+            <w:tcW w:type="dxa" w:w="3772"/>
             <w:tcBorders>
               <w:top w:val="none" w:color="FFFFFF" w:sz="0"/>
               <w:left w:val="none" w:color="FFFFFF" w:sz="0"/>
@@ -7219,7 +7470,7 @@
                 <w:sz w:val="20"/>
                 <w:szCs w:val="20"/>
               </w:rPr>
-              <w:t xml:space="preserve">Assessed vs actual class; weighted kappa</w:t>
+              <w:t xml:space="preserve">Conflict acknowledgement (double-coded); conflicts listed (SUIT)</w:t>
             </w:r>
           </w:p>
         </w:tc>
@@ -7230,7 +7481,7 @@
         </w:trPr>
         <w:tc>
           <w:tcPr>
-            <w:tcW w:type="dxa" w:w="3550"/>
+            <w:tcW w:type="dxa" w:w="2471"/>
             <w:tcBorders>
               <w:top w:val="none" w:color="FFFFFF" w:sz="0"/>
               <w:left w:val="none" w:color="FFFFFF" w:sz="0"/>
@@ -7256,13 +7507,13 @@
                 <w:sz w:val="20"/>
                 <w:szCs w:val="20"/>
               </w:rPr>
-              <w:t xml:space="preserve">Reliability</w:t>
-            </w:r>
-          </w:p>
-        </w:tc>
-        <w:tc>
-          <w:tcPr>
-            <w:tcW w:type="dxa" w:w="5476"/>
+              <w:t xml:space="preserve">Performance (added later)</w:t>
+            </w:r>
+          </w:p>
+        </w:tc>
+        <w:tc>
+          <w:tcPr>
+            <w:tcW w:type="dxa" w:w="2783"/>
             <w:tcBorders>
               <w:top w:val="none" w:color="FFFFFF" w:sz="0"/>
               <w:left w:val="none" w:color="FFFFFF" w:sz="0"/>
@@ -7288,7 +7539,39 @@
                 <w:sz w:val="20"/>
                 <w:szCs w:val="20"/>
               </w:rPr>
-              <w:t xml:space="preserve">ICC(1,1) of equity over three replicates; Jaccard similarity of fund sets</w:t>
+              <w:t xml:space="preserve">Return and risk</w:t>
+            </w:r>
+          </w:p>
+        </w:tc>
+        <w:tc>
+          <w:tcPr>
+            <w:tcW w:type="dxa" w:w="3772"/>
+            <w:tcBorders>
+              <w:top w:val="none" w:color="FFFFFF" w:sz="0"/>
+              <w:left w:val="none" w:color="FFFFFF" w:sz="0"/>
+              <w:bottom w:val="none" w:color="FFFFFF" w:sz="0"/>
+              <w:right w:val="none" w:color="FFFFFF" w:sz="0"/>
+            </w:tcBorders>
+            <w:tcMar>
+              <w:top w:type="dxa" w:w="40"/>
+              <w:left w:type="dxa" w:w="80"/>
+              <w:bottom w:type="dxa" w:w="40"/>
+              <w:right w:type="dxa" w:w="80"/>
+            </w:tcMar>
+          </w:tcPr>
+          <w:p>
+            <w:pPr>
+              <w:spacing w:line="276" w:lineRule="auto"/>
+            </w:pPr>
+            <w:r>
+              <w:rPr>
+                <w:rFonts w:ascii="Times New Roman" w:cs="Times New Roman" w:eastAsia="SimSun" w:hAnsi="Times New Roman"/>
+                <w:b w:val="false"/>
+                <w:bCs w:val="false"/>
+                <w:sz w:val="20"/>
+                <w:szCs w:val="20"/>
+              </w:rPr>
+              <w:t xml:space="preserve">Return, volatility, Sharpe, drawdown, Calmar; three benchmarks; fees</w:t>
             </w:r>
           </w:p>
         </w:tc>
@@ -7299,7 +7582,7 @@
         </w:trPr>
         <w:tc>
           <w:tcPr>
-            <w:tcW w:type="dxa" w:w="3550"/>
+            <w:tcW w:type="dxa" w:w="2471"/>
             <w:tcBorders>
               <w:top w:val="none" w:color="FFFFFF" w:sz="0"/>
               <w:left w:val="none" w:color="FFFFFF" w:sz="0"/>
@@ -7325,13 +7608,13 @@
                 <w:sz w:val="20"/>
                 <w:szCs w:val="20"/>
               </w:rPr>
-              <w:t xml:space="preserve">Probe slope</w:t>
-            </w:r>
-          </w:p>
-        </w:tc>
-        <w:tc>
-          <w:tcPr>
-            <w:tcW w:type="dxa" w:w="5476"/>
+              <w:t xml:space="preserve">Additional (RQ4)</w:t>
+            </w:r>
+          </w:p>
+        </w:tc>
+        <w:tc>
+          <w:tcPr>
+            <w:tcW w:type="dxa" w:w="2783"/>
             <w:tcBorders>
               <w:top w:val="none" w:color="FFFFFF" w:sz="0"/>
               <w:left w:val="none" w:color="FFFFFF" w:sz="0"/>
@@ -7357,7 +7640,39 @@
                 <w:sz w:val="20"/>
                 <w:szCs w:val="20"/>
               </w:rPr>
-              <w:t xml:space="preserve">Change in equity per one-level step of one attribute</w:t>
+              <w:t xml:space="preserve">Reliability</w:t>
+            </w:r>
+          </w:p>
+        </w:tc>
+        <w:tc>
+          <w:tcPr>
+            <w:tcW w:type="dxa" w:w="3772"/>
+            <w:tcBorders>
+              <w:top w:val="none" w:color="FFFFFF" w:sz="0"/>
+              <w:left w:val="none" w:color="FFFFFF" w:sz="0"/>
+              <w:bottom w:val="none" w:color="FFFFFF" w:sz="0"/>
+              <w:right w:val="none" w:color="FFFFFF" w:sz="0"/>
+            </w:tcBorders>
+            <w:tcMar>
+              <w:top w:type="dxa" w:w="40"/>
+              <w:left w:type="dxa" w:w="80"/>
+              <w:bottom w:type="dxa" w:w="40"/>
+              <w:right w:type="dxa" w:w="80"/>
+            </w:tcMar>
+          </w:tcPr>
+          <w:p>
+            <w:pPr>
+              <w:spacing w:line="276" w:lineRule="auto"/>
+            </w:pPr>
+            <w:r>
+              <w:rPr>
+                <w:rFonts w:ascii="Times New Roman" w:cs="Times New Roman" w:eastAsia="SimSun" w:hAnsi="Times New Roman"/>
+                <w:b w:val="false"/>
+                <w:bCs w:val="false"/>
+                <w:sz w:val="20"/>
+                <w:szCs w:val="20"/>
+              </w:rPr>
+              <w:t xml:space="preserve">ICC(1,1) of equity over three replicates; Jaccard similarity of fund sets</w:t>
             </w:r>
           </w:p>
         </w:tc>
@@ -7368,11 +7683,33 @@
         </w:trPr>
         <w:tc>
           <w:tcPr>
-            <w:tcW w:type="dxa" w:w="3550"/>
-            <w:tcBorders>
-              <w:top w:val="none" w:color="FFFFFF" w:sz="0"/>
-              <w:left w:val="none" w:color="FFFFFF" w:sz="0"/>
-              <w:bottom w:val="single" w:color="000000" w:sz="6"/>
+            <w:tcW w:type="dxa" w:w="2471"/>
+            <w:tcBorders>
+              <w:top w:val="none" w:color="FFFFFF" w:sz="0"/>
+              <w:left w:val="none" w:color="FFFFFF" w:sz="0"/>
+              <w:bottom w:val="none" w:color="FFFFFF" w:sz="0"/>
+              <w:right w:val="none" w:color="FFFFFF" w:sz="0"/>
+            </w:tcBorders>
+            <w:tcMar>
+              <w:top w:type="dxa" w:w="40"/>
+              <w:left w:type="dxa" w:w="80"/>
+              <w:bottom w:type="dxa" w:w="40"/>
+              <w:right w:type="dxa" w:w="80"/>
+            </w:tcMar>
+          </w:tcPr>
+          <w:p>
+            <w:pPr>
+              <w:spacing w:line="276" w:lineRule="auto"/>
+            </w:pPr>
+          </w:p>
+        </w:tc>
+        <w:tc>
+          <w:tcPr>
+            <w:tcW w:type="dxa" w:w="2783"/>
+            <w:tcBorders>
+              <w:top w:val="none" w:color="FFFFFF" w:sz="0"/>
+              <w:left w:val="none" w:color="FFFFFF" w:sz="0"/>
+              <w:bottom w:val="none" w:color="FFFFFF" w:sz="0"/>
               <w:right w:val="none" w:color="FFFFFF" w:sz="0"/>
             </w:tcBorders>
             <w:tcMar>
@@ -7394,17 +7731,17 @@
                 <w:sz w:val="20"/>
                 <w:szCs w:val="20"/>
               </w:rPr>
-              <w:t xml:space="preserve">Performance (added later)</w:t>
-            </w:r>
-          </w:p>
-        </w:tc>
-        <w:tc>
-          <w:tcPr>
-            <w:tcW w:type="dxa" w:w="5476"/>
-            <w:tcBorders>
-              <w:top w:val="none" w:color="FFFFFF" w:sz="0"/>
-              <w:left w:val="none" w:color="FFFFFF" w:sz="0"/>
-              <w:bottom w:val="single" w:color="000000" w:sz="6"/>
+              <w:t xml:space="preserve">Probe slope</w:t>
+            </w:r>
+          </w:p>
+        </w:tc>
+        <w:tc>
+          <w:tcPr>
+            <w:tcW w:type="dxa" w:w="3772"/>
+            <w:tcBorders>
+              <w:top w:val="none" w:color="FFFFFF" w:sz="0"/>
+              <w:left w:val="none" w:color="FFFFFF" w:sz="0"/>
+              <w:bottom w:val="none" w:color="FFFFFF" w:sz="0"/>
               <w:right w:val="none" w:color="FFFFFF" w:sz="0"/>
             </w:tcBorders>
             <w:tcMar>
@@ -7426,7 +7763,108 @@
                 <w:sz w:val="20"/>
                 <w:szCs w:val="20"/>
               </w:rPr>
-              <w:t xml:space="preserve">Return, volatility, Sharpe, drawdown, Calmar; benchmarks; fees</w:t>
+              <w:t xml:space="preserve">Change in equity per one-level step of one attribute</w:t>
+            </w:r>
+          </w:p>
+        </w:tc>
+      </w:tr>
+      <w:tr>
+        <w:trPr>
+          <w:tblHeader w:val="false"/>
+        </w:trPr>
+        <w:tc>
+          <w:tcPr>
+            <w:tcW w:type="dxa" w:w="2471"/>
+            <w:tcBorders>
+              <w:top w:val="none" w:color="FFFFFF" w:sz="0"/>
+              <w:left w:val="none" w:color="FFFFFF" w:sz="0"/>
+              <w:bottom w:val="single" w:color="000000" w:sz="6"/>
+              <w:right w:val="none" w:color="FFFFFF" w:sz="0"/>
+            </w:tcBorders>
+            <w:tcMar>
+              <w:top w:type="dxa" w:w="40"/>
+              <w:left w:type="dxa" w:w="80"/>
+              <w:bottom w:type="dxa" w:w="40"/>
+              <w:right w:type="dxa" w:w="80"/>
+            </w:tcMar>
+          </w:tcPr>
+          <w:p>
+            <w:pPr>
+              <w:spacing w:line="276" w:lineRule="auto"/>
+            </w:pPr>
+            <w:r>
+              <w:rPr>
+                <w:rFonts w:ascii="Times New Roman" w:cs="Times New Roman" w:eastAsia="SimSun" w:hAnsi="Times New Roman"/>
+                <w:b w:val="false"/>
+                <w:bCs w:val="false"/>
+                <w:sz w:val="20"/>
+                <w:szCs w:val="20"/>
+              </w:rPr>
+              <w:t xml:space="preserve">Fairness</w:t>
+            </w:r>
+          </w:p>
+        </w:tc>
+        <w:tc>
+          <w:tcPr>
+            <w:tcW w:type="dxa" w:w="2783"/>
+            <w:tcBorders>
+              <w:top w:val="none" w:color="FFFFFF" w:sz="0"/>
+              <w:left w:val="none" w:color="FFFFFF" w:sz="0"/>
+              <w:bottom w:val="single" w:color="000000" w:sz="6"/>
+              <w:right w:val="none" w:color="FFFFFF" w:sz="0"/>
+            </w:tcBorders>
+            <w:tcMar>
+              <w:top w:type="dxa" w:w="40"/>
+              <w:left w:type="dxa" w:w="80"/>
+              <w:bottom w:type="dxa" w:w="40"/>
+              <w:right w:type="dxa" w:w="80"/>
+            </w:tcMar>
+          </w:tcPr>
+          <w:p>
+            <w:pPr>
+              <w:spacing w:line="276" w:lineRule="auto"/>
+            </w:pPr>
+            <w:r>
+              <w:rPr>
+                <w:rFonts w:ascii="Times New Roman" w:cs="Times New Roman" w:eastAsia="SimSun" w:hAnsi="Times New Roman"/>
+                <w:b w:val="false"/>
+                <w:bCs w:val="false"/>
+                <w:sz w:val="20"/>
+                <w:szCs w:val="20"/>
+              </w:rPr>
+              <w:t xml:space="preserve">Not tested</w:t>
+            </w:r>
+          </w:p>
+        </w:tc>
+        <w:tc>
+          <w:tcPr>
+            <w:tcW w:type="dxa" w:w="3772"/>
+            <w:tcBorders>
+              <w:top w:val="none" w:color="FFFFFF" w:sz="0"/>
+              <w:left w:val="none" w:color="FFFFFF" w:sz="0"/>
+              <w:bottom w:val="single" w:color="000000" w:sz="6"/>
+              <w:right w:val="none" w:color="FFFFFF" w:sz="0"/>
+            </w:tcBorders>
+            <w:tcMar>
+              <w:top w:type="dxa" w:w="40"/>
+              <w:left w:type="dxa" w:w="80"/>
+              <w:bottom w:type="dxa" w:w="40"/>
+              <w:right w:type="dxa" w:w="80"/>
+            </w:tcMar>
+          </w:tcPr>
+          <w:p>
+            <w:pPr>
+              <w:spacing w:line="276" w:lineRule="auto"/>
+            </w:pPr>
+            <w:r>
+              <w:rPr>
+                <w:rFonts w:ascii="Times New Roman" w:cs="Times New Roman" w:eastAsia="SimSun" w:hAnsi="Times New Roman"/>
+                <w:b w:val="false"/>
+                <w:bCs w:val="false"/>
+                <w:sz w:val="20"/>
+                <w:szCs w:val="20"/>
+              </w:rPr>
+              <w:t xml:space="preserve">No profiles differ only in a demographic signal</w:t>
             </w:r>
           </w:p>
         </w:tc>
@@ -7453,7 +7891,7 @@
           <w:sz w:val="20"/>
           <w:szCs w:val="20"/>
         </w:rPr>
-        <w:t xml:space="preserve">Equity caps are 0, 20, 50, 80 and 100% for C1-C5 and 10, 30, 50, 80 and 100% for H1-H5; they are the researchers' operationalisation, not regulatory limits. QDII share is also recorded.</w:t>
+        <w:t xml:space="preserve">Equity caps are 0, 20, 50, 80 and 100% for C1-C5 and 10, 30, 50, 80 and 100% for H1-H5; they are the researchers' operationalisation, not regulatory limits. RQ5 compares the models on all suitability and reliability measures.</w:t>
       </w:r>
     </w:p>
     <w:p>

</xml_diff>

<commit_message>
Drop fairness from slides 1 and 11 and from Table 6; keep the one-line scope note in Section 2
Co-Authored-By: Claude Opus 5.5 <noreply@anthropic.com>
Claude-Session: https://claude.ai/code/session_01PCmAkTtoQHaefAhZET8xvj
</commit_message>
<xml_diff>
--- a/report/final_report.docx
+++ b/report/final_report.docx
@@ -7687,7 +7687,7 @@
             <w:tcBorders>
               <w:top w:val="none" w:color="FFFFFF" w:sz="0"/>
               <w:left w:val="none" w:color="FFFFFF" w:sz="0"/>
-              <w:bottom w:val="none" w:color="FFFFFF" w:sz="0"/>
+              <w:bottom w:val="single" w:color="000000" w:sz="6"/>
               <w:right w:val="none" w:color="FFFFFF" w:sz="0"/>
             </w:tcBorders>
             <w:tcMar>
@@ -7709,7 +7709,7 @@
             <w:tcBorders>
               <w:top w:val="none" w:color="FFFFFF" w:sz="0"/>
               <w:left w:val="none" w:color="FFFFFF" w:sz="0"/>
-              <w:bottom w:val="none" w:color="FFFFFF" w:sz="0"/>
+              <w:bottom w:val="single" w:color="000000" w:sz="6"/>
               <w:right w:val="none" w:color="FFFFFF" w:sz="0"/>
             </w:tcBorders>
             <w:tcMar>
@@ -7741,7 +7741,7 @@
             <w:tcBorders>
               <w:top w:val="none" w:color="FFFFFF" w:sz="0"/>
               <w:left w:val="none" w:color="FFFFFF" w:sz="0"/>
-              <w:bottom w:val="none" w:color="FFFFFF" w:sz="0"/>
+              <w:bottom w:val="single" w:color="000000" w:sz="6"/>
               <w:right w:val="none" w:color="FFFFFF" w:sz="0"/>
             </w:tcBorders>
             <w:tcMar>
@@ -7764,107 +7764,6 @@
                 <w:szCs w:val="20"/>
               </w:rPr>
               <w:t xml:space="preserve">Change in equity per one-level step of one attribute</w:t>
-            </w:r>
-          </w:p>
-        </w:tc>
-      </w:tr>
-      <w:tr>
-        <w:trPr>
-          <w:tblHeader w:val="false"/>
-        </w:trPr>
-        <w:tc>
-          <w:tcPr>
-            <w:tcW w:type="dxa" w:w="2471"/>
-            <w:tcBorders>
-              <w:top w:val="none" w:color="FFFFFF" w:sz="0"/>
-              <w:left w:val="none" w:color="FFFFFF" w:sz="0"/>
-              <w:bottom w:val="single" w:color="000000" w:sz="6"/>
-              <w:right w:val="none" w:color="FFFFFF" w:sz="0"/>
-            </w:tcBorders>
-            <w:tcMar>
-              <w:top w:type="dxa" w:w="40"/>
-              <w:left w:type="dxa" w:w="80"/>
-              <w:bottom w:type="dxa" w:w="40"/>
-              <w:right w:type="dxa" w:w="80"/>
-            </w:tcMar>
-          </w:tcPr>
-          <w:p>
-            <w:pPr>
-              <w:spacing w:line="276" w:lineRule="auto"/>
-            </w:pPr>
-            <w:r>
-              <w:rPr>
-                <w:rFonts w:ascii="Times New Roman" w:cs="Times New Roman" w:eastAsia="SimSun" w:hAnsi="Times New Roman"/>
-                <w:b w:val="false"/>
-                <w:bCs w:val="false"/>
-                <w:sz w:val="20"/>
-                <w:szCs w:val="20"/>
-              </w:rPr>
-              <w:t xml:space="preserve">Fairness</w:t>
-            </w:r>
-          </w:p>
-        </w:tc>
-        <w:tc>
-          <w:tcPr>
-            <w:tcW w:type="dxa" w:w="2783"/>
-            <w:tcBorders>
-              <w:top w:val="none" w:color="FFFFFF" w:sz="0"/>
-              <w:left w:val="none" w:color="FFFFFF" w:sz="0"/>
-              <w:bottom w:val="single" w:color="000000" w:sz="6"/>
-              <w:right w:val="none" w:color="FFFFFF" w:sz="0"/>
-            </w:tcBorders>
-            <w:tcMar>
-              <w:top w:type="dxa" w:w="40"/>
-              <w:left w:type="dxa" w:w="80"/>
-              <w:bottom w:type="dxa" w:w="40"/>
-              <w:right w:type="dxa" w:w="80"/>
-            </w:tcMar>
-          </w:tcPr>
-          <w:p>
-            <w:pPr>
-              <w:spacing w:line="276" w:lineRule="auto"/>
-            </w:pPr>
-            <w:r>
-              <w:rPr>
-                <w:rFonts w:ascii="Times New Roman" w:cs="Times New Roman" w:eastAsia="SimSun" w:hAnsi="Times New Roman"/>
-                <w:b w:val="false"/>
-                <w:bCs w:val="false"/>
-                <w:sz w:val="20"/>
-                <w:szCs w:val="20"/>
-              </w:rPr>
-              <w:t xml:space="preserve">Not tested</w:t>
-            </w:r>
-          </w:p>
-        </w:tc>
-        <w:tc>
-          <w:tcPr>
-            <w:tcW w:type="dxa" w:w="3772"/>
-            <w:tcBorders>
-              <w:top w:val="none" w:color="FFFFFF" w:sz="0"/>
-              <w:left w:val="none" w:color="FFFFFF" w:sz="0"/>
-              <w:bottom w:val="single" w:color="000000" w:sz="6"/>
-              <w:right w:val="none" w:color="FFFFFF" w:sz="0"/>
-            </w:tcBorders>
-            <w:tcMar>
-              <w:top w:type="dxa" w:w="40"/>
-              <w:left w:type="dxa" w:w="80"/>
-              <w:bottom w:type="dxa" w:w="40"/>
-              <w:right w:type="dxa" w:w="80"/>
-            </w:tcMar>
-          </w:tcPr>
-          <w:p>
-            <w:pPr>
-              <w:spacing w:line="276" w:lineRule="auto"/>
-            </w:pPr>
-            <w:r>
-              <w:rPr>
-                <w:rFonts w:ascii="Times New Roman" w:cs="Times New Roman" w:eastAsia="SimSun" w:hAnsi="Times New Roman"/>
-                <w:b w:val="false"/>
-                <w:bCs w:val="false"/>
-                <w:sz w:val="20"/>
-                <w:szCs w:val="20"/>
-              </w:rPr>
-              <w:t xml:space="preserve">No profiles differ only in a demographic signal</w:t>
             </w:r>
           </w:p>
         </w:tc>

</xml_diff>